<commit_message>
Add DIGEMID Jun 2026, OSEL youth study, EDO 2025 and CQFD data
Uses the new sources to replace estimates: DIGEMID Ed. 11 breakdown by
establishment type (1,580 in Lambayeque), CQFD Lambayeque 812 registered
pharmacists (brecha table), ENAHO 2024 youth study/work condition as the
target population, INEI 15-29 projection, EDO 2025 demand, MTPE Mi
Carrera ranking (Farmacia #6), and UNPRG graduates list confirming it
does not offer the program. Organizes fuentes/ (descriptive names,
drops two byte-identical duplicates, keeps the user's screenshots).

Co-Authored-By: Claude Opus 5.5 <noreply@anthropic.com>
Claude-Session: https://claude.ai/code/session_01XsGhnoXHk7nghX2nJBVJwd
</commit_message>
<xml_diff>
--- a/borradores/Informe_Pertinencia_Farmacia_Bioquimica_Lambayeque.docx
+++ b/borradores/Informe_Pertinencia_Farmacia_Bioquimica_Lambayeque.docx
@@ -2757,7 +2757,7 @@
           <w:sz w:val="24"/>
           <w:szCs w:val="24"/>
         </w:rPr>
-        <w:t xml:space="preserve">Que tenga entre 16 y 25 años de edad.</w:t>
+        <w:t xml:space="preserve">Que tenga entre 15 y 29 años de edad (definición de juventud de la Ley N.° 27802).</w:t>
       </w:r>
     </w:p>
     <w:p>
@@ -2776,7 +2776,7 @@
           <w:sz w:val="24"/>
           <w:szCs w:val="24"/>
         </w:rPr>
-        <w:t xml:space="preserve">Que se encuentre cursando el 5.° de secundaria, o tenga secundaria completa, pero que no se encuentre cursando estudios superiores.</w:t>
+        <w:t xml:space="preserve">Que no se encuentre cursando estudios superiores (jóvenes que solo trabajan o que no estudian ni trabajan).</w:t>
       </w:r>
     </w:p>
     <w:p>
@@ -3555,7 +3555,7 @@
           <w:sz w:val="22"/>
           <w:szCs w:val="22"/>
         </w:rPr>
-        <w:t xml:space="preserve">Tabla 2. Población de 15 a 24 años en los niveles socioeconómicos C y D de Lambayeque, 2024</w:t>
+        <w:t xml:space="preserve">Tabla 2. Jóvenes de 15 a 29 años de Lambayeque según condición de estudio y trabajo, 2024</w:t>
       </w:r>
     </w:p>
     <w:tbl>
@@ -3572,9 +3572,9 @@
         </w:tblBorders>
       </w:tblPr>
       <w:tblGrid>
-        <w:gridCol w:w="3600"/>
-        <w:gridCol w:w="1300"/>
-        <w:gridCol w:w="3300"/>
+        <w:gridCol w:w="4600"/>
+        <w:gridCol w:w="1200"/>
+        <w:gridCol w:w="2400"/>
       </w:tblGrid>
       <w:tr>
         <w:trPr>
@@ -3582,7 +3582,7 @@
         </w:trPr>
         <w:tc>
           <w:tcPr>
-            <w:tcW w:type="dxa" w:w="3600"/>
+            <w:tcW w:type="dxa" w:w="4600"/>
             <w:tcBorders>
               <w:top w:val="single" w:color="000000" w:sz="4"/>
               <w:left w:val="single" w:color="000000" w:sz="4"/>
@@ -3611,13 +3611,13 @@
                 <w:sz w:val="15"/>
                 <w:szCs w:val="15"/>
               </w:rPr>
-              <w:t xml:space="preserve">Concepto</w:t>
-            </w:r>
-          </w:p>
-        </w:tc>
-        <w:tc>
-          <w:tcPr>
-            <w:tcW w:type="dxa" w:w="1300"/>
+              <w:t xml:space="preserve">Condición</w:t>
+            </w:r>
+          </w:p>
+        </w:tc>
+        <w:tc>
+          <w:tcPr>
+            <w:tcW w:type="dxa" w:w="1200"/>
             <w:tcBorders>
               <w:top w:val="single" w:color="000000" w:sz="4"/>
               <w:left w:val="single" w:color="000000" w:sz="4"/>
@@ -3646,13 +3646,13 @@
                 <w:sz w:val="15"/>
                 <w:szCs w:val="15"/>
               </w:rPr>
-              <w:t xml:space="preserve">Valor</w:t>
-            </w:r>
-          </w:p>
-        </w:tc>
-        <w:tc>
-          <w:tcPr>
-            <w:tcW w:type="dxa" w:w="3300"/>
+              <w:t xml:space="preserve">%</w:t>
+            </w:r>
+          </w:p>
+        </w:tc>
+        <w:tc>
+          <w:tcPr>
+            <w:tcW w:type="dxa" w:w="2400"/>
             <w:tcBorders>
               <w:top w:val="single" w:color="000000" w:sz="4"/>
               <w:left w:val="single" w:color="000000" w:sz="4"/>
@@ -3681,7 +3681,7 @@
                 <w:sz w:val="15"/>
                 <w:szCs w:val="15"/>
               </w:rPr>
-              <w:t xml:space="preserve">Sustento</w:t>
+              <w:t xml:space="preserve">Jóvenes</w:t>
             </w:r>
           </w:p>
         </w:tc>
@@ -3692,7 +3692,7 @@
         </w:trPr>
         <w:tc>
           <w:tcPr>
-            <w:tcW w:type="dxa" w:w="3600"/>
+            <w:tcW w:type="dxa" w:w="4600"/>
             <w:tcBorders>
               <w:top w:val="single" w:color="000000" w:sz="4"/>
               <w:left w:val="single" w:color="000000" w:sz="4"/>
@@ -3720,75 +3720,75 @@
                 <w:sz w:val="15"/>
                 <w:szCs w:val="15"/>
               </w:rPr>
-              <w:t xml:space="preserve">Población total de Lambayeque</w:t>
-            </w:r>
-          </w:p>
-        </w:tc>
-        <w:tc>
-          <w:tcPr>
-            <w:tcW w:type="dxa" w:w="1300"/>
-            <w:tcBorders>
-              <w:top w:val="single" w:color="000000" w:sz="4"/>
-              <w:left w:val="single" w:color="000000" w:sz="4"/>
-              <w:bottom w:val="single" w:color="000000" w:sz="4"/>
-              <w:right w:val="single" w:color="000000" w:sz="4"/>
-            </w:tcBorders>
-            <w:tcMar>
-              <w:top w:type="dxa" w:w="20"/>
-              <w:left w:type="dxa" w:w="60"/>
-              <w:bottom w:type="dxa" w:w="20"/>
-              <w:right w:type="dxa" w:w="60"/>
-            </w:tcMar>
-            <w:vAlign w:val="center"/>
-          </w:tcPr>
-          <w:p>
-            <w:pPr>
-              <w:jc w:val="center"/>
-            </w:pPr>
-            <w:r>
-              <w:rPr>
-                <w:rFonts w:ascii="Arial" w:cs="Arial" w:eastAsia="Arial" w:hAnsi="Arial"/>
-                <w:b/>
-                <w:bCs/>
-                <w:color w:val="000000"/>
-                <w:sz w:val="15"/>
-                <w:szCs w:val="15"/>
-              </w:rPr>
-              <w:t xml:space="preserve">1 356 202</w:t>
-            </w:r>
-          </w:p>
-        </w:tc>
-        <w:tc>
-          <w:tcPr>
-            <w:tcW w:type="dxa" w:w="3300"/>
-            <w:tcBorders>
-              <w:top w:val="single" w:color="000000" w:sz="4"/>
-              <w:left w:val="single" w:color="000000" w:sz="4"/>
-              <w:bottom w:val="single" w:color="000000" w:sz="4"/>
-              <w:right w:val="single" w:color="000000" w:sz="4"/>
-            </w:tcBorders>
-            <w:tcMar>
-              <w:top w:type="dxa" w:w="20"/>
-              <w:left w:type="dxa" w:w="60"/>
-              <w:bottom w:type="dxa" w:w="20"/>
-              <w:right w:type="dxa" w:w="60"/>
-            </w:tcMar>
-            <w:vAlign w:val="center"/>
-          </w:tcPr>
-          <w:p>
-            <w:pPr>
-              <w:jc w:val="center"/>
-            </w:pPr>
-            <w:r>
-              <w:rPr>
-                <w:rFonts w:ascii="Arial" w:cs="Arial" w:eastAsia="Arial" w:hAnsi="Arial"/>
-                <w:b/>
-                <w:bCs/>
-                <w:color w:val="000000"/>
-                <w:sz w:val="15"/>
-                <w:szCs w:val="15"/>
-              </w:rPr>
-              <w:t xml:space="preserve">PRODUCE (2025)</w:t>
+              <w:t xml:space="preserve">Solo trabajan</w:t>
+            </w:r>
+          </w:p>
+        </w:tc>
+        <w:tc>
+          <w:tcPr>
+            <w:tcW w:type="dxa" w:w="1200"/>
+            <w:tcBorders>
+              <w:top w:val="single" w:color="000000" w:sz="4"/>
+              <w:left w:val="single" w:color="000000" w:sz="4"/>
+              <w:bottom w:val="single" w:color="000000" w:sz="4"/>
+              <w:right w:val="single" w:color="000000" w:sz="4"/>
+            </w:tcBorders>
+            <w:tcMar>
+              <w:top w:type="dxa" w:w="20"/>
+              <w:left w:type="dxa" w:w="60"/>
+              <w:bottom w:type="dxa" w:w="20"/>
+              <w:right w:type="dxa" w:w="60"/>
+            </w:tcMar>
+            <w:vAlign w:val="center"/>
+          </w:tcPr>
+          <w:p>
+            <w:pPr>
+              <w:jc w:val="center"/>
+            </w:pPr>
+            <w:r>
+              <w:rPr>
+                <w:rFonts w:ascii="Arial" w:cs="Arial" w:eastAsia="Arial" w:hAnsi="Arial"/>
+                <w:b/>
+                <w:bCs/>
+                <w:color w:val="000000"/>
+                <w:sz w:val="15"/>
+                <w:szCs w:val="15"/>
+              </w:rPr>
+              <w:t xml:space="preserve">42,3</w:t>
+            </w:r>
+          </w:p>
+        </w:tc>
+        <w:tc>
+          <w:tcPr>
+            <w:tcW w:type="dxa" w:w="2400"/>
+            <w:tcBorders>
+              <w:top w:val="single" w:color="000000" w:sz="4"/>
+              <w:left w:val="single" w:color="000000" w:sz="4"/>
+              <w:bottom w:val="single" w:color="000000" w:sz="4"/>
+              <w:right w:val="single" w:color="000000" w:sz="4"/>
+            </w:tcBorders>
+            <w:tcMar>
+              <w:top w:type="dxa" w:w="20"/>
+              <w:left w:type="dxa" w:w="60"/>
+              <w:bottom w:type="dxa" w:w="20"/>
+              <w:right w:type="dxa" w:w="60"/>
+            </w:tcMar>
+            <w:vAlign w:val="center"/>
+          </w:tcPr>
+          <w:p>
+            <w:pPr>
+              <w:jc w:val="center"/>
+            </w:pPr>
+            <w:r>
+              <w:rPr>
+                <w:rFonts w:ascii="Arial" w:cs="Arial" w:eastAsia="Arial" w:hAnsi="Arial"/>
+                <w:b/>
+                <w:bCs/>
+                <w:color w:val="000000"/>
+                <w:sz w:val="15"/>
+                <w:szCs w:val="15"/>
+              </w:rPr>
+              <w:t xml:space="preserve">139 875</w:t>
             </w:r>
           </w:p>
         </w:tc>
@@ -3799,7 +3799,7 @@
         </w:trPr>
         <w:tc>
           <w:tcPr>
-            <w:tcW w:type="dxa" w:w="3600"/>
+            <w:tcW w:type="dxa" w:w="4600"/>
             <w:tcBorders>
               <w:top w:val="single" w:color="000000" w:sz="4"/>
               <w:left w:val="single" w:color="000000" w:sz="4"/>
@@ -3827,75 +3827,75 @@
                 <w:sz w:val="15"/>
                 <w:szCs w:val="15"/>
               </w:rPr>
-              <w:t xml:space="preserve">% de población de 15 a 24 años</w:t>
-            </w:r>
-          </w:p>
-        </w:tc>
-        <w:tc>
-          <w:tcPr>
-            <w:tcW w:type="dxa" w:w="1300"/>
-            <w:tcBorders>
-              <w:top w:val="single" w:color="000000" w:sz="4"/>
-              <w:left w:val="single" w:color="000000" w:sz="4"/>
-              <w:bottom w:val="single" w:color="000000" w:sz="4"/>
-              <w:right w:val="single" w:color="000000" w:sz="4"/>
-            </w:tcBorders>
-            <w:tcMar>
-              <w:top w:type="dxa" w:w="20"/>
-              <w:left w:type="dxa" w:w="60"/>
-              <w:bottom w:type="dxa" w:w="20"/>
-              <w:right w:type="dxa" w:w="60"/>
-            </w:tcMar>
-            <w:vAlign w:val="center"/>
-          </w:tcPr>
-          <w:p>
-            <w:pPr>
-              <w:jc w:val="center"/>
-            </w:pPr>
-            <w:r>
-              <w:rPr>
-                <w:rFonts w:ascii="Arial" w:cs="Arial" w:eastAsia="Arial" w:hAnsi="Arial"/>
-                <w:b/>
-                <w:bCs/>
-                <w:color w:val="000000"/>
-                <w:sz w:val="15"/>
-                <w:szCs w:val="15"/>
-              </w:rPr>
-              <w:t xml:space="preserve">15,3 %</w:t>
-            </w:r>
-          </w:p>
-        </w:tc>
-        <w:tc>
-          <w:tcPr>
-            <w:tcW w:type="dxa" w:w="3300"/>
-            <w:tcBorders>
-              <w:top w:val="single" w:color="000000" w:sz="4"/>
-              <w:left w:val="single" w:color="000000" w:sz="4"/>
-              <w:bottom w:val="single" w:color="000000" w:sz="4"/>
-              <w:right w:val="single" w:color="000000" w:sz="4"/>
-            </w:tcBorders>
-            <w:tcMar>
-              <w:top w:type="dxa" w:w="20"/>
-              <w:left w:type="dxa" w:w="60"/>
-              <w:bottom w:type="dxa" w:w="20"/>
-              <w:right w:type="dxa" w:w="60"/>
-            </w:tcMar>
-            <w:vAlign w:val="center"/>
-          </w:tcPr>
-          <w:p>
-            <w:pPr>
-              <w:jc w:val="center"/>
-            </w:pPr>
-            <w:r>
-              <w:rPr>
-                <w:rFonts w:ascii="Arial" w:cs="Arial" w:eastAsia="Arial" w:hAnsi="Arial"/>
-                <w:b/>
-                <w:bCs/>
-                <w:color w:val="000000"/>
-                <w:sz w:val="15"/>
-                <w:szCs w:val="15"/>
-              </w:rPr>
-              <w:t xml:space="preserve">ENDES 2024: hombres 15,9 %, mujeres 14,7 % (p. 15)</w:t>
+              <w:t xml:space="preserve">Solo estudian</w:t>
+            </w:r>
+          </w:p>
+        </w:tc>
+        <w:tc>
+          <w:tcPr>
+            <w:tcW w:type="dxa" w:w="1200"/>
+            <w:tcBorders>
+              <w:top w:val="single" w:color="000000" w:sz="4"/>
+              <w:left w:val="single" w:color="000000" w:sz="4"/>
+              <w:bottom w:val="single" w:color="000000" w:sz="4"/>
+              <w:right w:val="single" w:color="000000" w:sz="4"/>
+            </w:tcBorders>
+            <w:tcMar>
+              <w:top w:type="dxa" w:w="20"/>
+              <w:left w:type="dxa" w:w="60"/>
+              <w:bottom w:type="dxa" w:w="20"/>
+              <w:right w:type="dxa" w:w="60"/>
+            </w:tcMar>
+            <w:vAlign w:val="center"/>
+          </w:tcPr>
+          <w:p>
+            <w:pPr>
+              <w:jc w:val="center"/>
+            </w:pPr>
+            <w:r>
+              <w:rPr>
+                <w:rFonts w:ascii="Arial" w:cs="Arial" w:eastAsia="Arial" w:hAnsi="Arial"/>
+                <w:b/>
+                <w:bCs/>
+                <w:color w:val="000000"/>
+                <w:sz w:val="15"/>
+                <w:szCs w:val="15"/>
+              </w:rPr>
+              <w:t xml:space="preserve">26,7</w:t>
+            </w:r>
+          </w:p>
+        </w:tc>
+        <w:tc>
+          <w:tcPr>
+            <w:tcW w:type="dxa" w:w="2400"/>
+            <w:tcBorders>
+              <w:top w:val="single" w:color="000000" w:sz="4"/>
+              <w:left w:val="single" w:color="000000" w:sz="4"/>
+              <w:bottom w:val="single" w:color="000000" w:sz="4"/>
+              <w:right w:val="single" w:color="000000" w:sz="4"/>
+            </w:tcBorders>
+            <w:tcMar>
+              <w:top w:type="dxa" w:w="20"/>
+              <w:left w:type="dxa" w:w="60"/>
+              <w:bottom w:type="dxa" w:w="20"/>
+              <w:right w:type="dxa" w:w="60"/>
+            </w:tcMar>
+            <w:vAlign w:val="center"/>
+          </w:tcPr>
+          <w:p>
+            <w:pPr>
+              <w:jc w:val="center"/>
+            </w:pPr>
+            <w:r>
+              <w:rPr>
+                <w:rFonts w:ascii="Arial" w:cs="Arial" w:eastAsia="Arial" w:hAnsi="Arial"/>
+                <w:b/>
+                <w:bCs/>
+                <w:color w:val="000000"/>
+                <w:sz w:val="15"/>
+                <w:szCs w:val="15"/>
+              </w:rPr>
+              <w:t xml:space="preserve">88 290</w:t>
             </w:r>
           </w:p>
         </w:tc>
@@ -3906,7 +3906,7 @@
         </w:trPr>
         <w:tc>
           <w:tcPr>
-            <w:tcW w:type="dxa" w:w="3600"/>
+            <w:tcW w:type="dxa" w:w="4600"/>
             <w:tcBorders>
               <w:top w:val="single" w:color="000000" w:sz="4"/>
               <w:left w:val="single" w:color="000000" w:sz="4"/>
@@ -3934,75 +3934,75 @@
                 <w:sz w:val="15"/>
                 <w:szCs w:val="15"/>
               </w:rPr>
-              <w:t xml:space="preserve">Población de 15 a 24 años</w:t>
-            </w:r>
-          </w:p>
-        </w:tc>
-        <w:tc>
-          <w:tcPr>
-            <w:tcW w:type="dxa" w:w="1300"/>
-            <w:tcBorders>
-              <w:top w:val="single" w:color="000000" w:sz="4"/>
-              <w:left w:val="single" w:color="000000" w:sz="4"/>
-              <w:bottom w:val="single" w:color="000000" w:sz="4"/>
-              <w:right w:val="single" w:color="000000" w:sz="4"/>
-            </w:tcBorders>
-            <w:tcMar>
-              <w:top w:type="dxa" w:w="20"/>
-              <w:left w:type="dxa" w:w="60"/>
-              <w:bottom w:type="dxa" w:w="20"/>
-              <w:right w:type="dxa" w:w="60"/>
-            </w:tcMar>
-            <w:vAlign w:val="center"/>
-          </w:tcPr>
-          <w:p>
-            <w:pPr>
-              <w:jc w:val="center"/>
-            </w:pPr>
-            <w:r>
-              <w:rPr>
-                <w:rFonts w:ascii="Arial" w:cs="Arial" w:eastAsia="Arial" w:hAnsi="Arial"/>
-                <w:b/>
-                <w:bCs/>
-                <w:color w:val="000000"/>
-                <w:sz w:val="15"/>
-                <w:szCs w:val="15"/>
-              </w:rPr>
-              <w:t xml:space="preserve">207 401</w:t>
-            </w:r>
-          </w:p>
-        </w:tc>
-        <w:tc>
-          <w:tcPr>
-            <w:tcW w:type="dxa" w:w="3300"/>
-            <w:tcBorders>
-              <w:top w:val="single" w:color="000000" w:sz="4"/>
-              <w:left w:val="single" w:color="000000" w:sz="4"/>
-              <w:bottom w:val="single" w:color="000000" w:sz="4"/>
-              <w:right w:val="single" w:color="000000" w:sz="4"/>
-            </w:tcBorders>
-            <w:tcMar>
-              <w:top w:type="dxa" w:w="20"/>
-              <w:left w:type="dxa" w:w="60"/>
-              <w:bottom w:type="dxa" w:w="20"/>
-              <w:right w:type="dxa" w:w="60"/>
-            </w:tcMar>
-            <w:vAlign w:val="center"/>
-          </w:tcPr>
-          <w:p>
-            <w:pPr>
-              <w:jc w:val="center"/>
-            </w:pPr>
-            <w:r>
-              <w:rPr>
-                <w:rFonts w:ascii="Arial" w:cs="Arial" w:eastAsia="Arial" w:hAnsi="Arial"/>
-                <w:b/>
-                <w:bCs/>
-                <w:color w:val="000000"/>
-                <w:sz w:val="15"/>
-                <w:szCs w:val="15"/>
-              </w:rPr>
-              <w:t xml:space="preserve">Cálculo propio</w:t>
+              <w:t xml:space="preserve">Estudian y trabajan</w:t>
+            </w:r>
+          </w:p>
+        </w:tc>
+        <w:tc>
+          <w:tcPr>
+            <w:tcW w:type="dxa" w:w="1200"/>
+            <w:tcBorders>
+              <w:top w:val="single" w:color="000000" w:sz="4"/>
+              <w:left w:val="single" w:color="000000" w:sz="4"/>
+              <w:bottom w:val="single" w:color="000000" w:sz="4"/>
+              <w:right w:val="single" w:color="000000" w:sz="4"/>
+            </w:tcBorders>
+            <w:tcMar>
+              <w:top w:type="dxa" w:w="20"/>
+              <w:left w:type="dxa" w:w="60"/>
+              <w:bottom w:type="dxa" w:w="20"/>
+              <w:right w:type="dxa" w:w="60"/>
+            </w:tcMar>
+            <w:vAlign w:val="center"/>
+          </w:tcPr>
+          <w:p>
+            <w:pPr>
+              <w:jc w:val="center"/>
+            </w:pPr>
+            <w:r>
+              <w:rPr>
+                <w:rFonts w:ascii="Arial" w:cs="Arial" w:eastAsia="Arial" w:hAnsi="Arial"/>
+                <w:b/>
+                <w:bCs/>
+                <w:color w:val="000000"/>
+                <w:sz w:val="15"/>
+                <w:szCs w:val="15"/>
+              </w:rPr>
+              <w:t xml:space="preserve">11,4</w:t>
+            </w:r>
+          </w:p>
+        </w:tc>
+        <w:tc>
+          <w:tcPr>
+            <w:tcW w:type="dxa" w:w="2400"/>
+            <w:tcBorders>
+              <w:top w:val="single" w:color="000000" w:sz="4"/>
+              <w:left w:val="single" w:color="000000" w:sz="4"/>
+              <w:bottom w:val="single" w:color="000000" w:sz="4"/>
+              <w:right w:val="single" w:color="000000" w:sz="4"/>
+            </w:tcBorders>
+            <w:tcMar>
+              <w:top w:type="dxa" w:w="20"/>
+              <w:left w:type="dxa" w:w="60"/>
+              <w:bottom w:type="dxa" w:w="20"/>
+              <w:right w:type="dxa" w:w="60"/>
+            </w:tcMar>
+            <w:vAlign w:val="center"/>
+          </w:tcPr>
+          <w:p>
+            <w:pPr>
+              <w:jc w:val="center"/>
+            </w:pPr>
+            <w:r>
+              <w:rPr>
+                <w:rFonts w:ascii="Arial" w:cs="Arial" w:eastAsia="Arial" w:hAnsi="Arial"/>
+                <w:b/>
+                <w:bCs/>
+                <w:color w:val="000000"/>
+                <w:sz w:val="15"/>
+                <w:szCs w:val="15"/>
+              </w:rPr>
+              <w:t xml:space="preserve">37 697</w:t>
             </w:r>
           </w:p>
         </w:tc>
@@ -4013,7 +4013,7 @@
         </w:trPr>
         <w:tc>
           <w:tcPr>
-            <w:tcW w:type="dxa" w:w="3600"/>
+            <w:tcW w:type="dxa" w:w="4600"/>
             <w:tcBorders>
               <w:top w:val="single" w:color="000000" w:sz="4"/>
               <w:left w:val="single" w:color="000000" w:sz="4"/>
@@ -4041,75 +4041,75 @@
                 <w:sz w:val="15"/>
                 <w:szCs w:val="15"/>
               </w:rPr>
-              <w:t xml:space="preserve">% en NSE C y D</w:t>
-            </w:r>
-          </w:p>
-        </w:tc>
-        <w:tc>
-          <w:tcPr>
-            <w:tcW w:type="dxa" w:w="1300"/>
-            <w:tcBorders>
-              <w:top w:val="single" w:color="000000" w:sz="4"/>
-              <w:left w:val="single" w:color="000000" w:sz="4"/>
-              <w:bottom w:val="single" w:color="000000" w:sz="4"/>
-              <w:right w:val="single" w:color="000000" w:sz="4"/>
-            </w:tcBorders>
-            <w:tcMar>
-              <w:top w:type="dxa" w:w="20"/>
-              <w:left w:type="dxa" w:w="60"/>
-              <w:bottom w:type="dxa" w:w="20"/>
-              <w:right w:type="dxa" w:w="60"/>
-            </w:tcMar>
-            <w:vAlign w:val="center"/>
-          </w:tcPr>
-          <w:p>
-            <w:pPr>
-              <w:jc w:val="center"/>
-            </w:pPr>
-            <w:r>
-              <w:rPr>
-                <w:rFonts w:ascii="Arial" w:cs="Arial" w:eastAsia="Arial" w:hAnsi="Arial"/>
-                <w:b/>
-                <w:bCs/>
-                <w:color w:val="000000"/>
-                <w:sz w:val="15"/>
-                <w:szCs w:val="15"/>
-              </w:rPr>
-              <w:t xml:space="preserve">54,5 %</w:t>
-            </w:r>
-          </w:p>
-        </w:tc>
-        <w:tc>
-          <w:tcPr>
-            <w:tcW w:type="dxa" w:w="3300"/>
-            <w:tcBorders>
-              <w:top w:val="single" w:color="000000" w:sz="4"/>
-              <w:left w:val="single" w:color="000000" w:sz="4"/>
-              <w:bottom w:val="single" w:color="000000" w:sz="4"/>
-              <w:right w:val="single" w:color="000000" w:sz="4"/>
-            </w:tcBorders>
-            <w:tcMar>
-              <w:top w:type="dxa" w:w="20"/>
-              <w:left w:type="dxa" w:w="60"/>
-              <w:bottom w:type="dxa" w:w="20"/>
-              <w:right w:type="dxa" w:w="60"/>
-            </w:tcMar>
-            <w:vAlign w:val="center"/>
-          </w:tcPr>
-          <w:p>
-            <w:pPr>
-              <w:jc w:val="center"/>
-            </w:pPr>
-            <w:r>
-              <w:rPr>
-                <w:rFonts w:ascii="Arial" w:cs="Arial" w:eastAsia="Arial" w:hAnsi="Arial"/>
-                <w:b/>
-                <w:bCs/>
-                <w:color w:val="000000"/>
-                <w:sz w:val="15"/>
-                <w:szCs w:val="15"/>
-              </w:rPr>
-              <w:t xml:space="preserve">CPI (23,8 % + 30,7 %)</w:t>
+              <w:t xml:space="preserve">No estudian ni trabajan (NINI)</w:t>
+            </w:r>
+          </w:p>
+        </w:tc>
+        <w:tc>
+          <w:tcPr>
+            <w:tcW w:type="dxa" w:w="1200"/>
+            <w:tcBorders>
+              <w:top w:val="single" w:color="000000" w:sz="4"/>
+              <w:left w:val="single" w:color="000000" w:sz="4"/>
+              <w:bottom w:val="single" w:color="000000" w:sz="4"/>
+              <w:right w:val="single" w:color="000000" w:sz="4"/>
+            </w:tcBorders>
+            <w:tcMar>
+              <w:top w:type="dxa" w:w="20"/>
+              <w:left w:type="dxa" w:w="60"/>
+              <w:bottom w:type="dxa" w:w="20"/>
+              <w:right w:type="dxa" w:w="60"/>
+            </w:tcMar>
+            <w:vAlign w:val="center"/>
+          </w:tcPr>
+          <w:p>
+            <w:pPr>
+              <w:jc w:val="center"/>
+            </w:pPr>
+            <w:r>
+              <w:rPr>
+                <w:rFonts w:ascii="Arial" w:cs="Arial" w:eastAsia="Arial" w:hAnsi="Arial"/>
+                <w:b/>
+                <w:bCs/>
+                <w:color w:val="000000"/>
+                <w:sz w:val="15"/>
+                <w:szCs w:val="15"/>
+              </w:rPr>
+              <w:t xml:space="preserve">19,7</w:t>
+            </w:r>
+          </w:p>
+        </w:tc>
+        <w:tc>
+          <w:tcPr>
+            <w:tcW w:type="dxa" w:w="2400"/>
+            <w:tcBorders>
+              <w:top w:val="single" w:color="000000" w:sz="4"/>
+              <w:left w:val="single" w:color="000000" w:sz="4"/>
+              <w:bottom w:val="single" w:color="000000" w:sz="4"/>
+              <w:right w:val="single" w:color="000000" w:sz="4"/>
+            </w:tcBorders>
+            <w:tcMar>
+              <w:top w:type="dxa" w:w="20"/>
+              <w:left w:type="dxa" w:w="60"/>
+              <w:bottom w:type="dxa" w:w="20"/>
+              <w:right w:type="dxa" w:w="60"/>
+            </w:tcMar>
+            <w:vAlign w:val="center"/>
+          </w:tcPr>
+          <w:p>
+            <w:pPr>
+              <w:jc w:val="center"/>
+            </w:pPr>
+            <w:r>
+              <w:rPr>
+                <w:rFonts w:ascii="Arial" w:cs="Arial" w:eastAsia="Arial" w:hAnsi="Arial"/>
+                <w:b/>
+                <w:bCs/>
+                <w:color w:val="000000"/>
+                <w:sz w:val="15"/>
+                <w:szCs w:val="15"/>
+              </w:rPr>
+              <w:t xml:space="preserve">65 097</w:t>
             </w:r>
           </w:p>
         </w:tc>
@@ -4120,7 +4120,7 @@
         </w:trPr>
         <w:tc>
           <w:tcPr>
-            <w:tcW w:type="dxa" w:w="3600"/>
+            <w:tcW w:type="dxa" w:w="4600"/>
             <w:tcBorders>
               <w:top w:val="single" w:color="000000" w:sz="4"/>
               <w:left w:val="single" w:color="000000" w:sz="4"/>
@@ -4148,75 +4148,289 @@
                 <w:sz w:val="15"/>
                 <w:szCs w:val="15"/>
               </w:rPr>
-              <w:t xml:space="preserve">Población de 15 a 24 años en NSE C y D (2024)</w:t>
-            </w:r>
-          </w:p>
-        </w:tc>
-        <w:tc>
-          <w:tcPr>
-            <w:tcW w:type="dxa" w:w="1300"/>
-            <w:tcBorders>
-              <w:top w:val="single" w:color="000000" w:sz="4"/>
-              <w:left w:val="single" w:color="000000" w:sz="4"/>
-              <w:bottom w:val="single" w:color="000000" w:sz="4"/>
-              <w:right w:val="single" w:color="000000" w:sz="4"/>
-            </w:tcBorders>
-            <w:tcMar>
-              <w:top w:type="dxa" w:w="20"/>
-              <w:left w:type="dxa" w:w="60"/>
-              <w:bottom w:type="dxa" w:w="20"/>
-              <w:right w:type="dxa" w:w="60"/>
-            </w:tcMar>
-            <w:vAlign w:val="center"/>
-          </w:tcPr>
-          <w:p>
-            <w:pPr>
-              <w:jc w:val="center"/>
-            </w:pPr>
-            <w:r>
-              <w:rPr>
-                <w:rFonts w:ascii="Arial" w:cs="Arial" w:eastAsia="Arial" w:hAnsi="Arial"/>
-                <w:b/>
-                <w:bCs/>
-                <w:color w:val="000000"/>
-                <w:sz w:val="15"/>
-                <w:szCs w:val="15"/>
-              </w:rPr>
-              <w:t xml:space="preserve">113 034</w:t>
-            </w:r>
-          </w:p>
-        </w:tc>
-        <w:tc>
-          <w:tcPr>
-            <w:tcW w:type="dxa" w:w="3300"/>
-            <w:tcBorders>
-              <w:top w:val="single" w:color="000000" w:sz="4"/>
-              <w:left w:val="single" w:color="000000" w:sz="4"/>
-              <w:bottom w:val="single" w:color="000000" w:sz="4"/>
-              <w:right w:val="single" w:color="000000" w:sz="4"/>
-            </w:tcBorders>
-            <w:tcMar>
-              <w:top w:type="dxa" w:w="20"/>
-              <w:left w:type="dxa" w:w="60"/>
-              <w:bottom w:type="dxa" w:w="20"/>
-              <w:right w:type="dxa" w:w="60"/>
-            </w:tcMar>
-            <w:vAlign w:val="center"/>
-          </w:tcPr>
-          <w:p>
-            <w:pPr>
-              <w:jc w:val="center"/>
-            </w:pPr>
-            <w:r>
-              <w:rPr>
-                <w:rFonts w:ascii="Arial" w:cs="Arial" w:eastAsia="Arial" w:hAnsi="Arial"/>
-                <w:b/>
-                <w:bCs/>
-                <w:color w:val="000000"/>
-                <w:sz w:val="15"/>
-                <w:szCs w:val="15"/>
-              </w:rPr>
-              <w:t xml:space="preserve">Cálculo propio</w:t>
+              <w:t xml:space="preserve">Total jóvenes de 15 a 29 años</w:t>
+            </w:r>
+          </w:p>
+        </w:tc>
+        <w:tc>
+          <w:tcPr>
+            <w:tcW w:type="dxa" w:w="1200"/>
+            <w:tcBorders>
+              <w:top w:val="single" w:color="000000" w:sz="4"/>
+              <w:left w:val="single" w:color="000000" w:sz="4"/>
+              <w:bottom w:val="single" w:color="000000" w:sz="4"/>
+              <w:right w:val="single" w:color="000000" w:sz="4"/>
+            </w:tcBorders>
+            <w:tcMar>
+              <w:top w:type="dxa" w:w="20"/>
+              <w:left w:type="dxa" w:w="60"/>
+              <w:bottom w:type="dxa" w:w="20"/>
+              <w:right w:type="dxa" w:w="60"/>
+            </w:tcMar>
+            <w:vAlign w:val="center"/>
+          </w:tcPr>
+          <w:p>
+            <w:pPr>
+              <w:jc w:val="center"/>
+            </w:pPr>
+            <w:r>
+              <w:rPr>
+                <w:rFonts w:ascii="Arial" w:cs="Arial" w:eastAsia="Arial" w:hAnsi="Arial"/>
+                <w:b/>
+                <w:bCs/>
+                <w:color w:val="000000"/>
+                <w:sz w:val="15"/>
+                <w:szCs w:val="15"/>
+              </w:rPr>
+              <w:t xml:space="preserve">100,0</w:t>
+            </w:r>
+          </w:p>
+        </w:tc>
+        <w:tc>
+          <w:tcPr>
+            <w:tcW w:type="dxa" w:w="2400"/>
+            <w:tcBorders>
+              <w:top w:val="single" w:color="000000" w:sz="4"/>
+              <w:left w:val="single" w:color="000000" w:sz="4"/>
+              <w:bottom w:val="single" w:color="000000" w:sz="4"/>
+              <w:right w:val="single" w:color="000000" w:sz="4"/>
+            </w:tcBorders>
+            <w:tcMar>
+              <w:top w:type="dxa" w:w="20"/>
+              <w:left w:type="dxa" w:w="60"/>
+              <w:bottom w:type="dxa" w:w="20"/>
+              <w:right w:type="dxa" w:w="60"/>
+            </w:tcMar>
+            <w:vAlign w:val="center"/>
+          </w:tcPr>
+          <w:p>
+            <w:pPr>
+              <w:jc w:val="center"/>
+            </w:pPr>
+            <w:r>
+              <w:rPr>
+                <w:rFonts w:ascii="Arial" w:cs="Arial" w:eastAsia="Arial" w:hAnsi="Arial"/>
+                <w:b/>
+                <w:bCs/>
+                <w:color w:val="000000"/>
+                <w:sz w:val="15"/>
+                <w:szCs w:val="15"/>
+              </w:rPr>
+              <w:t xml:space="preserve">330 674</w:t>
+            </w:r>
+          </w:p>
+        </w:tc>
+      </w:tr>
+      <w:tr>
+        <w:trPr>
+          <w:cantSplit/>
+        </w:trPr>
+        <w:tc>
+          <w:tcPr>
+            <w:tcW w:type="dxa" w:w="4600"/>
+            <w:tcBorders>
+              <w:top w:val="single" w:color="000000" w:sz="4"/>
+              <w:left w:val="single" w:color="000000" w:sz="4"/>
+              <w:bottom w:val="single" w:color="000000" w:sz="4"/>
+              <w:right w:val="single" w:color="000000" w:sz="4"/>
+            </w:tcBorders>
+            <w:tcMar>
+              <w:top w:type="dxa" w:w="20"/>
+              <w:left w:type="dxa" w:w="60"/>
+              <w:bottom w:type="dxa" w:w="20"/>
+              <w:right w:type="dxa" w:w="60"/>
+            </w:tcMar>
+            <w:vAlign w:val="center"/>
+          </w:tcPr>
+          <w:p>
+            <w:pPr>
+              <w:jc w:val="left"/>
+            </w:pPr>
+            <w:r>
+              <w:rPr>
+                <w:rFonts w:ascii="Arial" w:cs="Arial" w:eastAsia="Arial" w:hAnsi="Arial"/>
+                <w:b/>
+                <w:bCs/>
+                <w:color w:val="000000"/>
+                <w:sz w:val="15"/>
+                <w:szCs w:val="15"/>
+              </w:rPr>
+              <w:t xml:space="preserve">Jóvenes que no estudian (solo trabajan + NINI)</w:t>
+            </w:r>
+          </w:p>
+        </w:tc>
+        <w:tc>
+          <w:tcPr>
+            <w:tcW w:type="dxa" w:w="1200"/>
+            <w:tcBorders>
+              <w:top w:val="single" w:color="000000" w:sz="4"/>
+              <w:left w:val="single" w:color="000000" w:sz="4"/>
+              <w:bottom w:val="single" w:color="000000" w:sz="4"/>
+              <w:right w:val="single" w:color="000000" w:sz="4"/>
+            </w:tcBorders>
+            <w:tcMar>
+              <w:top w:type="dxa" w:w="20"/>
+              <w:left w:type="dxa" w:w="60"/>
+              <w:bottom w:type="dxa" w:w="20"/>
+              <w:right w:type="dxa" w:w="60"/>
+            </w:tcMar>
+            <w:vAlign w:val="center"/>
+          </w:tcPr>
+          <w:p>
+            <w:pPr>
+              <w:jc w:val="center"/>
+            </w:pPr>
+            <w:r>
+              <w:rPr>
+                <w:rFonts w:ascii="Arial" w:cs="Arial" w:eastAsia="Arial" w:hAnsi="Arial"/>
+                <w:b/>
+                <w:bCs/>
+                <w:color w:val="000000"/>
+                <w:sz w:val="15"/>
+                <w:szCs w:val="15"/>
+              </w:rPr>
+              <w:t xml:space="preserve">62,0</w:t>
+            </w:r>
+          </w:p>
+        </w:tc>
+        <w:tc>
+          <w:tcPr>
+            <w:tcW w:type="dxa" w:w="2400"/>
+            <w:tcBorders>
+              <w:top w:val="single" w:color="000000" w:sz="4"/>
+              <w:left w:val="single" w:color="000000" w:sz="4"/>
+              <w:bottom w:val="single" w:color="000000" w:sz="4"/>
+              <w:right w:val="single" w:color="000000" w:sz="4"/>
+            </w:tcBorders>
+            <w:tcMar>
+              <w:top w:type="dxa" w:w="20"/>
+              <w:left w:type="dxa" w:w="60"/>
+              <w:bottom w:type="dxa" w:w="20"/>
+              <w:right w:type="dxa" w:w="60"/>
+            </w:tcMar>
+            <w:vAlign w:val="center"/>
+          </w:tcPr>
+          <w:p>
+            <w:pPr>
+              <w:jc w:val="center"/>
+            </w:pPr>
+            <w:r>
+              <w:rPr>
+                <w:rFonts w:ascii="Arial" w:cs="Arial" w:eastAsia="Arial" w:hAnsi="Arial"/>
+                <w:b/>
+                <w:bCs/>
+                <w:color w:val="000000"/>
+                <w:sz w:val="15"/>
+                <w:szCs w:val="15"/>
+              </w:rPr>
+              <w:t xml:space="preserve">205 018</w:t>
+            </w:r>
+          </w:p>
+        </w:tc>
+      </w:tr>
+      <w:tr>
+        <w:trPr>
+          <w:cantSplit/>
+        </w:trPr>
+        <w:tc>
+          <w:tcPr>
+            <w:tcW w:type="dxa" w:w="4600"/>
+            <w:tcBorders>
+              <w:top w:val="single" w:color="000000" w:sz="4"/>
+              <w:left w:val="single" w:color="000000" w:sz="4"/>
+              <w:bottom w:val="single" w:color="000000" w:sz="4"/>
+              <w:right w:val="single" w:color="000000" w:sz="4"/>
+            </w:tcBorders>
+            <w:tcMar>
+              <w:top w:type="dxa" w:w="20"/>
+              <w:left w:type="dxa" w:w="60"/>
+              <w:bottom w:type="dxa" w:w="20"/>
+              <w:right w:type="dxa" w:w="60"/>
+            </w:tcMar>
+            <w:vAlign w:val="center"/>
+          </w:tcPr>
+          <w:p>
+            <w:pPr>
+              <w:jc w:val="left"/>
+            </w:pPr>
+            <w:r>
+              <w:rPr>
+                <w:rFonts w:ascii="Arial" w:cs="Arial" w:eastAsia="Arial" w:hAnsi="Arial"/>
+                <w:b/>
+                <w:bCs/>
+                <w:color w:val="000000"/>
+                <w:sz w:val="15"/>
+                <w:szCs w:val="15"/>
+              </w:rPr>
+              <w:t xml:space="preserve">Jóvenes que no estudian, en NSE C y D (54,5 %)</w:t>
+            </w:r>
+          </w:p>
+        </w:tc>
+        <w:tc>
+          <w:tcPr>
+            <w:tcW w:type="dxa" w:w="1200"/>
+            <w:tcBorders>
+              <w:top w:val="single" w:color="000000" w:sz="4"/>
+              <w:left w:val="single" w:color="000000" w:sz="4"/>
+              <w:bottom w:val="single" w:color="000000" w:sz="4"/>
+              <w:right w:val="single" w:color="000000" w:sz="4"/>
+            </w:tcBorders>
+            <w:tcMar>
+              <w:top w:type="dxa" w:w="20"/>
+              <w:left w:type="dxa" w:w="60"/>
+              <w:bottom w:type="dxa" w:w="20"/>
+              <w:right w:type="dxa" w:w="60"/>
+            </w:tcMar>
+            <w:vAlign w:val="center"/>
+          </w:tcPr>
+          <w:p>
+            <w:pPr>
+              <w:jc w:val="center"/>
+            </w:pPr>
+            <w:r>
+              <w:rPr>
+                <w:rFonts w:ascii="Arial" w:cs="Arial" w:eastAsia="Arial" w:hAnsi="Arial"/>
+                <w:b/>
+                <w:bCs/>
+                <w:color w:val="000000"/>
+                <w:sz w:val="15"/>
+                <w:szCs w:val="15"/>
+              </w:rPr>
+              <w:t xml:space="preserve">–</w:t>
+            </w:r>
+          </w:p>
+        </w:tc>
+        <w:tc>
+          <w:tcPr>
+            <w:tcW w:type="dxa" w:w="2400"/>
+            <w:tcBorders>
+              <w:top w:val="single" w:color="000000" w:sz="4"/>
+              <w:left w:val="single" w:color="000000" w:sz="4"/>
+              <w:bottom w:val="single" w:color="000000" w:sz="4"/>
+              <w:right w:val="single" w:color="000000" w:sz="4"/>
+            </w:tcBorders>
+            <w:tcMar>
+              <w:top w:type="dxa" w:w="20"/>
+              <w:left w:type="dxa" w:w="60"/>
+              <w:bottom w:type="dxa" w:w="20"/>
+              <w:right w:type="dxa" w:w="60"/>
+            </w:tcMar>
+            <w:vAlign w:val="center"/>
+          </w:tcPr>
+          <w:p>
+            <w:pPr>
+              <w:jc w:val="center"/>
+            </w:pPr>
+            <w:r>
+              <w:rPr>
+                <w:rFonts w:ascii="Arial" w:cs="Arial" w:eastAsia="Arial" w:hAnsi="Arial"/>
+                <w:b/>
+                <w:bCs/>
+                <w:color w:val="000000"/>
+                <w:sz w:val="15"/>
+                <w:szCs w:val="15"/>
+              </w:rPr>
+              <w:t xml:space="preserve">111 735</w:t>
             </w:r>
           </w:p>
         </w:tc>
@@ -4237,7 +4451,39 @@
           <w:sz w:val="14"/>
           <w:szCs w:val="14"/>
         </w:rPr>
-        <w:t xml:space="preserve">Nota: se usa el tramo de 15 a 24 años de la ENDES como aproximación al rango de 16 a 25 años del criterio. No se incluye el NSE B por no contar con su valor separado del A; su inclusión elevaría la población objetivo.</w:t>
+        <w:t xml:space="preserve">Fuente: INEI – ENAHO 2024, en GRTPE–OSEL Lambayeque, Mercado laboral de los jóvenes en la región Lambayeque (2025), p. 56; NSE, CPI. Elaboración propia para las dos últimas filas.</w:t>
+      </w:r>
+    </w:p>
+    <w:p>
+      <w:pPr>
+        <w:spacing w:after="120" w:line="360"/>
+        <w:jc w:val="both"/>
+      </w:pPr>
+      <w:r>
+        <w:rPr>
+          <w:rFonts w:ascii="Calibri" w:cs="Calibri" w:eastAsia="Calibri" w:hAnsi="Calibri"/>
+          <w:sz w:val="24"/>
+          <w:szCs w:val="24"/>
+        </w:rPr>
+        <w:t xml:space="preserve">La población objetivo se aproxima con los jóvenes de 15 a 29 años que no estudian, es decir, los que solo trabajan o no estudian ni trabajan (NINI), pertenecientes a los NSE C y D. Este grupo corresponde al criterio de no estar cursando estudios superiores. Cabe resaltar que Lambayeque ocupa el </w:t>
+      </w:r>
+      <w:r>
+        <w:rPr>
+          <w:rFonts w:ascii="Calibri" w:cs="Calibri" w:eastAsia="Calibri" w:hAnsi="Calibri"/>
+          <w:b/>
+          <w:bCs/>
+          <w:sz w:val="24"/>
+          <w:szCs w:val="24"/>
+        </w:rPr>
+        <w:t xml:space="preserve">cuarto lugar nacional en proporción de jóvenes NINI (19,7 %)</w:t>
+      </w:r>
+      <w:r>
+        <w:rPr>
+          <w:rFonts w:ascii="Calibri" w:cs="Calibri" w:eastAsia="Calibri" w:hAnsi="Calibri"/>
+          <w:sz w:val="24"/>
+          <w:szCs w:val="24"/>
+        </w:rPr>
+        <w:t xml:space="preserve">, con 65 097 jóvenes en esa condición en 2024 (OSEL, 2025, pp. 54-56), lo que evidencia la necesidad de ampliar la oferta formativa pertinente.</w:t>
       </w:r>
     </w:p>
     <w:p>
@@ -4620,7 +4866,7 @@
                 <w:sz w:val="15"/>
                 <w:szCs w:val="15"/>
               </w:rPr>
-              <w:t xml:space="preserve">115 424</w:t>
+              <w:t xml:space="preserve">110 938</w:t>
             </w:r>
           </w:p>
         </w:tc>
@@ -4654,7 +4900,7 @@
                 <w:sz w:val="15"/>
                 <w:szCs w:val="15"/>
               </w:rPr>
-              <w:t xml:space="preserve">116 232</w:t>
+              <w:t xml:space="preserve">110 674</w:t>
             </w:r>
           </w:p>
         </w:tc>
@@ -4688,7 +4934,7 @@
                 <w:sz w:val="15"/>
                 <w:szCs w:val="15"/>
               </w:rPr>
-              <w:t xml:space="preserve">117 046</w:t>
+              <w:t xml:space="preserve">110 410</w:t>
             </w:r>
           </w:p>
         </w:tc>
@@ -4722,7 +4968,7 @@
                 <w:sz w:val="15"/>
                 <w:szCs w:val="15"/>
               </w:rPr>
-              <w:t xml:space="preserve">117 865</w:t>
+              <w:t xml:space="preserve">110 147</w:t>
             </w:r>
           </w:p>
         </w:tc>
@@ -4756,7 +5002,7 @@
                 <w:sz w:val="15"/>
                 <w:szCs w:val="15"/>
               </w:rPr>
-              <w:t xml:space="preserve">118 690</w:t>
+              <w:t xml:space="preserve">109 885</w:t>
             </w:r>
           </w:p>
         </w:tc>
@@ -4790,7 +5036,7 @@
                 <w:sz w:val="15"/>
                 <w:szCs w:val="15"/>
               </w:rPr>
-              <w:t xml:space="preserve">119 521</w:t>
+              <w:t xml:space="preserve">109 623</w:t>
             </w:r>
           </w:p>
         </w:tc>
@@ -4824,7 +5070,7 @@
                 <w:sz w:val="15"/>
                 <w:szCs w:val="15"/>
               </w:rPr>
-              <w:t xml:space="preserve">120 357</w:t>
+              <w:t xml:space="preserve">109 362</w:t>
             </w:r>
           </w:p>
         </w:tc>
@@ -4845,7 +5091,7 @@
           <w:sz w:val="14"/>
           <w:szCs w:val="14"/>
         </w:rPr>
-        <w:t xml:space="preserve">Fuente: elaboración propia. Proyección con la tasa de crecimiento poblacional intercensal 2007-2017 de Lambayeque (0,7 % anual; BCRP, p. 2).</w:t>
+        <w:t xml:space="preserve">Fuente: elaboración propia. Proyección con la variación de la población de 15 a 29 años de Lambayeque 2024-2025 estimada por el INEI (−0,24 % anual; 309 375 a 308 638 jóvenes; SIRTOD, en OSEL 2025, p. 14).</w:t>
       </w:r>
     </w:p>
     <w:p>
@@ -5239,7 +5485,7 @@
                 <w:sz w:val="15"/>
                 <w:szCs w:val="15"/>
               </w:rPr>
-              <w:t xml:space="preserve">1 154</w:t>
+              <w:t xml:space="preserve">1 109</w:t>
             </w:r>
           </w:p>
         </w:tc>
@@ -5273,7 +5519,7 @@
                 <w:sz w:val="15"/>
                 <w:szCs w:val="15"/>
               </w:rPr>
-              <w:t xml:space="preserve">1 162</w:t>
+              <w:t xml:space="preserve">1 107</w:t>
             </w:r>
           </w:p>
         </w:tc>
@@ -5307,7 +5553,7 @@
                 <w:sz w:val="15"/>
                 <w:szCs w:val="15"/>
               </w:rPr>
-              <w:t xml:space="preserve">1 170</w:t>
+              <w:t xml:space="preserve">1 104</w:t>
             </w:r>
           </w:p>
         </w:tc>
@@ -5341,7 +5587,7 @@
                 <w:sz w:val="15"/>
                 <w:szCs w:val="15"/>
               </w:rPr>
-              <w:t xml:space="preserve">1 179</w:t>
+              <w:t xml:space="preserve">1 101</w:t>
             </w:r>
           </w:p>
         </w:tc>
@@ -5375,7 +5621,7 @@
                 <w:sz w:val="15"/>
                 <w:szCs w:val="15"/>
               </w:rPr>
-              <w:t xml:space="preserve">1 187</w:t>
+              <w:t xml:space="preserve">1 099</w:t>
             </w:r>
           </w:p>
         </w:tc>
@@ -5409,7 +5655,7 @@
                 <w:sz w:val="15"/>
                 <w:szCs w:val="15"/>
               </w:rPr>
-              <w:t xml:space="preserve">1 195</w:t>
+              <w:t xml:space="preserve">1 096</w:t>
             </w:r>
           </w:p>
         </w:tc>
@@ -5443,7 +5689,7 @@
                 <w:sz w:val="15"/>
                 <w:szCs w:val="15"/>
               </w:rPr>
-              <w:t xml:space="preserve">1 204</w:t>
+              <w:t xml:space="preserve">1 094</w:t>
             </w:r>
           </w:p>
         </w:tc>
@@ -5516,7 +5762,7 @@
                 <w:sz w:val="15"/>
                 <w:szCs w:val="15"/>
               </w:rPr>
-              <w:t xml:space="preserve">2 308</w:t>
+              <w:t xml:space="preserve">2 219</w:t>
             </w:r>
           </w:p>
         </w:tc>
@@ -5550,7 +5796,7 @@
                 <w:sz w:val="15"/>
                 <w:szCs w:val="15"/>
               </w:rPr>
-              <w:t xml:space="preserve">2 325</w:t>
+              <w:t xml:space="preserve">2 213</w:t>
             </w:r>
           </w:p>
         </w:tc>
@@ -5584,7 +5830,7 @@
                 <w:sz w:val="15"/>
                 <w:szCs w:val="15"/>
               </w:rPr>
-              <w:t xml:space="preserve">2 341</w:t>
+              <w:t xml:space="preserve">2 208</w:t>
             </w:r>
           </w:p>
         </w:tc>
@@ -5618,7 +5864,7 @@
                 <w:sz w:val="15"/>
                 <w:szCs w:val="15"/>
               </w:rPr>
-              <w:t xml:space="preserve">2 357</w:t>
+              <w:t xml:space="preserve">2 203</w:t>
             </w:r>
           </w:p>
         </w:tc>
@@ -5652,7 +5898,7 @@
                 <w:sz w:val="15"/>
                 <w:szCs w:val="15"/>
               </w:rPr>
-              <w:t xml:space="preserve">2 374</w:t>
+              <w:t xml:space="preserve">2 198</w:t>
             </w:r>
           </w:p>
         </w:tc>
@@ -5686,7 +5932,7 @@
                 <w:sz w:val="15"/>
                 <w:szCs w:val="15"/>
               </w:rPr>
-              <w:t xml:space="preserve">2 390</w:t>
+              <w:t xml:space="preserve">2 192</w:t>
             </w:r>
           </w:p>
         </w:tc>
@@ -5720,7 +5966,7 @@
                 <w:sz w:val="15"/>
                 <w:szCs w:val="15"/>
               </w:rPr>
-              <w:t xml:space="preserve">2 407</w:t>
+              <w:t xml:space="preserve">2 187</w:t>
             </w:r>
           </w:p>
         </w:tc>
@@ -5793,7 +6039,7 @@
                 <w:sz w:val="15"/>
                 <w:szCs w:val="15"/>
               </w:rPr>
-              <w:t xml:space="preserve">3 463</w:t>
+              <w:t xml:space="preserve">3 328</w:t>
             </w:r>
           </w:p>
         </w:tc>
@@ -5827,7 +6073,7 @@
                 <w:sz w:val="15"/>
                 <w:szCs w:val="15"/>
               </w:rPr>
-              <w:t xml:space="preserve">3 487</w:t>
+              <w:t xml:space="preserve">3 320</w:t>
             </w:r>
           </w:p>
         </w:tc>
@@ -5861,7 +6107,7 @@
                 <w:sz w:val="15"/>
                 <w:szCs w:val="15"/>
               </w:rPr>
-              <w:t xml:space="preserve">3 511</w:t>
+              <w:t xml:space="preserve">3 312</w:t>
             </w:r>
           </w:p>
         </w:tc>
@@ -5895,7 +6141,7 @@
                 <w:sz w:val="15"/>
                 <w:szCs w:val="15"/>
               </w:rPr>
-              <w:t xml:space="preserve">3 536</w:t>
+              <w:t xml:space="preserve">3 304</w:t>
             </w:r>
           </w:p>
         </w:tc>
@@ -5929,7 +6175,7 @@
                 <w:sz w:val="15"/>
                 <w:szCs w:val="15"/>
               </w:rPr>
-              <w:t xml:space="preserve">3 561</w:t>
+              <w:t xml:space="preserve">3 297</w:t>
             </w:r>
           </w:p>
         </w:tc>
@@ -5963,7 +6209,7 @@
                 <w:sz w:val="15"/>
                 <w:szCs w:val="15"/>
               </w:rPr>
-              <w:t xml:space="preserve">3 586</w:t>
+              <w:t xml:space="preserve">3 289</w:t>
             </w:r>
           </w:p>
         </w:tc>
@@ -5997,7 +6243,7 @@
                 <w:sz w:val="15"/>
                 <w:szCs w:val="15"/>
               </w:rPr>
-              <w:t xml:space="preserve">3 611</w:t>
+              <w:t xml:space="preserve">3 281</w:t>
             </w:r>
           </w:p>
         </w:tc>
@@ -6151,7 +6397,7 @@
           <w:sz w:val="24"/>
           <w:szCs w:val="24"/>
         </w:rPr>
-        <w:t xml:space="preserve">b) Oferta universitaria reciente (SUNEDU/portales de transparencia) y portal "Ponte en Carrera" (MINEDU).</w:t>
+        <w:t xml:space="preserve">b) Oferta universitaria reciente (portales de transparencia) y portal "Mi Carrera" (MTPE).</w:t>
       </w:r>
       <w:r>
         <w:rPr>
@@ -6195,7 +6441,7 @@
           <w:sz w:val="24"/>
           <w:szCs w:val="24"/>
         </w:rPr>
-        <w:t xml:space="preserve"> en 2025-I y 144 en 2025-II (UTP, Postulantes e ingresantes pregrado 2022-2025, pp. 1 y 3). Ello evidencia una demanda efectiva inmediata por la carrera. Las disciplinas de la salud se posicionan de forma consistente entre las tres áreas con mayor número de postulantes en la macrorregión norte, junto con Administración/Negocios e Ingenierías </w:t>
+        <w:t xml:space="preserve"> en 2025-I y 144 en 2025-II (UTP, Postulantes e ingresantes pregrado 2022-2025, pp. 1 y 3). Ello evidencia una demanda efectiva inmediata por la carrera. Complementariamente, el portal </w:t>
       </w:r>
       <w:r>
         <w:rPr>
@@ -6204,6 +6450,42 @@
           <w:bCs/>
           <w:sz w:val="24"/>
           <w:szCs w:val="24"/>
+        </w:rPr>
+        <w:t xml:space="preserve">Mi Carrera del MTPE</w:t>
+      </w:r>
+      <w:r>
+        <w:rPr>
+          <w:rFonts w:ascii="Calibri" w:cs="Calibri" w:eastAsia="Calibri" w:hAnsi="Calibri"/>
+          <w:sz w:val="24"/>
+          <w:szCs w:val="24"/>
+        </w:rPr>
+        <w:t xml:space="preserve"> ubica a </w:t>
+      </w:r>
+      <w:r>
+        <w:rPr>
+          <w:rFonts w:ascii="Calibri" w:cs="Calibri" w:eastAsia="Calibri" w:hAnsi="Calibri"/>
+          <w:b/>
+          <w:bCs/>
+          <w:sz w:val="24"/>
+          <w:szCs w:val="24"/>
+        </w:rPr>
+        <w:t xml:space="preserve">Farmacia en el sexto lugar entre las 30 familias de carreras universitarias más demandadas en Lambayeque</w:t>
+      </w:r>
+      <w:r>
+        <w:rPr>
+          <w:rFonts w:ascii="Calibri" w:cs="Calibri" w:eastAsia="Calibri" w:hAnsi="Calibri"/>
+          <w:sz w:val="24"/>
+          <w:szCs w:val="24"/>
+        </w:rPr>
+        <w:t xml:space="preserve">, después de Sistemas y Cómputo, Contabilidad e Impuestos, Enfermería, Educación Primaria y Educación Inicial </w:t>
+      </w:r>
+      <w:r>
+        <w:rPr>
+          <w:rFonts w:ascii="Calibri" w:cs="Calibri" w:eastAsia="Calibri" w:hAnsi="Calibri"/>
+          <w:b/>
+          <w:bCs/>
+          <w:sz w:val="24"/>
+          <w:szCs w:val="24"/>
           <w:shd w:fill="FFFF00" w:color="auto" w:val="clear"/>
         </w:rPr>
         <w:t xml:space="preserve">[VERIFICAR]</w:t>
@@ -6214,7 +6496,7 @@
           <w:sz w:val="24"/>
           <w:szCs w:val="24"/>
         </w:rPr>
-        <w:t xml:space="preserve"> (consultar el portal Ponte en Carrera).</w:t>
+        <w:t xml:space="preserve"> (registrar fecha de consulta). Las ciencias de la salud (Enfermería y Farmacia) aparecen así entre las seis familias con mayor demanda en la región.</w:t>
       </w:r>
     </w:p>
     <w:p>
@@ -6745,7 +7027,289 @@
                 <w:sz w:val="15"/>
                 <w:szCs w:val="15"/>
               </w:rPr>
-              <w:t xml:space="preserve">No figura entre sus facultades </w:t>
+              <w:t xml:space="preserve">No ofrece</w:t>
+            </w:r>
+          </w:p>
+        </w:tc>
+      </w:tr>
+      <w:tr>
+        <w:trPr>
+          <w:cantSplit/>
+        </w:trPr>
+        <w:tc>
+          <w:tcPr>
+            <w:tcW w:type="dxa" w:w="900"/>
+            <w:tcBorders>
+              <w:top w:val="single" w:color="000000" w:sz="4"/>
+              <w:left w:val="single" w:color="000000" w:sz="4"/>
+              <w:bottom w:val="single" w:color="000000" w:sz="4"/>
+              <w:right w:val="single" w:color="000000" w:sz="4"/>
+            </w:tcBorders>
+            <w:tcMar>
+              <w:top w:type="dxa" w:w="20"/>
+              <w:left w:type="dxa" w:w="60"/>
+              <w:bottom w:type="dxa" w:w="20"/>
+              <w:right w:type="dxa" w:w="60"/>
+            </w:tcMar>
+            <w:vAlign w:val="center"/>
+          </w:tcPr>
+          <w:p>
+            <w:pPr>
+              <w:jc w:val="center"/>
+            </w:pPr>
+            <w:r>
+              <w:rPr>
+                <w:rFonts w:ascii="Arial" w:cs="Arial" w:eastAsia="Arial" w:hAnsi="Arial"/>
+                <w:b/>
+                <w:bCs/>
+                <w:color w:val="000000"/>
+                <w:sz w:val="15"/>
+                <w:szCs w:val="15"/>
+              </w:rPr>
+              <w:t xml:space="preserve">Privada</w:t>
+            </w:r>
+          </w:p>
+        </w:tc>
+        <w:tc>
+          <w:tcPr>
+            <w:tcW w:type="dxa" w:w="3700"/>
+            <w:tcBorders>
+              <w:top w:val="single" w:color="000000" w:sz="4"/>
+              <w:left w:val="single" w:color="000000" w:sz="4"/>
+              <w:bottom w:val="single" w:color="000000" w:sz="4"/>
+              <w:right w:val="single" w:color="000000" w:sz="4"/>
+            </w:tcBorders>
+            <w:tcMar>
+              <w:top w:type="dxa" w:w="20"/>
+              <w:left w:type="dxa" w:w="60"/>
+              <w:bottom w:type="dxa" w:w="20"/>
+              <w:right w:type="dxa" w:w="60"/>
+            </w:tcMar>
+            <w:vAlign w:val="center"/>
+          </w:tcPr>
+          <w:p>
+            <w:pPr>
+              <w:jc w:val="center"/>
+            </w:pPr>
+            <w:r>
+              <w:rPr>
+                <w:rFonts w:ascii="Arial" w:cs="Arial" w:eastAsia="Arial" w:hAnsi="Arial"/>
+                <w:b/>
+                <w:bCs/>
+                <w:color w:val="000000"/>
+                <w:sz w:val="15"/>
+                <w:szCs w:val="15"/>
+              </w:rPr>
+              <w:t xml:space="preserve">Universidad Señor de Sipán (USS)</w:t>
+            </w:r>
+          </w:p>
+        </w:tc>
+        <w:tc>
+          <w:tcPr>
+            <w:tcW w:type="dxa" w:w="1700"/>
+            <w:tcBorders>
+              <w:top w:val="single" w:color="000000" w:sz="4"/>
+              <w:left w:val="single" w:color="000000" w:sz="4"/>
+              <w:bottom w:val="single" w:color="000000" w:sz="4"/>
+              <w:right w:val="single" w:color="000000" w:sz="4"/>
+            </w:tcBorders>
+            <w:tcMar>
+              <w:top w:type="dxa" w:w="20"/>
+              <w:left w:type="dxa" w:w="60"/>
+              <w:bottom w:type="dxa" w:w="20"/>
+              <w:right w:type="dxa" w:w="60"/>
+            </w:tcMar>
+            <w:vAlign w:val="center"/>
+          </w:tcPr>
+          <w:p>
+            <w:pPr>
+              <w:jc w:val="center"/>
+            </w:pPr>
+            <w:r>
+              <w:rPr>
+                <w:rFonts w:ascii="Arial" w:cs="Arial" w:eastAsia="Arial" w:hAnsi="Arial"/>
+                <w:b/>
+                <w:bCs/>
+                <w:color w:val="000000"/>
+                <w:sz w:val="15"/>
+                <w:szCs w:val="15"/>
+              </w:rPr>
+              <w:t xml:space="preserve">Licenciada</w:t>
+            </w:r>
+          </w:p>
+        </w:tc>
+        <w:tc>
+          <w:tcPr>
+            <w:tcW w:type="dxa" w:w="2000"/>
+            <w:tcBorders>
+              <w:top w:val="single" w:color="000000" w:sz="4"/>
+              <w:left w:val="single" w:color="000000" w:sz="4"/>
+              <w:bottom w:val="single" w:color="000000" w:sz="4"/>
+              <w:right w:val="single" w:color="000000" w:sz="4"/>
+            </w:tcBorders>
+            <w:tcMar>
+              <w:top w:type="dxa" w:w="20"/>
+              <w:left w:type="dxa" w:w="60"/>
+              <w:bottom w:type="dxa" w:w="20"/>
+              <w:right w:type="dxa" w:w="60"/>
+            </w:tcMar>
+            <w:vAlign w:val="center"/>
+          </w:tcPr>
+          <w:p>
+            <w:pPr>
+              <w:jc w:val="center"/>
+            </w:pPr>
+            <w:r>
+              <w:rPr>
+                <w:rFonts w:ascii="Arial" w:cs="Arial" w:eastAsia="Arial" w:hAnsi="Arial"/>
+                <w:b/>
+                <w:bCs/>
+                <w:color w:val="000000"/>
+                <w:sz w:val="15"/>
+                <w:szCs w:val="15"/>
+              </w:rPr>
+              <w:t xml:space="preserve">No ofrece (programa propuesto)</w:t>
+            </w:r>
+          </w:p>
+        </w:tc>
+      </w:tr>
+      <w:tr>
+        <w:trPr>
+          <w:cantSplit/>
+        </w:trPr>
+        <w:tc>
+          <w:tcPr>
+            <w:tcW w:type="dxa" w:w="900"/>
+            <w:tcBorders>
+              <w:top w:val="single" w:color="000000" w:sz="4"/>
+              <w:left w:val="single" w:color="000000" w:sz="4"/>
+              <w:bottom w:val="single" w:color="000000" w:sz="4"/>
+              <w:right w:val="single" w:color="000000" w:sz="4"/>
+            </w:tcBorders>
+            <w:tcMar>
+              <w:top w:type="dxa" w:w="20"/>
+              <w:left w:type="dxa" w:w="60"/>
+              <w:bottom w:type="dxa" w:w="20"/>
+              <w:right w:type="dxa" w:w="60"/>
+            </w:tcMar>
+            <w:vAlign w:val="center"/>
+          </w:tcPr>
+          <w:p>
+            <w:pPr>
+              <w:jc w:val="center"/>
+            </w:pPr>
+            <w:r>
+              <w:rPr>
+                <w:rFonts w:ascii="Arial" w:cs="Arial" w:eastAsia="Arial" w:hAnsi="Arial"/>
+                <w:b/>
+                <w:bCs/>
+                <w:color w:val="000000"/>
+                <w:sz w:val="15"/>
+                <w:szCs w:val="15"/>
+              </w:rPr>
+              <w:t xml:space="preserve">Privada</w:t>
+            </w:r>
+          </w:p>
+        </w:tc>
+        <w:tc>
+          <w:tcPr>
+            <w:tcW w:type="dxa" w:w="3700"/>
+            <w:tcBorders>
+              <w:top w:val="single" w:color="000000" w:sz="4"/>
+              <w:left w:val="single" w:color="000000" w:sz="4"/>
+              <w:bottom w:val="single" w:color="000000" w:sz="4"/>
+              <w:right w:val="single" w:color="000000" w:sz="4"/>
+            </w:tcBorders>
+            <w:tcMar>
+              <w:top w:type="dxa" w:w="20"/>
+              <w:left w:type="dxa" w:w="60"/>
+              <w:bottom w:type="dxa" w:w="20"/>
+              <w:right w:type="dxa" w:w="60"/>
+            </w:tcMar>
+            <w:vAlign w:val="center"/>
+          </w:tcPr>
+          <w:p>
+            <w:pPr>
+              <w:jc w:val="center"/>
+            </w:pPr>
+            <w:r>
+              <w:rPr>
+                <w:rFonts w:ascii="Arial" w:cs="Arial" w:eastAsia="Arial" w:hAnsi="Arial"/>
+                <w:b/>
+                <w:bCs/>
+                <w:color w:val="000000"/>
+                <w:sz w:val="15"/>
+                <w:szCs w:val="15"/>
+              </w:rPr>
+              <w:t xml:space="preserve">USAT, UCV y USMP (filial Chiclayo)</w:t>
+            </w:r>
+          </w:p>
+        </w:tc>
+        <w:tc>
+          <w:tcPr>
+            <w:tcW w:type="dxa" w:w="1700"/>
+            <w:tcBorders>
+              <w:top w:val="single" w:color="000000" w:sz="4"/>
+              <w:left w:val="single" w:color="000000" w:sz="4"/>
+              <w:bottom w:val="single" w:color="000000" w:sz="4"/>
+              <w:right w:val="single" w:color="000000" w:sz="4"/>
+            </w:tcBorders>
+            <w:tcMar>
+              <w:top w:type="dxa" w:w="20"/>
+              <w:left w:type="dxa" w:w="60"/>
+              <w:bottom w:type="dxa" w:w="20"/>
+              <w:right w:type="dxa" w:w="60"/>
+            </w:tcMar>
+            <w:vAlign w:val="center"/>
+          </w:tcPr>
+          <w:p>
+            <w:pPr>
+              <w:jc w:val="center"/>
+            </w:pPr>
+            <w:r>
+              <w:rPr>
+                <w:rFonts w:ascii="Arial" w:cs="Arial" w:eastAsia="Arial" w:hAnsi="Arial"/>
+                <w:b/>
+                <w:bCs/>
+                <w:color w:val="000000"/>
+                <w:sz w:val="15"/>
+                <w:szCs w:val="15"/>
+              </w:rPr>
+              <w:t xml:space="preserve">Licenciadas</w:t>
+            </w:r>
+          </w:p>
+        </w:tc>
+        <w:tc>
+          <w:tcPr>
+            <w:tcW w:type="dxa" w:w="2000"/>
+            <w:tcBorders>
+              <w:top w:val="single" w:color="000000" w:sz="4"/>
+              <w:left w:val="single" w:color="000000" w:sz="4"/>
+              <w:bottom w:val="single" w:color="000000" w:sz="4"/>
+              <w:right w:val="single" w:color="000000" w:sz="4"/>
+            </w:tcBorders>
+            <w:tcMar>
+              <w:top w:type="dxa" w:w="20"/>
+              <w:left w:type="dxa" w:w="60"/>
+              <w:bottom w:type="dxa" w:w="20"/>
+              <w:right w:type="dxa" w:w="60"/>
+            </w:tcMar>
+            <w:vAlign w:val="center"/>
+          </w:tcPr>
+          <w:p>
+            <w:pPr>
+              <w:jc w:val="center"/>
+            </w:pPr>
+            <w:r>
+              <w:rPr>
+                <w:rFonts w:ascii="Arial" w:cs="Arial" w:eastAsia="Arial" w:hAnsi="Arial"/>
+                <w:b/>
+                <w:bCs/>
+                <w:color w:val="000000"/>
+                <w:sz w:val="15"/>
+                <w:szCs w:val="15"/>
+              </w:rPr>
+              <w:t xml:space="preserve">No identificada </w:t>
             </w:r>
             <w:r>
               <w:rPr>
@@ -7201,7 +7765,7 @@
           <w:sz w:val="14"/>
           <w:szCs w:val="14"/>
         </w:rPr>
-        <w:t xml:space="preserve">Fuente: SUNEDU; portales institucionales.</w:t>
+        <w:t xml:space="preserve">Fuente: SUNEDU; INEI – Compendio Estadístico Lambayeque 2024 (6 universidades licenciadas); OSEL (2025), pp. 47-50, que lista los graduados de la UNPRG por escuela profesional sin incluir Farmacia; portales institucionales.</w:t>
       </w:r>
     </w:p>
     <w:p>
@@ -8273,7 +8837,7 @@
                 <w:sz w:val="15"/>
                 <w:szCs w:val="15"/>
               </w:rPr>
-              <w:t xml:space="preserve">2 308</w:t>
+              <w:t xml:space="preserve">2 219</w:t>
             </w:r>
           </w:p>
         </w:tc>
@@ -8307,7 +8871,7 @@
                 <w:sz w:val="15"/>
                 <w:szCs w:val="15"/>
               </w:rPr>
-              <w:t xml:space="preserve">2 325</w:t>
+              <w:t xml:space="preserve">2 213</w:t>
             </w:r>
           </w:p>
         </w:tc>
@@ -8341,7 +8905,7 @@
                 <w:sz w:val="15"/>
                 <w:szCs w:val="15"/>
               </w:rPr>
-              <w:t xml:space="preserve">2 341</w:t>
+              <w:t xml:space="preserve">2 208</w:t>
             </w:r>
           </w:p>
         </w:tc>
@@ -8375,7 +8939,7 @@
                 <w:sz w:val="15"/>
                 <w:szCs w:val="15"/>
               </w:rPr>
-              <w:t xml:space="preserve">2 357</w:t>
+              <w:t xml:space="preserve">2 203</w:t>
             </w:r>
           </w:p>
         </w:tc>
@@ -8409,7 +8973,7 @@
                 <w:sz w:val="15"/>
                 <w:szCs w:val="15"/>
               </w:rPr>
-              <w:t xml:space="preserve">2 374</w:t>
+              <w:t xml:space="preserve">2 198</w:t>
             </w:r>
           </w:p>
         </w:tc>
@@ -8443,7 +9007,7 @@
                 <w:sz w:val="15"/>
                 <w:szCs w:val="15"/>
               </w:rPr>
-              <w:t xml:space="preserve">2 390</w:t>
+              <w:t xml:space="preserve">2 192</w:t>
             </w:r>
           </w:p>
         </w:tc>
@@ -8477,7 +9041,7 @@
                 <w:sz w:val="15"/>
                 <w:szCs w:val="15"/>
               </w:rPr>
-              <w:t xml:space="preserve">2 407</w:t>
+              <w:t xml:space="preserve">2 187</w:t>
             </w:r>
           </w:p>
         </w:tc>
@@ -8827,7 +9391,7 @@
                 <w:sz w:val="15"/>
                 <w:szCs w:val="15"/>
               </w:rPr>
-              <w:t xml:space="preserve">2 068</w:t>
+              <w:t xml:space="preserve">1 979</w:t>
             </w:r>
           </w:p>
         </w:tc>
@@ -8861,7 +9425,7 @@
                 <w:sz w:val="15"/>
                 <w:szCs w:val="15"/>
               </w:rPr>
-              <w:t xml:space="preserve">2 085</w:t>
+              <w:t xml:space="preserve">1 973</w:t>
             </w:r>
           </w:p>
         </w:tc>
@@ -8895,7 +9459,7 @@
                 <w:sz w:val="15"/>
                 <w:szCs w:val="15"/>
               </w:rPr>
-              <w:t xml:space="preserve">2 101</w:t>
+              <w:t xml:space="preserve">1 968</w:t>
             </w:r>
           </w:p>
         </w:tc>
@@ -8929,7 +9493,7 @@
                 <w:sz w:val="15"/>
                 <w:szCs w:val="15"/>
               </w:rPr>
-              <w:t xml:space="preserve">2 117</w:t>
+              <w:t xml:space="preserve">1 963</w:t>
             </w:r>
           </w:p>
         </w:tc>
@@ -8963,7 +9527,7 @@
                 <w:sz w:val="15"/>
                 <w:szCs w:val="15"/>
               </w:rPr>
-              <w:t xml:space="preserve">2 134</w:t>
+              <w:t xml:space="preserve">1 958</w:t>
             </w:r>
           </w:p>
         </w:tc>
@@ -8997,7 +9561,7 @@
                 <w:sz w:val="15"/>
                 <w:szCs w:val="15"/>
               </w:rPr>
-              <w:t xml:space="preserve">2 150</w:t>
+              <w:t xml:space="preserve">1 952</w:t>
             </w:r>
           </w:p>
         </w:tc>
@@ -9031,7 +9595,7 @@
                 <w:sz w:val="15"/>
                 <w:szCs w:val="15"/>
               </w:rPr>
-              <w:t xml:space="preserve">2 167</w:t>
+              <w:t xml:space="preserve">1 947</w:t>
             </w:r>
           </w:p>
         </w:tc>
@@ -9066,7 +9630,7 @@
           <w:sz w:val="24"/>
           <w:szCs w:val="24"/>
         </w:rPr>
-        <w:t xml:space="preserve">Aun con el escenario conservador (1 % de interés) y tomando como oferta regional el total nacional de ingresantes de la UTP, para 2027 habría una brecha de más de 900 jóvenes interesados en estudiar Farmacia y Bioquímica que no encontrarían una vacante en una universidad licenciada de la región. En el escenario medio, la brecha supera los 2 000 jóvenes por año.</w:t>
+        <w:t xml:space="preserve">Aun con el escenario conservador (1 % de interés) y tomando como oferta regional el total nacional de ingresantes de la UTP, para 2027 habría una brecha de alrededor de 870 jóvenes interesados en estudiar Farmacia y Bioquímica que no encontrarían una vacante en una universidad licenciada de la región. En el escenario medio, la brecha se acerca a los 2 000 jóvenes por año.</w:t>
       </w:r>
     </w:p>
     <w:p>
@@ -9320,7 +9884,7 @@
           <w:sz w:val="22"/>
           <w:szCs w:val="22"/>
         </w:rPr>
-        <w:t xml:space="preserve">Tabla 8. Boticas y farmacias privadas en Lambayeque, 2024-2025</w:t>
+        <w:t xml:space="preserve">Tabla 8. Establecimientos farmacéuticos privados vigentes en Lambayeque, junio 2026</w:t>
       </w:r>
     </w:p>
     <w:tbl>
@@ -9337,9 +9901,10 @@
         </w:tblBorders>
       </w:tblPr>
       <w:tblGrid>
-        <w:gridCol w:w="4600"/>
-        <w:gridCol w:w="1800"/>
-        <w:gridCol w:w="1800"/>
+        <w:gridCol w:w="4000"/>
+        <w:gridCol w:w="1400"/>
+        <w:gridCol w:w="1400"/>
+        <w:gridCol w:w="1400"/>
       </w:tblGrid>
       <w:tr>
         <w:trPr>
@@ -9347,7 +9912,7 @@
         </w:trPr>
         <w:tc>
           <w:tcPr>
-            <w:tcW w:type="dxa" w:w="4600"/>
+            <w:tcW w:type="dxa" w:w="4000"/>
             <w:tcBorders>
               <w:top w:val="single" w:color="000000" w:sz="4"/>
               <w:left w:val="single" w:color="000000" w:sz="4"/>
@@ -9376,13 +9941,13 @@
                 <w:sz w:val="15"/>
                 <w:szCs w:val="15"/>
               </w:rPr>
-              <w:t xml:space="preserve">Concepto</w:t>
-            </w:r>
-          </w:p>
-        </w:tc>
-        <w:tc>
-          <w:tcPr>
-            <w:tcW w:type="dxa" w:w="1800"/>
+              <w:t xml:space="preserve">Tipo de establecimiento</w:t>
+            </w:r>
+          </w:p>
+        </w:tc>
+        <w:tc>
+          <w:tcPr>
+            <w:tcW w:type="dxa" w:w="1400"/>
             <w:tcBorders>
               <w:top w:val="single" w:color="000000" w:sz="4"/>
               <w:left w:val="single" w:color="000000" w:sz="4"/>
@@ -9411,13 +9976,13 @@
                 <w:sz w:val="15"/>
                 <w:szCs w:val="15"/>
               </w:rPr>
-              <w:t xml:space="preserve">Dic. 2024 (1)</w:t>
-            </w:r>
-          </w:p>
-        </w:tc>
-        <w:tc>
-          <w:tcPr>
-            <w:tcW w:type="dxa" w:w="1800"/>
+              <w:t xml:space="preserve">Lambayeque</w:t>
+            </w:r>
+          </w:p>
+        </w:tc>
+        <w:tc>
+          <w:tcPr>
+            <w:tcW w:type="dxa" w:w="1400"/>
             <w:tcBorders>
               <w:top w:val="single" w:color="000000" w:sz="4"/>
               <w:left w:val="single" w:color="000000" w:sz="4"/>
@@ -9446,7 +10011,42 @@
                 <w:sz w:val="15"/>
                 <w:szCs w:val="15"/>
               </w:rPr>
-              <w:t xml:space="preserve">Dic. 2025 (2)</w:t>
+              <w:t xml:space="preserve">Perú</w:t>
+            </w:r>
+          </w:p>
+        </w:tc>
+        <w:tc>
+          <w:tcPr>
+            <w:tcW w:type="dxa" w:w="1400"/>
+            <w:tcBorders>
+              <w:top w:val="single" w:color="000000" w:sz="4"/>
+              <w:left w:val="single" w:color="000000" w:sz="4"/>
+              <w:bottom w:val="single" w:color="000000" w:sz="4"/>
+              <w:right w:val="single" w:color="000000" w:sz="4"/>
+            </w:tcBorders>
+            <w:shd w:fill="1F4E2C" w:color="auto" w:val="clear"/>
+            <w:tcMar>
+              <w:top w:type="dxa" w:w="20"/>
+              <w:left w:type="dxa" w:w="60"/>
+              <w:bottom w:type="dxa" w:w="20"/>
+              <w:right w:type="dxa" w:w="60"/>
+            </w:tcMar>
+            <w:vAlign w:val="center"/>
+          </w:tcPr>
+          <w:p>
+            <w:pPr>
+              <w:jc w:val="center"/>
+            </w:pPr>
+            <w:r>
+              <w:rPr>
+                <w:rFonts w:ascii="Arial" w:cs="Arial" w:eastAsia="Arial" w:hAnsi="Arial"/>
+                <w:b/>
+                <w:bCs/>
+                <w:color w:val="FFFFFF"/>
+                <w:sz w:val="15"/>
+                <w:szCs w:val="15"/>
+              </w:rPr>
+              <w:t xml:space="preserve">% Lambayeque</w:t>
             </w:r>
           </w:p>
         </w:tc>
@@ -9457,7 +10057,7 @@
         </w:trPr>
         <w:tc>
           <w:tcPr>
-            <w:tcW w:type="dxa" w:w="4600"/>
+            <w:tcW w:type="dxa" w:w="4000"/>
             <w:tcBorders>
               <w:top w:val="single" w:color="000000" w:sz="4"/>
               <w:left w:val="single" w:color="000000" w:sz="4"/>
@@ -9485,75 +10085,109 @@
                 <w:sz w:val="15"/>
                 <w:szCs w:val="15"/>
               </w:rPr>
-              <w:t xml:space="preserve">Distritos con boticas o farmacias privadas (de 38)</w:t>
-            </w:r>
-          </w:p>
-        </w:tc>
-        <w:tc>
-          <w:tcPr>
-            <w:tcW w:type="dxa" w:w="1800"/>
-            <w:tcBorders>
-              <w:top w:val="single" w:color="000000" w:sz="4"/>
-              <w:left w:val="single" w:color="000000" w:sz="4"/>
-              <w:bottom w:val="single" w:color="000000" w:sz="4"/>
-              <w:right w:val="single" w:color="000000" w:sz="4"/>
-            </w:tcBorders>
-            <w:tcMar>
-              <w:top w:type="dxa" w:w="20"/>
-              <w:left w:type="dxa" w:w="60"/>
-              <w:bottom w:type="dxa" w:w="20"/>
-              <w:right w:type="dxa" w:w="60"/>
-            </w:tcMar>
-            <w:vAlign w:val="center"/>
-          </w:tcPr>
-          <w:p>
-            <w:pPr>
-              <w:jc w:val="center"/>
-            </w:pPr>
-            <w:r>
-              <w:rPr>
-                <w:rFonts w:ascii="Arial" w:cs="Arial" w:eastAsia="Arial" w:hAnsi="Arial"/>
-                <w:b/>
-                <w:bCs/>
-                <w:color w:val="000000"/>
-                <w:sz w:val="15"/>
-                <w:szCs w:val="15"/>
-              </w:rPr>
-              <w:t xml:space="preserve">35</w:t>
-            </w:r>
-          </w:p>
-        </w:tc>
-        <w:tc>
-          <w:tcPr>
-            <w:tcW w:type="dxa" w:w="1800"/>
-            <w:tcBorders>
-              <w:top w:val="single" w:color="000000" w:sz="4"/>
-              <w:left w:val="single" w:color="000000" w:sz="4"/>
-              <w:bottom w:val="single" w:color="000000" w:sz="4"/>
-              <w:right w:val="single" w:color="000000" w:sz="4"/>
-            </w:tcBorders>
-            <w:tcMar>
-              <w:top w:type="dxa" w:w="20"/>
-              <w:left w:type="dxa" w:w="60"/>
-              <w:bottom w:type="dxa" w:w="20"/>
-              <w:right w:type="dxa" w:w="60"/>
-            </w:tcMar>
-            <w:vAlign w:val="center"/>
-          </w:tcPr>
-          <w:p>
-            <w:pPr>
-              <w:jc w:val="center"/>
-            </w:pPr>
-            <w:r>
-              <w:rPr>
-                <w:rFonts w:ascii="Arial" w:cs="Arial" w:eastAsia="Arial" w:hAnsi="Arial"/>
-                <w:b/>
-                <w:bCs/>
-                <w:color w:val="000000"/>
-                <w:sz w:val="15"/>
-                <w:szCs w:val="15"/>
-              </w:rPr>
-              <w:t xml:space="preserve">34</w:t>
+              <w:t xml:space="preserve">Boticas</w:t>
+            </w:r>
+          </w:p>
+        </w:tc>
+        <w:tc>
+          <w:tcPr>
+            <w:tcW w:type="dxa" w:w="1400"/>
+            <w:tcBorders>
+              <w:top w:val="single" w:color="000000" w:sz="4"/>
+              <w:left w:val="single" w:color="000000" w:sz="4"/>
+              <w:bottom w:val="single" w:color="000000" w:sz="4"/>
+              <w:right w:val="single" w:color="000000" w:sz="4"/>
+            </w:tcBorders>
+            <w:tcMar>
+              <w:top w:type="dxa" w:w="20"/>
+              <w:left w:type="dxa" w:w="60"/>
+              <w:bottom w:type="dxa" w:w="20"/>
+              <w:right w:type="dxa" w:w="60"/>
+            </w:tcMar>
+            <w:vAlign w:val="center"/>
+          </w:tcPr>
+          <w:p>
+            <w:pPr>
+              <w:jc w:val="center"/>
+            </w:pPr>
+            <w:r>
+              <w:rPr>
+                <w:rFonts w:ascii="Arial" w:cs="Arial" w:eastAsia="Arial" w:hAnsi="Arial"/>
+                <w:b/>
+                <w:bCs/>
+                <w:color w:val="000000"/>
+                <w:sz w:val="15"/>
+                <w:szCs w:val="15"/>
+              </w:rPr>
+              <w:t xml:space="preserve">1 380</w:t>
+            </w:r>
+          </w:p>
+        </w:tc>
+        <w:tc>
+          <w:tcPr>
+            <w:tcW w:type="dxa" w:w="1400"/>
+            <w:tcBorders>
+              <w:top w:val="single" w:color="000000" w:sz="4"/>
+              <w:left w:val="single" w:color="000000" w:sz="4"/>
+              <w:bottom w:val="single" w:color="000000" w:sz="4"/>
+              <w:right w:val="single" w:color="000000" w:sz="4"/>
+            </w:tcBorders>
+            <w:tcMar>
+              <w:top w:type="dxa" w:w="20"/>
+              <w:left w:type="dxa" w:w="60"/>
+              <w:bottom w:type="dxa" w:w="20"/>
+              <w:right w:type="dxa" w:w="60"/>
+            </w:tcMar>
+            <w:vAlign w:val="center"/>
+          </w:tcPr>
+          <w:p>
+            <w:pPr>
+              <w:jc w:val="center"/>
+            </w:pPr>
+            <w:r>
+              <w:rPr>
+                <w:rFonts w:ascii="Arial" w:cs="Arial" w:eastAsia="Arial" w:hAnsi="Arial"/>
+                <w:b/>
+                <w:bCs/>
+                <w:color w:val="000000"/>
+                <w:sz w:val="15"/>
+                <w:szCs w:val="15"/>
+              </w:rPr>
+              <w:t xml:space="preserve">25 073</w:t>
+            </w:r>
+          </w:p>
+        </w:tc>
+        <w:tc>
+          <w:tcPr>
+            <w:tcW w:type="dxa" w:w="1400"/>
+            <w:tcBorders>
+              <w:top w:val="single" w:color="000000" w:sz="4"/>
+              <w:left w:val="single" w:color="000000" w:sz="4"/>
+              <w:bottom w:val="single" w:color="000000" w:sz="4"/>
+              <w:right w:val="single" w:color="000000" w:sz="4"/>
+            </w:tcBorders>
+            <w:tcMar>
+              <w:top w:type="dxa" w:w="20"/>
+              <w:left w:type="dxa" w:w="60"/>
+              <w:bottom w:type="dxa" w:w="20"/>
+              <w:right w:type="dxa" w:w="60"/>
+            </w:tcMar>
+            <w:vAlign w:val="center"/>
+          </w:tcPr>
+          <w:p>
+            <w:pPr>
+              <w:jc w:val="center"/>
+            </w:pPr>
+            <w:r>
+              <w:rPr>
+                <w:rFonts w:ascii="Arial" w:cs="Arial" w:eastAsia="Arial" w:hAnsi="Arial"/>
+                <w:b/>
+                <w:bCs/>
+                <w:color w:val="000000"/>
+                <w:sz w:val="15"/>
+                <w:szCs w:val="15"/>
+              </w:rPr>
+              <w:t xml:space="preserve">5,5 %</w:t>
             </w:r>
           </w:p>
         </w:tc>
@@ -9564,7 +10198,7 @@
         </w:trPr>
         <w:tc>
           <w:tcPr>
-            <w:tcW w:type="dxa" w:w="4600"/>
+            <w:tcW w:type="dxa" w:w="4000"/>
             <w:tcBorders>
               <w:top w:val="single" w:color="000000" w:sz="4"/>
               <w:left w:val="single" w:color="000000" w:sz="4"/>
@@ -9592,75 +10226,109 @@
                 <w:sz w:val="15"/>
                 <w:szCs w:val="15"/>
               </w:rPr>
-              <w:t xml:space="preserve">Boticas y farmacias de cadena</w:t>
-            </w:r>
-          </w:p>
-        </w:tc>
-        <w:tc>
-          <w:tcPr>
-            <w:tcW w:type="dxa" w:w="1800"/>
-            <w:tcBorders>
-              <w:top w:val="single" w:color="000000" w:sz="4"/>
-              <w:left w:val="single" w:color="000000" w:sz="4"/>
-              <w:bottom w:val="single" w:color="000000" w:sz="4"/>
-              <w:right w:val="single" w:color="000000" w:sz="4"/>
-            </w:tcBorders>
-            <w:tcMar>
-              <w:top w:type="dxa" w:w="20"/>
-              <w:left w:type="dxa" w:w="60"/>
-              <w:bottom w:type="dxa" w:w="20"/>
-              <w:right w:type="dxa" w:w="60"/>
-            </w:tcMar>
-            <w:vAlign w:val="center"/>
-          </w:tcPr>
-          <w:p>
-            <w:pPr>
-              <w:jc w:val="center"/>
-            </w:pPr>
-            <w:r>
-              <w:rPr>
-                <w:rFonts w:ascii="Arial" w:cs="Arial" w:eastAsia="Arial" w:hAnsi="Arial"/>
-                <w:b/>
-                <w:bCs/>
-                <w:color w:val="000000"/>
-                <w:sz w:val="15"/>
-                <w:szCs w:val="15"/>
-              </w:rPr>
-              <w:t xml:space="preserve">195</w:t>
-            </w:r>
-          </w:p>
-        </w:tc>
-        <w:tc>
-          <w:tcPr>
-            <w:tcW w:type="dxa" w:w="1800"/>
-            <w:tcBorders>
-              <w:top w:val="single" w:color="000000" w:sz="4"/>
-              <w:left w:val="single" w:color="000000" w:sz="4"/>
-              <w:bottom w:val="single" w:color="000000" w:sz="4"/>
-              <w:right w:val="single" w:color="000000" w:sz="4"/>
-            </w:tcBorders>
-            <w:tcMar>
-              <w:top w:type="dxa" w:w="20"/>
-              <w:left w:type="dxa" w:w="60"/>
-              <w:bottom w:type="dxa" w:w="20"/>
-              <w:right w:type="dxa" w:w="60"/>
-            </w:tcMar>
-            <w:vAlign w:val="center"/>
-          </w:tcPr>
-          <w:p>
-            <w:pPr>
-              <w:jc w:val="center"/>
-            </w:pPr>
-            <w:r>
-              <w:rPr>
-                <w:rFonts w:ascii="Arial" w:cs="Arial" w:eastAsia="Arial" w:hAnsi="Arial"/>
-                <w:b/>
-                <w:bCs/>
-                <w:color w:val="000000"/>
-                <w:sz w:val="15"/>
-                <w:szCs w:val="15"/>
-              </w:rPr>
-              <w:t xml:space="preserve">196</w:t>
+              <w:t xml:space="preserve">Farmacias</w:t>
+            </w:r>
+          </w:p>
+        </w:tc>
+        <w:tc>
+          <w:tcPr>
+            <w:tcW w:type="dxa" w:w="1400"/>
+            <w:tcBorders>
+              <w:top w:val="single" w:color="000000" w:sz="4"/>
+              <w:left w:val="single" w:color="000000" w:sz="4"/>
+              <w:bottom w:val="single" w:color="000000" w:sz="4"/>
+              <w:right w:val="single" w:color="000000" w:sz="4"/>
+            </w:tcBorders>
+            <w:tcMar>
+              <w:top w:type="dxa" w:w="20"/>
+              <w:left w:type="dxa" w:w="60"/>
+              <w:bottom w:type="dxa" w:w="20"/>
+              <w:right w:type="dxa" w:w="60"/>
+            </w:tcMar>
+            <w:vAlign w:val="center"/>
+          </w:tcPr>
+          <w:p>
+            <w:pPr>
+              <w:jc w:val="center"/>
+            </w:pPr>
+            <w:r>
+              <w:rPr>
+                <w:rFonts w:ascii="Arial" w:cs="Arial" w:eastAsia="Arial" w:hAnsi="Arial"/>
+                <w:b/>
+                <w:bCs/>
+                <w:color w:val="000000"/>
+                <w:sz w:val="15"/>
+                <w:szCs w:val="15"/>
+              </w:rPr>
+              <w:t xml:space="preserve">77</w:t>
+            </w:r>
+          </w:p>
+        </w:tc>
+        <w:tc>
+          <w:tcPr>
+            <w:tcW w:type="dxa" w:w="1400"/>
+            <w:tcBorders>
+              <w:top w:val="single" w:color="000000" w:sz="4"/>
+              <w:left w:val="single" w:color="000000" w:sz="4"/>
+              <w:bottom w:val="single" w:color="000000" w:sz="4"/>
+              <w:right w:val="single" w:color="000000" w:sz="4"/>
+            </w:tcBorders>
+            <w:tcMar>
+              <w:top w:type="dxa" w:w="20"/>
+              <w:left w:type="dxa" w:w="60"/>
+              <w:bottom w:type="dxa" w:w="20"/>
+              <w:right w:type="dxa" w:w="60"/>
+            </w:tcMar>
+            <w:vAlign w:val="center"/>
+          </w:tcPr>
+          <w:p>
+            <w:pPr>
+              <w:jc w:val="center"/>
+            </w:pPr>
+            <w:r>
+              <w:rPr>
+                <w:rFonts w:ascii="Arial" w:cs="Arial" w:eastAsia="Arial" w:hAnsi="Arial"/>
+                <w:b/>
+                <w:bCs/>
+                <w:color w:val="000000"/>
+                <w:sz w:val="15"/>
+                <w:szCs w:val="15"/>
+              </w:rPr>
+              <w:t xml:space="preserve">3 655</w:t>
+            </w:r>
+          </w:p>
+        </w:tc>
+        <w:tc>
+          <w:tcPr>
+            <w:tcW w:type="dxa" w:w="1400"/>
+            <w:tcBorders>
+              <w:top w:val="single" w:color="000000" w:sz="4"/>
+              <w:left w:val="single" w:color="000000" w:sz="4"/>
+              <w:bottom w:val="single" w:color="000000" w:sz="4"/>
+              <w:right w:val="single" w:color="000000" w:sz="4"/>
+            </w:tcBorders>
+            <w:tcMar>
+              <w:top w:type="dxa" w:w="20"/>
+              <w:left w:type="dxa" w:w="60"/>
+              <w:bottom w:type="dxa" w:w="20"/>
+              <w:right w:type="dxa" w:w="60"/>
+            </w:tcMar>
+            <w:vAlign w:val="center"/>
+          </w:tcPr>
+          <w:p>
+            <w:pPr>
+              <w:jc w:val="center"/>
+            </w:pPr>
+            <w:r>
+              <w:rPr>
+                <w:rFonts w:ascii="Arial" w:cs="Arial" w:eastAsia="Arial" w:hAnsi="Arial"/>
+                <w:b/>
+                <w:bCs/>
+                <w:color w:val="000000"/>
+                <w:sz w:val="15"/>
+                <w:szCs w:val="15"/>
+              </w:rPr>
+              <w:t xml:space="preserve">2,1 %</w:t>
             </w:r>
           </w:p>
         </w:tc>
@@ -9671,7 +10339,7 @@
         </w:trPr>
         <w:tc>
           <w:tcPr>
-            <w:tcW w:type="dxa" w:w="4600"/>
+            <w:tcW w:type="dxa" w:w="4000"/>
             <w:tcBorders>
               <w:top w:val="single" w:color="000000" w:sz="4"/>
               <w:left w:val="single" w:color="000000" w:sz="4"/>
@@ -9699,75 +10367,109 @@
                 <w:sz w:val="15"/>
                 <w:szCs w:val="15"/>
               </w:rPr>
-              <w:t xml:space="preserve">Boticas y farmacias independientes</w:t>
-            </w:r>
-          </w:p>
-        </w:tc>
-        <w:tc>
-          <w:tcPr>
-            <w:tcW w:type="dxa" w:w="1800"/>
-            <w:tcBorders>
-              <w:top w:val="single" w:color="000000" w:sz="4"/>
-              <w:left w:val="single" w:color="000000" w:sz="4"/>
-              <w:bottom w:val="single" w:color="000000" w:sz="4"/>
-              <w:right w:val="single" w:color="000000" w:sz="4"/>
-            </w:tcBorders>
-            <w:tcMar>
-              <w:top w:type="dxa" w:w="20"/>
-              <w:left w:type="dxa" w:w="60"/>
-              <w:bottom w:type="dxa" w:w="20"/>
-              <w:right w:type="dxa" w:w="60"/>
-            </w:tcMar>
-            <w:vAlign w:val="center"/>
-          </w:tcPr>
-          <w:p>
-            <w:pPr>
-              <w:jc w:val="center"/>
-            </w:pPr>
-            <w:r>
-              <w:rPr>
-                <w:rFonts w:ascii="Arial" w:cs="Arial" w:eastAsia="Arial" w:hAnsi="Arial"/>
-                <w:b/>
-                <w:bCs/>
-                <w:color w:val="000000"/>
-                <w:sz w:val="15"/>
-                <w:szCs w:val="15"/>
-              </w:rPr>
-              <w:t xml:space="preserve">1 708</w:t>
-            </w:r>
-          </w:p>
-        </w:tc>
-        <w:tc>
-          <w:tcPr>
-            <w:tcW w:type="dxa" w:w="1800"/>
-            <w:tcBorders>
-              <w:top w:val="single" w:color="000000" w:sz="4"/>
-              <w:left w:val="single" w:color="000000" w:sz="4"/>
-              <w:bottom w:val="single" w:color="000000" w:sz="4"/>
-              <w:right w:val="single" w:color="000000" w:sz="4"/>
-            </w:tcBorders>
-            <w:tcMar>
-              <w:top w:type="dxa" w:w="20"/>
-              <w:left w:type="dxa" w:w="60"/>
-              <w:bottom w:type="dxa" w:w="20"/>
-              <w:right w:type="dxa" w:w="60"/>
-            </w:tcMar>
-            <w:vAlign w:val="center"/>
-          </w:tcPr>
-          <w:p>
-            <w:pPr>
-              <w:jc w:val="center"/>
-            </w:pPr>
-            <w:r>
-              <w:rPr>
-                <w:rFonts w:ascii="Arial" w:cs="Arial" w:eastAsia="Arial" w:hAnsi="Arial"/>
-                <w:b/>
-                <w:bCs/>
-                <w:color w:val="000000"/>
-                <w:sz w:val="15"/>
-                <w:szCs w:val="15"/>
-              </w:rPr>
-              <w:t xml:space="preserve">1 334</w:t>
+              <w:t xml:space="preserve">Farmacias de establecimientos de salud (clínicas)</w:t>
+            </w:r>
+          </w:p>
+        </w:tc>
+        <w:tc>
+          <w:tcPr>
+            <w:tcW w:type="dxa" w:w="1400"/>
+            <w:tcBorders>
+              <w:top w:val="single" w:color="000000" w:sz="4"/>
+              <w:left w:val="single" w:color="000000" w:sz="4"/>
+              <w:bottom w:val="single" w:color="000000" w:sz="4"/>
+              <w:right w:val="single" w:color="000000" w:sz="4"/>
+            </w:tcBorders>
+            <w:tcMar>
+              <w:top w:type="dxa" w:w="20"/>
+              <w:left w:type="dxa" w:w="60"/>
+              <w:bottom w:type="dxa" w:w="20"/>
+              <w:right w:type="dxa" w:w="60"/>
+            </w:tcMar>
+            <w:vAlign w:val="center"/>
+          </w:tcPr>
+          <w:p>
+            <w:pPr>
+              <w:jc w:val="center"/>
+            </w:pPr>
+            <w:r>
+              <w:rPr>
+                <w:rFonts w:ascii="Arial" w:cs="Arial" w:eastAsia="Arial" w:hAnsi="Arial"/>
+                <w:b/>
+                <w:bCs/>
+                <w:color w:val="000000"/>
+                <w:sz w:val="15"/>
+                <w:szCs w:val="15"/>
+              </w:rPr>
+              <w:t xml:space="preserve">58</w:t>
+            </w:r>
+          </w:p>
+        </w:tc>
+        <w:tc>
+          <w:tcPr>
+            <w:tcW w:type="dxa" w:w="1400"/>
+            <w:tcBorders>
+              <w:top w:val="single" w:color="000000" w:sz="4"/>
+              <w:left w:val="single" w:color="000000" w:sz="4"/>
+              <w:bottom w:val="single" w:color="000000" w:sz="4"/>
+              <w:right w:val="single" w:color="000000" w:sz="4"/>
+            </w:tcBorders>
+            <w:tcMar>
+              <w:top w:type="dxa" w:w="20"/>
+              <w:left w:type="dxa" w:w="60"/>
+              <w:bottom w:type="dxa" w:w="20"/>
+              <w:right w:type="dxa" w:w="60"/>
+            </w:tcMar>
+            <w:vAlign w:val="center"/>
+          </w:tcPr>
+          <w:p>
+            <w:pPr>
+              <w:jc w:val="center"/>
+            </w:pPr>
+            <w:r>
+              <w:rPr>
+                <w:rFonts w:ascii="Arial" w:cs="Arial" w:eastAsia="Arial" w:hAnsi="Arial"/>
+                <w:b/>
+                <w:bCs/>
+                <w:color w:val="000000"/>
+                <w:sz w:val="15"/>
+                <w:szCs w:val="15"/>
+              </w:rPr>
+              <w:t xml:space="preserve">933</w:t>
+            </w:r>
+          </w:p>
+        </w:tc>
+        <w:tc>
+          <w:tcPr>
+            <w:tcW w:type="dxa" w:w="1400"/>
+            <w:tcBorders>
+              <w:top w:val="single" w:color="000000" w:sz="4"/>
+              <w:left w:val="single" w:color="000000" w:sz="4"/>
+              <w:bottom w:val="single" w:color="000000" w:sz="4"/>
+              <w:right w:val="single" w:color="000000" w:sz="4"/>
+            </w:tcBorders>
+            <w:tcMar>
+              <w:top w:type="dxa" w:w="20"/>
+              <w:left w:type="dxa" w:w="60"/>
+              <w:bottom w:type="dxa" w:w="20"/>
+              <w:right w:type="dxa" w:w="60"/>
+            </w:tcMar>
+            <w:vAlign w:val="center"/>
+          </w:tcPr>
+          <w:p>
+            <w:pPr>
+              <w:jc w:val="center"/>
+            </w:pPr>
+            <w:r>
+              <w:rPr>
+                <w:rFonts w:ascii="Arial" w:cs="Arial" w:eastAsia="Arial" w:hAnsi="Arial"/>
+                <w:b/>
+                <w:bCs/>
+                <w:color w:val="000000"/>
+                <w:sz w:val="15"/>
+                <w:szCs w:val="15"/>
+              </w:rPr>
+              <w:t xml:space="preserve">6,2 %</w:t>
             </w:r>
           </w:p>
         </w:tc>
@@ -9778,7 +10480,7 @@
         </w:trPr>
         <w:tc>
           <w:tcPr>
-            <w:tcW w:type="dxa" w:w="4600"/>
+            <w:tcW w:type="dxa" w:w="4000"/>
             <w:tcBorders>
               <w:top w:val="single" w:color="000000" w:sz="4"/>
               <w:left w:val="single" w:color="000000" w:sz="4"/>
@@ -9806,75 +10508,109 @@
                 <w:sz w:val="15"/>
                 <w:szCs w:val="15"/>
               </w:rPr>
-              <w:t xml:space="preserve">Total boticas y farmacias privadas</w:t>
-            </w:r>
-          </w:p>
-        </w:tc>
-        <w:tc>
-          <w:tcPr>
-            <w:tcW w:type="dxa" w:w="1800"/>
-            <w:tcBorders>
-              <w:top w:val="single" w:color="000000" w:sz="4"/>
-              <w:left w:val="single" w:color="000000" w:sz="4"/>
-              <w:bottom w:val="single" w:color="000000" w:sz="4"/>
-              <w:right w:val="single" w:color="000000" w:sz="4"/>
-            </w:tcBorders>
-            <w:tcMar>
-              <w:top w:type="dxa" w:w="20"/>
-              <w:left w:type="dxa" w:w="60"/>
-              <w:bottom w:type="dxa" w:w="20"/>
-              <w:right w:type="dxa" w:w="60"/>
-            </w:tcMar>
-            <w:vAlign w:val="center"/>
-          </w:tcPr>
-          <w:p>
-            <w:pPr>
-              <w:jc w:val="center"/>
-            </w:pPr>
-            <w:r>
-              <w:rPr>
-                <w:rFonts w:ascii="Arial" w:cs="Arial" w:eastAsia="Arial" w:hAnsi="Arial"/>
-                <w:b/>
-                <w:bCs/>
-                <w:color w:val="000000"/>
-                <w:sz w:val="15"/>
-                <w:szCs w:val="15"/>
-              </w:rPr>
-              <w:t xml:space="preserve">1 903</w:t>
-            </w:r>
-          </w:p>
-        </w:tc>
-        <w:tc>
-          <w:tcPr>
-            <w:tcW w:type="dxa" w:w="1800"/>
-            <w:tcBorders>
-              <w:top w:val="single" w:color="000000" w:sz="4"/>
-              <w:left w:val="single" w:color="000000" w:sz="4"/>
-              <w:bottom w:val="single" w:color="000000" w:sz="4"/>
-              <w:right w:val="single" w:color="000000" w:sz="4"/>
-            </w:tcBorders>
-            <w:tcMar>
-              <w:top w:type="dxa" w:w="20"/>
-              <w:left w:type="dxa" w:w="60"/>
-              <w:bottom w:type="dxa" w:w="20"/>
-              <w:right w:type="dxa" w:w="60"/>
-            </w:tcMar>
-            <w:vAlign w:val="center"/>
-          </w:tcPr>
-          <w:p>
-            <w:pPr>
-              <w:jc w:val="center"/>
-            </w:pPr>
-            <w:r>
-              <w:rPr>
-                <w:rFonts w:ascii="Arial" w:cs="Arial" w:eastAsia="Arial" w:hAnsi="Arial"/>
-                <w:b/>
-                <w:bCs/>
-                <w:color w:val="000000"/>
-                <w:sz w:val="15"/>
-                <w:szCs w:val="15"/>
-              </w:rPr>
-              <w:t xml:space="preserve">1 530</w:t>
+              <w:t xml:space="preserve">Droguerías</w:t>
+            </w:r>
+          </w:p>
+        </w:tc>
+        <w:tc>
+          <w:tcPr>
+            <w:tcW w:type="dxa" w:w="1400"/>
+            <w:tcBorders>
+              <w:top w:val="single" w:color="000000" w:sz="4"/>
+              <w:left w:val="single" w:color="000000" w:sz="4"/>
+              <w:bottom w:val="single" w:color="000000" w:sz="4"/>
+              <w:right w:val="single" w:color="000000" w:sz="4"/>
+            </w:tcBorders>
+            <w:tcMar>
+              <w:top w:type="dxa" w:w="20"/>
+              <w:left w:type="dxa" w:w="60"/>
+              <w:bottom w:type="dxa" w:w="20"/>
+              <w:right w:type="dxa" w:w="60"/>
+            </w:tcMar>
+            <w:vAlign w:val="center"/>
+          </w:tcPr>
+          <w:p>
+            <w:pPr>
+              <w:jc w:val="center"/>
+            </w:pPr>
+            <w:r>
+              <w:rPr>
+                <w:rFonts w:ascii="Arial" w:cs="Arial" w:eastAsia="Arial" w:hAnsi="Arial"/>
+                <w:b/>
+                <w:bCs/>
+                <w:color w:val="000000"/>
+                <w:sz w:val="15"/>
+                <w:szCs w:val="15"/>
+              </w:rPr>
+              <w:t xml:space="preserve">64</w:t>
+            </w:r>
+          </w:p>
+        </w:tc>
+        <w:tc>
+          <w:tcPr>
+            <w:tcW w:type="dxa" w:w="1400"/>
+            <w:tcBorders>
+              <w:top w:val="single" w:color="000000" w:sz="4"/>
+              <w:left w:val="single" w:color="000000" w:sz="4"/>
+              <w:bottom w:val="single" w:color="000000" w:sz="4"/>
+              <w:right w:val="single" w:color="000000" w:sz="4"/>
+            </w:tcBorders>
+            <w:tcMar>
+              <w:top w:type="dxa" w:w="20"/>
+              <w:left w:type="dxa" w:w="60"/>
+              <w:bottom w:type="dxa" w:w="20"/>
+              <w:right w:type="dxa" w:w="60"/>
+            </w:tcMar>
+            <w:vAlign w:val="center"/>
+          </w:tcPr>
+          <w:p>
+            <w:pPr>
+              <w:jc w:val="center"/>
+            </w:pPr>
+            <w:r>
+              <w:rPr>
+                <w:rFonts w:ascii="Arial" w:cs="Arial" w:eastAsia="Arial" w:hAnsi="Arial"/>
+                <w:b/>
+                <w:bCs/>
+                <w:color w:val="000000"/>
+                <w:sz w:val="15"/>
+                <w:szCs w:val="15"/>
+              </w:rPr>
+              <w:t xml:space="preserve">5 256</w:t>
+            </w:r>
+          </w:p>
+        </w:tc>
+        <w:tc>
+          <w:tcPr>
+            <w:tcW w:type="dxa" w:w="1400"/>
+            <w:tcBorders>
+              <w:top w:val="single" w:color="000000" w:sz="4"/>
+              <w:left w:val="single" w:color="000000" w:sz="4"/>
+              <w:bottom w:val="single" w:color="000000" w:sz="4"/>
+              <w:right w:val="single" w:color="000000" w:sz="4"/>
+            </w:tcBorders>
+            <w:tcMar>
+              <w:top w:type="dxa" w:w="20"/>
+              <w:left w:type="dxa" w:w="60"/>
+              <w:bottom w:type="dxa" w:w="20"/>
+              <w:right w:type="dxa" w:w="60"/>
+            </w:tcMar>
+            <w:vAlign w:val="center"/>
+          </w:tcPr>
+          <w:p>
+            <w:pPr>
+              <w:jc w:val="center"/>
+            </w:pPr>
+            <w:r>
+              <w:rPr>
+                <w:rFonts w:ascii="Arial" w:cs="Arial" w:eastAsia="Arial" w:hAnsi="Arial"/>
+                <w:b/>
+                <w:bCs/>
+                <w:color w:val="000000"/>
+                <w:sz w:val="15"/>
+                <w:szCs w:val="15"/>
+              </w:rPr>
+              <w:t xml:space="preserve">1,2 %</w:t>
             </w:r>
           </w:p>
         </w:tc>
@@ -9885,7 +10621,7 @@
         </w:trPr>
         <w:tc>
           <w:tcPr>
-            <w:tcW w:type="dxa" w:w="4600"/>
+            <w:tcW w:type="dxa" w:w="4000"/>
             <w:tcBorders>
               <w:top w:val="single" w:color="000000" w:sz="4"/>
               <w:left w:val="single" w:color="000000" w:sz="4"/>
@@ -9913,75 +10649,250 @@
                 <w:sz w:val="15"/>
                 <w:szCs w:val="15"/>
               </w:rPr>
-              <w:t xml:space="preserve">Participación en el total nacional</w:t>
-            </w:r>
-          </w:p>
-        </w:tc>
-        <w:tc>
-          <w:tcPr>
-            <w:tcW w:type="dxa" w:w="1800"/>
-            <w:tcBorders>
-              <w:top w:val="single" w:color="000000" w:sz="4"/>
-              <w:left w:val="single" w:color="000000" w:sz="4"/>
-              <w:bottom w:val="single" w:color="000000" w:sz="4"/>
-              <w:right w:val="single" w:color="000000" w:sz="4"/>
-            </w:tcBorders>
-            <w:tcMar>
-              <w:top w:type="dxa" w:w="20"/>
-              <w:left w:type="dxa" w:w="60"/>
-              <w:bottom w:type="dxa" w:w="20"/>
-              <w:right w:type="dxa" w:w="60"/>
-            </w:tcMar>
-            <w:vAlign w:val="center"/>
-          </w:tcPr>
-          <w:p>
-            <w:pPr>
-              <w:jc w:val="center"/>
-            </w:pPr>
-            <w:r>
-              <w:rPr>
-                <w:rFonts w:ascii="Arial" w:cs="Arial" w:eastAsia="Arial" w:hAnsi="Arial"/>
-                <w:b/>
-                <w:bCs/>
-                <w:color w:val="000000"/>
-                <w:sz w:val="15"/>
-                <w:szCs w:val="15"/>
-              </w:rPr>
-              <w:t xml:space="preserve">6,45 %</w:t>
-            </w:r>
-          </w:p>
-        </w:tc>
-        <w:tc>
-          <w:tcPr>
-            <w:tcW w:type="dxa" w:w="1800"/>
-            <w:tcBorders>
-              <w:top w:val="single" w:color="000000" w:sz="4"/>
-              <w:left w:val="single" w:color="000000" w:sz="4"/>
-              <w:bottom w:val="single" w:color="000000" w:sz="4"/>
-              <w:right w:val="single" w:color="000000" w:sz="4"/>
-            </w:tcBorders>
-            <w:tcMar>
-              <w:top w:type="dxa" w:w="20"/>
-              <w:left w:type="dxa" w:w="60"/>
-              <w:bottom w:type="dxa" w:w="20"/>
-              <w:right w:type="dxa" w:w="60"/>
-            </w:tcMar>
-            <w:vAlign w:val="center"/>
-          </w:tcPr>
-          <w:p>
-            <w:pPr>
-              <w:jc w:val="center"/>
-            </w:pPr>
-            <w:r>
-              <w:rPr>
-                <w:rFonts w:ascii="Arial" w:cs="Arial" w:eastAsia="Arial" w:hAnsi="Arial"/>
-                <w:b/>
-                <w:bCs/>
-                <w:color w:val="000000"/>
-                <w:sz w:val="15"/>
-                <w:szCs w:val="15"/>
-              </w:rPr>
-              <w:t xml:space="preserve">5,23 %</w:t>
+              <w:t xml:space="preserve">Laboratorios</w:t>
+            </w:r>
+          </w:p>
+        </w:tc>
+        <w:tc>
+          <w:tcPr>
+            <w:tcW w:type="dxa" w:w="1400"/>
+            <w:tcBorders>
+              <w:top w:val="single" w:color="000000" w:sz="4"/>
+              <w:left w:val="single" w:color="000000" w:sz="4"/>
+              <w:bottom w:val="single" w:color="000000" w:sz="4"/>
+              <w:right w:val="single" w:color="000000" w:sz="4"/>
+            </w:tcBorders>
+            <w:tcMar>
+              <w:top w:type="dxa" w:w="20"/>
+              <w:left w:type="dxa" w:w="60"/>
+              <w:bottom w:type="dxa" w:w="20"/>
+              <w:right w:type="dxa" w:w="60"/>
+            </w:tcMar>
+            <w:vAlign w:val="center"/>
+          </w:tcPr>
+          <w:p>
+            <w:pPr>
+              <w:jc w:val="center"/>
+            </w:pPr>
+            <w:r>
+              <w:rPr>
+                <w:rFonts w:ascii="Arial" w:cs="Arial" w:eastAsia="Arial" w:hAnsi="Arial"/>
+                <w:b/>
+                <w:bCs/>
+                <w:color w:val="000000"/>
+                <w:sz w:val="15"/>
+                <w:szCs w:val="15"/>
+              </w:rPr>
+              <w:t xml:space="preserve">1</w:t>
+            </w:r>
+          </w:p>
+        </w:tc>
+        <w:tc>
+          <w:tcPr>
+            <w:tcW w:type="dxa" w:w="1400"/>
+            <w:tcBorders>
+              <w:top w:val="single" w:color="000000" w:sz="4"/>
+              <w:left w:val="single" w:color="000000" w:sz="4"/>
+              <w:bottom w:val="single" w:color="000000" w:sz="4"/>
+              <w:right w:val="single" w:color="000000" w:sz="4"/>
+            </w:tcBorders>
+            <w:tcMar>
+              <w:top w:type="dxa" w:w="20"/>
+              <w:left w:type="dxa" w:w="60"/>
+              <w:bottom w:type="dxa" w:w="20"/>
+              <w:right w:type="dxa" w:w="60"/>
+            </w:tcMar>
+            <w:vAlign w:val="center"/>
+          </w:tcPr>
+          <w:p>
+            <w:pPr>
+              <w:jc w:val="center"/>
+            </w:pPr>
+            <w:r>
+              <w:rPr>
+                <w:rFonts w:ascii="Arial" w:cs="Arial" w:eastAsia="Arial" w:hAnsi="Arial"/>
+                <w:b/>
+                <w:bCs/>
+                <w:color w:val="000000"/>
+                <w:sz w:val="15"/>
+                <w:szCs w:val="15"/>
+              </w:rPr>
+              <w:t xml:space="preserve">182</w:t>
+            </w:r>
+          </w:p>
+        </w:tc>
+        <w:tc>
+          <w:tcPr>
+            <w:tcW w:type="dxa" w:w="1400"/>
+            <w:tcBorders>
+              <w:top w:val="single" w:color="000000" w:sz="4"/>
+              <w:left w:val="single" w:color="000000" w:sz="4"/>
+              <w:bottom w:val="single" w:color="000000" w:sz="4"/>
+              <w:right w:val="single" w:color="000000" w:sz="4"/>
+            </w:tcBorders>
+            <w:tcMar>
+              <w:top w:type="dxa" w:w="20"/>
+              <w:left w:type="dxa" w:w="60"/>
+              <w:bottom w:type="dxa" w:w="20"/>
+              <w:right w:type="dxa" w:w="60"/>
+            </w:tcMar>
+            <w:vAlign w:val="center"/>
+          </w:tcPr>
+          <w:p>
+            <w:pPr>
+              <w:jc w:val="center"/>
+            </w:pPr>
+            <w:r>
+              <w:rPr>
+                <w:rFonts w:ascii="Arial" w:cs="Arial" w:eastAsia="Arial" w:hAnsi="Arial"/>
+                <w:b/>
+                <w:bCs/>
+                <w:color w:val="000000"/>
+                <w:sz w:val="15"/>
+                <w:szCs w:val="15"/>
+              </w:rPr>
+              <w:t xml:space="preserve">0,5 %</w:t>
+            </w:r>
+          </w:p>
+        </w:tc>
+      </w:tr>
+      <w:tr>
+        <w:trPr>
+          <w:cantSplit/>
+        </w:trPr>
+        <w:tc>
+          <w:tcPr>
+            <w:tcW w:type="dxa" w:w="4000"/>
+            <w:tcBorders>
+              <w:top w:val="single" w:color="000000" w:sz="4"/>
+              <w:left w:val="single" w:color="000000" w:sz="4"/>
+              <w:bottom w:val="single" w:color="000000" w:sz="4"/>
+              <w:right w:val="single" w:color="000000" w:sz="4"/>
+            </w:tcBorders>
+            <w:tcMar>
+              <w:top w:type="dxa" w:w="20"/>
+              <w:left w:type="dxa" w:w="60"/>
+              <w:bottom w:type="dxa" w:w="20"/>
+              <w:right w:type="dxa" w:w="60"/>
+            </w:tcMar>
+            <w:vAlign w:val="center"/>
+          </w:tcPr>
+          <w:p>
+            <w:pPr>
+              <w:jc w:val="left"/>
+            </w:pPr>
+            <w:r>
+              <w:rPr>
+                <w:rFonts w:ascii="Arial" w:cs="Arial" w:eastAsia="Arial" w:hAnsi="Arial"/>
+                <w:b/>
+                <w:bCs/>
+                <w:color w:val="000000"/>
+                <w:sz w:val="15"/>
+                <w:szCs w:val="15"/>
+              </w:rPr>
+              <w:t xml:space="preserve">Total</w:t>
+            </w:r>
+          </w:p>
+        </w:tc>
+        <w:tc>
+          <w:tcPr>
+            <w:tcW w:type="dxa" w:w="1400"/>
+            <w:tcBorders>
+              <w:top w:val="single" w:color="000000" w:sz="4"/>
+              <w:left w:val="single" w:color="000000" w:sz="4"/>
+              <w:bottom w:val="single" w:color="000000" w:sz="4"/>
+              <w:right w:val="single" w:color="000000" w:sz="4"/>
+            </w:tcBorders>
+            <w:tcMar>
+              <w:top w:type="dxa" w:w="20"/>
+              <w:left w:type="dxa" w:w="60"/>
+              <w:bottom w:type="dxa" w:w="20"/>
+              <w:right w:type="dxa" w:w="60"/>
+            </w:tcMar>
+            <w:vAlign w:val="center"/>
+          </w:tcPr>
+          <w:p>
+            <w:pPr>
+              <w:jc w:val="center"/>
+            </w:pPr>
+            <w:r>
+              <w:rPr>
+                <w:rFonts w:ascii="Arial" w:cs="Arial" w:eastAsia="Arial" w:hAnsi="Arial"/>
+                <w:b/>
+                <w:bCs/>
+                <w:color w:val="000000"/>
+                <w:sz w:val="15"/>
+                <w:szCs w:val="15"/>
+              </w:rPr>
+              <w:t xml:space="preserve">1 580</w:t>
+            </w:r>
+          </w:p>
+        </w:tc>
+        <w:tc>
+          <w:tcPr>
+            <w:tcW w:type="dxa" w:w="1400"/>
+            <w:tcBorders>
+              <w:top w:val="single" w:color="000000" w:sz="4"/>
+              <w:left w:val="single" w:color="000000" w:sz="4"/>
+              <w:bottom w:val="single" w:color="000000" w:sz="4"/>
+              <w:right w:val="single" w:color="000000" w:sz="4"/>
+            </w:tcBorders>
+            <w:tcMar>
+              <w:top w:type="dxa" w:w="20"/>
+              <w:left w:type="dxa" w:w="60"/>
+              <w:bottom w:type="dxa" w:w="20"/>
+              <w:right w:type="dxa" w:w="60"/>
+            </w:tcMar>
+            <w:vAlign w:val="center"/>
+          </w:tcPr>
+          <w:p>
+            <w:pPr>
+              <w:jc w:val="center"/>
+            </w:pPr>
+            <w:r>
+              <w:rPr>
+                <w:rFonts w:ascii="Arial" w:cs="Arial" w:eastAsia="Arial" w:hAnsi="Arial"/>
+                <w:b/>
+                <w:bCs/>
+                <w:color w:val="000000"/>
+                <w:sz w:val="15"/>
+                <w:szCs w:val="15"/>
+              </w:rPr>
+              <w:t xml:space="preserve">35 099</w:t>
+            </w:r>
+          </w:p>
+        </w:tc>
+        <w:tc>
+          <w:tcPr>
+            <w:tcW w:type="dxa" w:w="1400"/>
+            <w:tcBorders>
+              <w:top w:val="single" w:color="000000" w:sz="4"/>
+              <w:left w:val="single" w:color="000000" w:sz="4"/>
+              <w:bottom w:val="single" w:color="000000" w:sz="4"/>
+              <w:right w:val="single" w:color="000000" w:sz="4"/>
+            </w:tcBorders>
+            <w:tcMar>
+              <w:top w:type="dxa" w:w="20"/>
+              <w:left w:type="dxa" w:w="60"/>
+              <w:bottom w:type="dxa" w:w="20"/>
+              <w:right w:type="dxa" w:w="60"/>
+            </w:tcMar>
+            <w:vAlign w:val="center"/>
+          </w:tcPr>
+          <w:p>
+            <w:pPr>
+              <w:jc w:val="center"/>
+            </w:pPr>
+            <w:r>
+              <w:rPr>
+                <w:rFonts w:ascii="Arial" w:cs="Arial" w:eastAsia="Arial" w:hAnsi="Arial"/>
+                <w:b/>
+                <w:bCs/>
+                <w:color w:val="000000"/>
+                <w:sz w:val="15"/>
+                <w:szCs w:val="15"/>
+              </w:rPr>
+              <w:t xml:space="preserve">4,5 %</w:t>
             </w:r>
           </w:p>
         </w:tc>
@@ -10002,7 +10913,7 @@
           <w:sz w:val="14"/>
           <w:szCs w:val="14"/>
         </w:rPr>
-        <w:t xml:space="preserve">Fuente: DIGEMID – Boletín de Establecimientos Farmacéuticos, Año 5, Ed. 8 (dic. 2024) y Ed. 10 (dic. 2025), p. 6. (1) Establecimientos con condición "activos". (2) Establecimientos con estado "vigente"; el cambio de criterio explica parte de la reducción.</w:t>
+        <w:t xml:space="preserve">Fuente: DIGEMID – Boletín de Establecimientos Farmacéuticos, Año 6, Ed. 11 (junio 2026), p. 4. Lambayeque ocupa el sexto lugar nacional.</w:t>
       </w:r>
     </w:p>
     <w:p>
@@ -10016,7 +10927,7 @@
           <w:sz w:val="24"/>
           <w:szCs w:val="24"/>
         </w:rPr>
-        <w:t xml:space="preserve">A nivel nacional, al 31 de diciembre de 2025 había </w:t>
+        <w:t xml:space="preserve">En la evolución de las boticas y farmacias privadas, Lambayeque registró 1 903 en diciembre de 2024 (establecimientos "activos"), 1 530 en diciembre de 2025 y 1 457 en junio de 2026 (establecimientos "vigentes"; 202 de cadena y 1 255 independientes), con presencia en 36 de sus 38 distritos (DIGEMID, Ed. 8, 10 y 11). A nivel nacional, solo durante 2025 se autorizaron </w:t>
       </w:r>
       <w:r>
         <w:rPr>
@@ -10026,15 +10937,29 @@
           <w:sz w:val="24"/>
           <w:szCs w:val="24"/>
         </w:rPr>
-        <w:t xml:space="preserve">35 565 establecimientos farmacéuticos privados vigentes</w:t>
-      </w:r>
-      <w:r>
-        <w:rPr>
-          <w:rFonts w:ascii="Calibri" w:cs="Calibri" w:eastAsia="Calibri" w:hAnsi="Calibri"/>
-          <w:sz w:val="24"/>
-          <w:szCs w:val="24"/>
-        </w:rPr>
-        <w:t xml:space="preserve">: 29 249 boticas y farmacias (82,2 %), 5 209 droguerías (14,6 %), 931 farmacias de establecimientos de salud (2,6 %) y 176 laboratorios (0,5 %). Solo durante 2025 se autorizaron </w:t>
+        <w:t xml:space="preserve">4 982 nuevos establecimientos farmacéuticos privados</w:t>
+      </w:r>
+      <w:r>
+        <w:rPr>
+          <w:rFonts w:ascii="Calibri" w:cs="Calibri" w:eastAsia="Calibri" w:hAnsi="Calibri"/>
+          <w:sz w:val="24"/>
+          <w:szCs w:val="24"/>
+        </w:rPr>
+        <w:t xml:space="preserve"> (DIGEMID, Ed. 10, p. 2).</w:t>
+      </w:r>
+    </w:p>
+    <w:p>
+      <w:pPr>
+        <w:spacing w:after="120" w:line="360"/>
+        <w:jc w:val="both"/>
+      </w:pPr>
+      <w:r>
+        <w:rPr>
+          <w:rFonts w:ascii="Calibri" w:cs="Calibri" w:eastAsia="Calibri" w:hAnsi="Calibri"/>
+          <w:sz w:val="24"/>
+          <w:szCs w:val="24"/>
+        </w:rPr>
+        <w:t xml:space="preserve">Frente a esta demanda, el </w:t>
       </w:r>
       <w:r>
         <w:rPr>
@@ -10044,15 +10969,15 @@
           <w:sz w:val="24"/>
           <w:szCs w:val="24"/>
         </w:rPr>
-        <w:t xml:space="preserve">4 982 nuevos establecimientos farmacéuticos privados</w:t>
-      </w:r>
-      <w:r>
-        <w:rPr>
-          <w:rFonts w:ascii="Calibri" w:cs="Calibri" w:eastAsia="Calibri" w:hAnsi="Calibri"/>
-          <w:sz w:val="24"/>
-          <w:szCs w:val="24"/>
-        </w:rPr>
-        <w:t xml:space="preserve"> en el país (DIGEMID, Ed. 10, pp. 2-3). Lambayeque es el </w:t>
+        <w:t xml:space="preserve">Colegio Químico Farmacéutico Departamental de Lambayeque registra 812 colegiados</w:t>
+      </w:r>
+      <w:r>
+        <w:rPr>
+          <w:rFonts w:ascii="Calibri" w:cs="Calibri" w:eastAsia="Calibri" w:hAnsi="Calibri"/>
+          <w:sz w:val="24"/>
+          <w:szCs w:val="24"/>
+        </w:rPr>
+        <w:t xml:space="preserve">, con 167 nuevos colegiados, 50 ingresos por traslado y 82 traslados a otros departamentos en el periodo 2023-2024 (CQFD Lambayeque, Memoria de Gestión 2023-2024). Es decir, la región cuenta con </w:t>
       </w:r>
       <w:r>
         <w:rPr>
@@ -10062,15 +10987,33 @@
           <w:sz w:val="24"/>
           <w:szCs w:val="24"/>
         </w:rPr>
-        <w:t xml:space="preserve">sexto departamento</w:t>
-      </w:r>
-      <w:r>
-        <w:rPr>
-          <w:rFonts w:ascii="Calibri" w:cs="Calibri" w:eastAsia="Calibri" w:hAnsi="Calibri"/>
-          <w:sz w:val="24"/>
-          <w:szCs w:val="24"/>
-        </w:rPr>
-        <w:t xml:space="preserve"> con más boticas y farmacias privadas (5,23 % del total nacional).</w:t>
+        <w:t xml:space="preserve">alrededor de 6 Químicos Farmacéuticos por cada 10 000 habitantes</w:t>
+      </w:r>
+      <w:r>
+        <w:rPr>
+          <w:rFonts w:ascii="Calibri" w:cs="Calibri" w:eastAsia="Calibri" w:hAnsi="Calibri"/>
+          <w:sz w:val="24"/>
+          <w:szCs w:val="24"/>
+        </w:rPr>
+        <w:t xml:space="preserve"> y con </w:t>
+      </w:r>
+      <w:r>
+        <w:rPr>
+          <w:rFonts w:ascii="Calibri" w:cs="Calibri" w:eastAsia="Calibri" w:hAnsi="Calibri"/>
+          <w:b/>
+          <w:bCs/>
+          <w:sz w:val="24"/>
+          <w:szCs w:val="24"/>
+        </w:rPr>
+        <w:t xml:space="preserve">casi dos establecimientos farmacéuticos (1 580) por cada profesional colegiado (812)</w:t>
+      </w:r>
+      <w:r>
+        <w:rPr>
+          <w:rFonts w:ascii="Calibri" w:cs="Calibri" w:eastAsia="Calibri" w:hAnsi="Calibri"/>
+          <w:sz w:val="24"/>
+          <w:szCs w:val="24"/>
+        </w:rPr>
+        <w:t xml:space="preserve">, sin considerar las plazas en hospitales, clínicas, laboratorios clínicos, industria y docencia.</w:t>
       </w:r>
     </w:p>
     <w:p>
@@ -10085,7 +11028,7 @@
           <w:sz w:val="22"/>
           <w:szCs w:val="22"/>
         </w:rPr>
-        <w:t xml:space="preserve">Tabla 9. Demanda estimada de Químicos Farmacéuticos como directores técnicos en Lambayeque</w:t>
+        <w:t xml:space="preserve">Tabla 9. Brecha estimada de Químicos Farmacéuticos en Lambayeque</w:t>
       </w:r>
     </w:p>
     <w:tbl>
@@ -10102,9 +11045,9 @@
         </w:tblBorders>
       </w:tblPr>
       <w:tblGrid>
-        <w:gridCol w:w="3700"/>
+        <w:gridCol w:w="3900"/>
         <w:gridCol w:w="1100"/>
-        <w:gridCol w:w="3400"/>
+        <w:gridCol w:w="3200"/>
       </w:tblGrid>
       <w:tr>
         <w:trPr>
@@ -10112,7 +11055,7 @@
         </w:trPr>
         <w:tc>
           <w:tcPr>
-            <w:tcW w:type="dxa" w:w="3700"/>
+            <w:tcW w:type="dxa" w:w="3900"/>
             <w:tcBorders>
               <w:top w:val="single" w:color="000000" w:sz="4"/>
               <w:left w:val="single" w:color="000000" w:sz="4"/>
@@ -10182,7 +11125,7 @@
         </w:tc>
         <w:tc>
           <w:tcPr>
-            <w:tcW w:type="dxa" w:w="3400"/>
+            <w:tcW w:type="dxa" w:w="3200"/>
             <w:tcBorders>
               <w:top w:val="single" w:color="000000" w:sz="4"/>
               <w:left w:val="single" w:color="000000" w:sz="4"/>
@@ -10222,7 +11165,7 @@
         </w:trPr>
         <w:tc>
           <w:tcPr>
-            <w:tcW w:type="dxa" w:w="3700"/>
+            <w:tcW w:type="dxa" w:w="3900"/>
             <w:tcBorders>
               <w:top w:val="single" w:color="000000" w:sz="4"/>
               <w:left w:val="single" w:color="000000" w:sz="4"/>
@@ -10250,7 +11193,7 @@
                 <w:sz w:val="15"/>
                 <w:szCs w:val="15"/>
               </w:rPr>
-              <w:t xml:space="preserve">Boticas y farmacias privadas vigentes (2025)</w:t>
+              <w:t xml:space="preserve">Establecimientos farmacéuticos privados vigentes (jun. 2026)</w:t>
             </w:r>
           </w:p>
         </w:tc>
@@ -10284,13 +11227,13 @@
                 <w:sz w:val="15"/>
                 <w:szCs w:val="15"/>
               </w:rPr>
-              <w:t xml:space="preserve">1 530</w:t>
-            </w:r>
-          </w:p>
-        </w:tc>
-        <w:tc>
-          <w:tcPr>
-            <w:tcW w:type="dxa" w:w="3400"/>
+              <w:t xml:space="preserve">1 580</w:t>
+            </w:r>
+          </w:p>
+        </w:tc>
+        <w:tc>
+          <w:tcPr>
+            <w:tcW w:type="dxa" w:w="3200"/>
             <w:tcBorders>
               <w:top w:val="single" w:color="000000" w:sz="4"/>
               <w:left w:val="single" w:color="000000" w:sz="4"/>
@@ -10329,7 +11272,7 @@
         </w:trPr>
         <w:tc>
           <w:tcPr>
-            <w:tcW w:type="dxa" w:w="3700"/>
+            <w:tcW w:type="dxa" w:w="3900"/>
             <w:tcBorders>
               <w:top w:val="single" w:color="000000" w:sz="4"/>
               <w:left w:val="single" w:color="000000" w:sz="4"/>
@@ -10391,13 +11334,13 @@
                 <w:sz w:val="15"/>
                 <w:szCs w:val="15"/>
               </w:rPr>
-              <w:t xml:space="preserve">1 530</w:t>
-            </w:r>
-          </w:p>
-        </w:tc>
-        <w:tc>
-          <w:tcPr>
-            <w:tcW w:type="dxa" w:w="3400"/>
+              <w:t xml:space="preserve">1 580</w:t>
+            </w:r>
+          </w:p>
+        </w:tc>
+        <w:tc>
+          <w:tcPr>
+            <w:tcW w:type="dxa" w:w="3200"/>
             <w:tcBorders>
               <w:top w:val="single" w:color="000000" w:sz="4"/>
               <w:left w:val="single" w:color="000000" w:sz="4"/>
@@ -10436,7 +11379,7 @@
         </w:trPr>
         <w:tc>
           <w:tcPr>
-            <w:tcW w:type="dxa" w:w="3700"/>
+            <w:tcW w:type="dxa" w:w="3900"/>
             <w:tcBorders>
               <w:top w:val="single" w:color="000000" w:sz="4"/>
               <w:left w:val="single" w:color="000000" w:sz="4"/>
@@ -10464,7 +11407,7 @@
                 <w:sz w:val="15"/>
                 <w:szCs w:val="15"/>
               </w:rPr>
-              <w:t xml:space="preserve">Nuevos EE.FF. privados autorizados por año en Lambayeque (estimado)</w:t>
+              <w:t xml:space="preserve">Químicos Farmacéuticos colegiados en Lambayeque</w:t>
             </w:r>
           </w:p>
         </w:tc>
@@ -10498,41 +11441,41 @@
                 <w:sz w:val="15"/>
                 <w:szCs w:val="15"/>
               </w:rPr>
-              <w:t xml:space="preserve">≈ 260</w:t>
-            </w:r>
-          </w:p>
-        </w:tc>
-        <w:tc>
-          <w:tcPr>
-            <w:tcW w:type="dxa" w:w="3400"/>
-            <w:tcBorders>
-              <w:top w:val="single" w:color="000000" w:sz="4"/>
-              <w:left w:val="single" w:color="000000" w:sz="4"/>
-              <w:bottom w:val="single" w:color="000000" w:sz="4"/>
-              <w:right w:val="single" w:color="000000" w:sz="4"/>
-            </w:tcBorders>
-            <w:tcMar>
-              <w:top w:type="dxa" w:w="20"/>
-              <w:left w:type="dxa" w:w="60"/>
-              <w:bottom w:type="dxa" w:w="20"/>
-              <w:right w:type="dxa" w:w="60"/>
-            </w:tcMar>
-            <w:vAlign w:val="center"/>
-          </w:tcPr>
-          <w:p>
-            <w:pPr>
-              <w:jc w:val="center"/>
-            </w:pPr>
-            <w:r>
-              <w:rPr>
-                <w:rFonts w:ascii="Arial" w:cs="Arial" w:eastAsia="Arial" w:hAnsi="Arial"/>
-                <w:b/>
-                <w:bCs/>
-                <w:color w:val="000000"/>
-                <w:sz w:val="15"/>
-                <w:szCs w:val="15"/>
-              </w:rPr>
-              <w:t xml:space="preserve">4 982 nacionales × 5,23 % regional</w:t>
+              <w:t xml:space="preserve">812</w:t>
+            </w:r>
+          </w:p>
+        </w:tc>
+        <w:tc>
+          <w:tcPr>
+            <w:tcW w:type="dxa" w:w="3200"/>
+            <w:tcBorders>
+              <w:top w:val="single" w:color="000000" w:sz="4"/>
+              <w:left w:val="single" w:color="000000" w:sz="4"/>
+              <w:bottom w:val="single" w:color="000000" w:sz="4"/>
+              <w:right w:val="single" w:color="000000" w:sz="4"/>
+            </w:tcBorders>
+            <w:tcMar>
+              <w:top w:type="dxa" w:w="20"/>
+              <w:left w:type="dxa" w:w="60"/>
+              <w:bottom w:type="dxa" w:w="20"/>
+              <w:right w:type="dxa" w:w="60"/>
+            </w:tcMar>
+            <w:vAlign w:val="center"/>
+          </w:tcPr>
+          <w:p>
+            <w:pPr>
+              <w:jc w:val="center"/>
+            </w:pPr>
+            <w:r>
+              <w:rPr>
+                <w:rFonts w:ascii="Arial" w:cs="Arial" w:eastAsia="Arial" w:hAnsi="Arial"/>
+                <w:b/>
+                <w:bCs/>
+                <w:color w:val="000000"/>
+                <w:sz w:val="15"/>
+                <w:szCs w:val="15"/>
+              </w:rPr>
+              <w:t xml:space="preserve">CQFD Lambayeque, Memoria 2023-2024</w:t>
             </w:r>
           </w:p>
         </w:tc>
@@ -10543,7 +11486,7 @@
         </w:trPr>
         <w:tc>
           <w:tcPr>
-            <w:tcW w:type="dxa" w:w="3700"/>
+            <w:tcW w:type="dxa" w:w="3900"/>
             <w:tcBorders>
               <w:top w:val="single" w:color="000000" w:sz="4"/>
               <w:left w:val="single" w:color="000000" w:sz="4"/>
@@ -10571,7 +11514,7 @@
                 <w:sz w:val="15"/>
                 <w:szCs w:val="15"/>
               </w:rPr>
-              <w:t xml:space="preserve">Demanda anual de QF por nuevos establecimientos (estimado)</w:t>
+              <w:t xml:space="preserve">Brecha mínima (solo dirección técnica)</w:t>
             </w:r>
           </w:p>
         </w:tc>
@@ -10605,41 +11548,41 @@
                 <w:sz w:val="15"/>
                 <w:szCs w:val="15"/>
               </w:rPr>
-              <w:t xml:space="preserve">≈ 260</w:t>
-            </w:r>
-          </w:p>
-        </w:tc>
-        <w:tc>
-          <w:tcPr>
-            <w:tcW w:type="dxa" w:w="3400"/>
-            <w:tcBorders>
-              <w:top w:val="single" w:color="000000" w:sz="4"/>
-              <w:left w:val="single" w:color="000000" w:sz="4"/>
-              <w:bottom w:val="single" w:color="000000" w:sz="4"/>
-              <w:right w:val="single" w:color="000000" w:sz="4"/>
-            </w:tcBorders>
-            <w:tcMar>
-              <w:top w:type="dxa" w:w="20"/>
-              <w:left w:type="dxa" w:w="60"/>
-              <w:bottom w:type="dxa" w:w="20"/>
-              <w:right w:type="dxa" w:w="60"/>
-            </w:tcMar>
-            <w:vAlign w:val="center"/>
-          </w:tcPr>
-          <w:p>
-            <w:pPr>
-              <w:jc w:val="center"/>
-            </w:pPr>
-            <w:r>
-              <w:rPr>
-                <w:rFonts w:ascii="Arial" w:cs="Arial" w:eastAsia="Arial" w:hAnsi="Arial"/>
-                <w:b/>
-                <w:bCs/>
-                <w:color w:val="000000"/>
-                <w:sz w:val="15"/>
-                <w:szCs w:val="15"/>
-              </w:rPr>
-              <w:t xml:space="preserve">1 QF por establecimiento nuevo</w:t>
+              <w:t xml:space="preserve">768</w:t>
+            </w:r>
+          </w:p>
+        </w:tc>
+        <w:tc>
+          <w:tcPr>
+            <w:tcW w:type="dxa" w:w="3200"/>
+            <w:tcBorders>
+              <w:top w:val="single" w:color="000000" w:sz="4"/>
+              <w:left w:val="single" w:color="000000" w:sz="4"/>
+              <w:bottom w:val="single" w:color="000000" w:sz="4"/>
+              <w:right w:val="single" w:color="000000" w:sz="4"/>
+            </w:tcBorders>
+            <w:tcMar>
+              <w:top w:type="dxa" w:w="20"/>
+              <w:left w:type="dxa" w:w="60"/>
+              <w:bottom w:type="dxa" w:w="20"/>
+              <w:right w:type="dxa" w:w="60"/>
+            </w:tcMar>
+            <w:vAlign w:val="center"/>
+          </w:tcPr>
+          <w:p>
+            <w:pPr>
+              <w:jc w:val="center"/>
+            </w:pPr>
+            <w:r>
+              <w:rPr>
+                <w:rFonts w:ascii="Arial" w:cs="Arial" w:eastAsia="Arial" w:hAnsi="Arial"/>
+                <w:b/>
+                <w:bCs/>
+                <w:color w:val="000000"/>
+                <w:sz w:val="15"/>
+                <w:szCs w:val="15"/>
+              </w:rPr>
+              <w:t xml:space="preserve">Requeridos − colegiados</w:t>
             </w:r>
           </w:p>
         </w:tc>
@@ -10650,7 +11593,7 @@
         </w:trPr>
         <w:tc>
           <w:tcPr>
-            <w:tcW w:type="dxa" w:w="3700"/>
+            <w:tcW w:type="dxa" w:w="3900"/>
             <w:tcBorders>
               <w:top w:val="single" w:color="000000" w:sz="4"/>
               <w:left w:val="single" w:color="000000" w:sz="4"/>
@@ -10678,7 +11621,7 @@
                 <w:sz w:val="15"/>
                 <w:szCs w:val="15"/>
               </w:rPr>
-              <w:t xml:space="preserve">Reposición (rotación, jubilación)</w:t>
+              <w:t xml:space="preserve">Nuevos EE.FF. privados por año en Lambayeque (estimado)</w:t>
             </w:r>
           </w:p>
         </w:tc>
@@ -10711,43 +11654,149 @@
                 <w:color w:val="000000"/>
                 <w:sz w:val="15"/>
                 <w:szCs w:val="15"/>
-                <w:shd w:fill="FFFF00" w:color="auto" w:val="clear"/>
-              </w:rPr>
-              <w:t xml:space="preserve">[DATO PENDIENTE]</w:t>
-            </w:r>
-          </w:p>
-        </w:tc>
-        <w:tc>
-          <w:tcPr>
-            <w:tcW w:type="dxa" w:w="3400"/>
-            <w:tcBorders>
-              <w:top w:val="single" w:color="000000" w:sz="4"/>
-              <w:left w:val="single" w:color="000000" w:sz="4"/>
-              <w:bottom w:val="single" w:color="000000" w:sz="4"/>
-              <w:right w:val="single" w:color="000000" w:sz="4"/>
-            </w:tcBorders>
-            <w:tcMar>
-              <w:top w:type="dxa" w:w="20"/>
-              <w:left w:type="dxa" w:w="60"/>
-              <w:bottom w:type="dxa" w:w="20"/>
-              <w:right w:type="dxa" w:w="60"/>
-            </w:tcMar>
-            <w:vAlign w:val="center"/>
-          </w:tcPr>
-          <w:p>
-            <w:pPr>
-              <w:jc w:val="center"/>
-            </w:pPr>
-            <w:r>
-              <w:rPr>
-                <w:rFonts w:ascii="Arial" w:cs="Arial" w:eastAsia="Arial" w:hAnsi="Arial"/>
-                <w:b/>
-                <w:bCs/>
-                <w:color w:val="000000"/>
-                <w:sz w:val="15"/>
-                <w:szCs w:val="15"/>
-              </w:rPr>
-              <w:t xml:space="preserve">Colegio Químico Farmacéutico de Lambayeque</w:t>
+              </w:rPr>
+              <w:t xml:space="preserve">≈ 225</w:t>
+            </w:r>
+          </w:p>
+        </w:tc>
+        <w:tc>
+          <w:tcPr>
+            <w:tcW w:type="dxa" w:w="3200"/>
+            <w:tcBorders>
+              <w:top w:val="single" w:color="000000" w:sz="4"/>
+              <w:left w:val="single" w:color="000000" w:sz="4"/>
+              <w:bottom w:val="single" w:color="000000" w:sz="4"/>
+              <w:right w:val="single" w:color="000000" w:sz="4"/>
+            </w:tcBorders>
+            <w:tcMar>
+              <w:top w:type="dxa" w:w="20"/>
+              <w:left w:type="dxa" w:w="60"/>
+              <w:bottom w:type="dxa" w:w="20"/>
+              <w:right w:type="dxa" w:w="60"/>
+            </w:tcMar>
+            <w:vAlign w:val="center"/>
+          </w:tcPr>
+          <w:p>
+            <w:pPr>
+              <w:jc w:val="center"/>
+            </w:pPr>
+            <w:r>
+              <w:rPr>
+                <w:rFonts w:ascii="Arial" w:cs="Arial" w:eastAsia="Arial" w:hAnsi="Arial"/>
+                <w:b/>
+                <w:bCs/>
+                <w:color w:val="000000"/>
+                <w:sz w:val="15"/>
+                <w:szCs w:val="15"/>
+              </w:rPr>
+              <w:t xml:space="preserve">4 982 nacionales × 4,5 % regional</w:t>
+            </w:r>
+          </w:p>
+        </w:tc>
+      </w:tr>
+      <w:tr>
+        <w:trPr>
+          <w:cantSplit/>
+        </w:trPr>
+        <w:tc>
+          <w:tcPr>
+            <w:tcW w:type="dxa" w:w="3900"/>
+            <w:tcBorders>
+              <w:top w:val="single" w:color="000000" w:sz="4"/>
+              <w:left w:val="single" w:color="000000" w:sz="4"/>
+              <w:bottom w:val="single" w:color="000000" w:sz="4"/>
+              <w:right w:val="single" w:color="000000" w:sz="4"/>
+            </w:tcBorders>
+            <w:tcMar>
+              <w:top w:type="dxa" w:w="20"/>
+              <w:left w:type="dxa" w:w="60"/>
+              <w:bottom w:type="dxa" w:w="20"/>
+              <w:right w:type="dxa" w:w="60"/>
+            </w:tcMar>
+            <w:vAlign w:val="center"/>
+          </w:tcPr>
+          <w:p>
+            <w:pPr>
+              <w:jc w:val="left"/>
+            </w:pPr>
+            <w:r>
+              <w:rPr>
+                <w:rFonts w:ascii="Arial" w:cs="Arial" w:eastAsia="Arial" w:hAnsi="Arial"/>
+                <w:b/>
+                <w:bCs/>
+                <w:color w:val="000000"/>
+                <w:sz w:val="15"/>
+                <w:szCs w:val="15"/>
+              </w:rPr>
+              <w:t xml:space="preserve">Incremento neto anual de colegiados</w:t>
+            </w:r>
+          </w:p>
+        </w:tc>
+        <w:tc>
+          <w:tcPr>
+            <w:tcW w:type="dxa" w:w="1100"/>
+            <w:tcBorders>
+              <w:top w:val="single" w:color="000000" w:sz="4"/>
+              <w:left w:val="single" w:color="000000" w:sz="4"/>
+              <w:bottom w:val="single" w:color="000000" w:sz="4"/>
+              <w:right w:val="single" w:color="000000" w:sz="4"/>
+            </w:tcBorders>
+            <w:tcMar>
+              <w:top w:type="dxa" w:w="20"/>
+              <w:left w:type="dxa" w:w="60"/>
+              <w:bottom w:type="dxa" w:w="20"/>
+              <w:right w:type="dxa" w:w="60"/>
+            </w:tcMar>
+            <w:vAlign w:val="center"/>
+          </w:tcPr>
+          <w:p>
+            <w:pPr>
+              <w:jc w:val="center"/>
+            </w:pPr>
+            <w:r>
+              <w:rPr>
+                <w:rFonts w:ascii="Arial" w:cs="Arial" w:eastAsia="Arial" w:hAnsi="Arial"/>
+                <w:b/>
+                <w:bCs/>
+                <w:color w:val="000000"/>
+                <w:sz w:val="15"/>
+                <w:szCs w:val="15"/>
+              </w:rPr>
+              <w:t xml:space="preserve">135</w:t>
+            </w:r>
+          </w:p>
+        </w:tc>
+        <w:tc>
+          <w:tcPr>
+            <w:tcW w:type="dxa" w:w="3200"/>
+            <w:tcBorders>
+              <w:top w:val="single" w:color="000000" w:sz="4"/>
+              <w:left w:val="single" w:color="000000" w:sz="4"/>
+              <w:bottom w:val="single" w:color="000000" w:sz="4"/>
+              <w:right w:val="single" w:color="000000" w:sz="4"/>
+            </w:tcBorders>
+            <w:tcMar>
+              <w:top w:type="dxa" w:w="20"/>
+              <w:left w:type="dxa" w:w="60"/>
+              <w:bottom w:type="dxa" w:w="20"/>
+              <w:right w:type="dxa" w:w="60"/>
+            </w:tcMar>
+            <w:vAlign w:val="center"/>
+          </w:tcPr>
+          <w:p>
+            <w:pPr>
+              <w:jc w:val="center"/>
+            </w:pPr>
+            <w:r>
+              <w:rPr>
+                <w:rFonts w:ascii="Arial" w:cs="Arial" w:eastAsia="Arial" w:hAnsi="Arial"/>
+                <w:b/>
+                <w:bCs/>
+                <w:color w:val="000000"/>
+                <w:sz w:val="15"/>
+                <w:szCs w:val="15"/>
+              </w:rPr>
+              <w:t xml:space="preserve">167 nuevos + 50 ingresos − 82 traslados</w:t>
             </w:r>
           </w:p>
         </w:tc>
@@ -10768,7 +11817,7 @@
           <w:sz w:val="14"/>
           <w:szCs w:val="14"/>
         </w:rPr>
-        <w:t xml:space="preserve">Fuente: elaboración propia con datos de DIGEMID (2025). No incluye droguerías, laboratorios, farmacias de clínicas ni plazas del sector público.</w:t>
+        <w:t xml:space="preserve">Fuente: elaboración propia con datos de DIGEMID (2025-2026) y del CQFD Lambayeque. No incluye plazas del sector público, hospitales, laboratorios clínicos ni industria.</w:t>
       </w:r>
     </w:p>
     <w:p>
@@ -10800,7 +11849,7 @@
           <w:sz w:val="24"/>
           <w:szCs w:val="24"/>
         </w:rPr>
-        <w:t xml:space="preserve">, de los cuales 1 525 serían de naturaleza permanente; los profesionales universitarios abarcarían el 14,8 % de esta demanda. </w:t>
+        <w:t xml:space="preserve">, y </w:t>
       </w:r>
       <w:r>
         <w:rPr>
@@ -10818,7 +11867,7 @@
           <w:sz w:val="24"/>
           <w:szCs w:val="24"/>
         </w:rPr>
-        <w:t xml:space="preserve"> en la región (MTPE, 2024, pp. v y 15). Esta demanda técnica está ligada a la de Químicos Farmacéuticos, pues cada establecimiento que incorpora técnicos en farmacia requiere un QF responsable. </w:t>
+        <w:t xml:space="preserve"> en la región (MTPE, Demanda de ocupaciones en Lambayeque 2024, pp. v y 15). Para 2025, la demanda se eleva a </w:t>
       </w:r>
       <w:r>
         <w:rPr>
@@ -10827,17 +11876,16 @@
           <w:bCs/>
           <w:sz w:val="24"/>
           <w:szCs w:val="24"/>
-          <w:shd w:fill="FFFF00" w:color="auto" w:val="clear"/>
-        </w:rPr>
-        <w:t xml:space="preserve">[DATO PENDIENTE]</w:t>
-      </w:r>
-      <w:r>
-        <w:rPr>
-          <w:rFonts w:ascii="Calibri" w:cs="Calibri" w:eastAsia="Calibri" w:hAnsi="Calibri"/>
-          <w:sz w:val="24"/>
-          <w:szCs w:val="24"/>
-        </w:rPr>
-        <w:t xml:space="preserve"> Brecha de Químicos Farmacéuticos por 10 000 habitantes (MINSA – INFORHUS).</w:t>
+        </w:rPr>
+        <w:t xml:space="preserve">32 685 nuevos puestos de trabajo</w:t>
+      </w:r>
+      <w:r>
+        <w:rPr>
+          <w:rFonts w:ascii="Calibri" w:cs="Calibri" w:eastAsia="Calibri" w:hAnsi="Calibri"/>
+          <w:sz w:val="24"/>
+          <w:szCs w:val="24"/>
+        </w:rPr>
+        <w:t xml:space="preserve">, de los cuales el 12,3 % (4 011) requeriría profesionales universitarios (MTPE, Demanda de ocupaciones 2025; OSEL, 2025, p. 44). Como se indicó en la sección 5.1.1, el portal Mi Carrera del MTPE ubica a Farmacia en el sexto lugar entre las familias de carreras universitarias más demandadas en Lambayeque.</w:t>
       </w:r>
     </w:p>
     <w:p>
@@ -10851,7 +11899,7 @@
           <w:sz w:val="24"/>
           <w:szCs w:val="24"/>
         </w:rPr>
-        <w:t xml:space="preserve">De lo expuesto se observa que la mayor demanda corresponde a Químicos Farmacéuticos para la dirección técnica de establecimientos farmacéuticos, con alrededor de 260 nuevos establecimientos por año en la región, a los que se suman las plazas en hospitales, clínicas y laboratorios.</w:t>
+        <w:t xml:space="preserve">De lo expuesto se observa que la mayor demanda corresponde a Químicos Farmacéuticos para la dirección técnica de establecimientos farmacéuticos: la región necesitaría al menos 768 profesionales adicionales solo para cubrir los establecimientos existentes, y cada año se abren alrededor de 225 nuevos establecimientos, frente a un incremento neto de apenas 135 colegiados. A ello se suman las plazas en hospitales, clínicas, laboratorios clínicos y agroindustria.</w:t>
       </w:r>
     </w:p>
     <w:p>
@@ -10925,7 +11973,7 @@
           <w:sz w:val="24"/>
           <w:szCs w:val="24"/>
         </w:rPr>
-        <w:t xml:space="preserve">Desigualdad territorial: la pobreza en Ferreñafe (46,7 %) y Lambayeque (31,4 %) supera ampliamente la de Chiclayo (17,8 %); en 2025 cuatro distritos de la región no contaban con ninguna botica o farmacia privada (DIGEMID).</w:t>
+        <w:t xml:space="preserve">Desigualdad territorial: la pobreza en Ferreñafe (46,7 %) y Lambayeque (31,4 %) supera ampliamente la de Chiclayo (17,8 %); en junio de 2026 dos distritos de la región no contaban con ninguna botica o farmacia privada (DIGEMID).</w:t>
       </w:r>
     </w:p>
     <w:p>
@@ -10963,7 +12011,26 @@
           <w:sz w:val="24"/>
           <w:szCs w:val="24"/>
         </w:rPr>
-        <w:t xml:space="preserve">Baja proporción de profesionales: solo el 13,9 % de la PEA ocupada tiene educación universitaria (MTPE, 2022).</w:t>
+        <w:t xml:space="preserve">Baja proporción de profesionales: solo el 13,9 % de la PEA ocupada tiene educación universitaria (MTPE, 2022) y la región tiene alrededor de 6 Químicos Farmacéuticos por cada 10 000 habitantes (CQFD Lambayeque).</w:t>
+      </w:r>
+    </w:p>
+    <w:p>
+      <w:pPr>
+        <w:pStyle w:val="ListParagraph"/>
+        <w:numPr>
+          <w:ilvl w:val="0"/>
+          <w:numId w:val="2"/>
+        </w:numPr>
+        <w:spacing w:after="80" w:line="360"/>
+        <w:jc w:val="both"/>
+      </w:pPr>
+      <w:r>
+        <w:rPr>
+          <w:rFonts w:ascii="Calibri" w:cs="Calibri" w:eastAsia="Calibri" w:hAnsi="Calibri"/>
+          <w:sz w:val="24"/>
+          <w:szCs w:val="24"/>
+        </w:rPr>
+        <w:t xml:space="preserve">Jóvenes sin oportunidades: 65 097 jóvenes (19,7 %) no estudian ni trabajan, cuarto lugar nacional (OSEL, 2025); los jóvenes con educación universitaria perciben en promedio S/ 1 506 mensuales frente a S/ 1 121 de quienes solo tienen secundaria (EPEN 2024).</w:t>
       </w:r>
     </w:p>
     <w:p>
@@ -11026,7 +12093,7 @@
           <w:sz w:val="24"/>
           <w:szCs w:val="24"/>
         </w:rPr>
-        <w:t xml:space="preserve">, y el 84,0 % de ellas son informales (PRODUCE, p. 1). El comercio minorista de productos farmacéuticos, con 1 334 boticas independientes, es uno de los rubros con mayor número de establecimientos. El Químico Farmacéutico contribuye a la gestión técnico-sanitaria de boticas, farmacias y droguerías (Buenas Prácticas de Almacenamiento, Dispensación y Farmacovigilancia; gestión de inventarios y cadena de frío; cumplimiento normativo ante DIGEMID y la GERESA), a la formalización del sector y, en el sector público, a la gestión del suministro de medicamentos en redes y hospitales (SISMED), los comités farmacoterapéuticos y el uso racional de antimicrobianos.</w:t>
+        <w:t xml:space="preserve">, y el 84,0 % de ellas son informales (PRODUCE, p. 1). El comercio minorista de productos farmacéuticos, con 1 255 boticas y farmacias independientes (DIGEMID, junio 2026), es uno de los rubros con mayor número de establecimientos. El Químico Farmacéutico contribuye a la gestión técnico-sanitaria de boticas, farmacias y droguerías (Buenas Prácticas de Almacenamiento, Dispensación y Farmacovigilancia; gestión de inventarios y cadena de frío; cumplimiento normativo ante DIGEMID y la GERESA), a la formalización del sector y, en el sector público, a la gestión del suministro de medicamentos en redes y hospitales (SISMED), los comités farmacoterapéuticos y el uso racional de antimicrobianos.</w:t>
       </w:r>
     </w:p>
     <w:p>
@@ -11821,7 +12888,7 @@
           <w:sz w:val="24"/>
           <w:szCs w:val="24"/>
         </w:rPr>
-        <w:t xml:space="preserve">De las universidades y programas de formación universitaria en el departamento de Lambayeque, la única universidad licenciada identificada con Farmacia y Bioquímica es la UTP en Chiclayo, que abrió la carrera recién en 2025 (240 ingresantes en todas sus sedes); la UNPRG no ofrece la carrera </w:t>
+        <w:t xml:space="preserve">De las universidades y programas de formación universitaria en el departamento de Lambayeque, existen 6 universidades licenciadas (UNPRG, USAT, USS, UCV, UTP y USMP) con más de 125 programas de estudio y 96 355 matriculados en 2023; la </w:t>
       </w:r>
       <w:r>
         <w:rPr>
@@ -11830,17 +12897,16 @@
           <w:bCs/>
           <w:sz w:val="24"/>
           <w:szCs w:val="24"/>
-          <w:shd w:fill="FFFF00" w:color="auto" w:val="clear"/>
-        </w:rPr>
-        <w:t xml:space="preserve">[VERIFICAR]</w:t>
-      </w:r>
-      <w:r>
-        <w:rPr>
-          <w:rFonts w:ascii="Calibri" w:cs="Calibri" w:eastAsia="Calibri" w:hAnsi="Calibri"/>
-          <w:sz w:val="24"/>
-          <w:szCs w:val="24"/>
-        </w:rPr>
-        <w:t xml:space="preserve">. Las universidades que ofrecían la carrera sin licencia (Universidad de Chiclayo) o que operaban en la región sin licencia (Universidad de Lambayeque y Universidad Juan Mejía Baca) se encuentran en cese, lo que deja una demanda regional desatendida y estudiantes que se trasladan a otras ciudades.</w:t>
+        </w:rPr>
+        <w:t xml:space="preserve">USS es la universidad con mayor matrícula de la región (37 517 estudiantes en 2023)</w:t>
+      </w:r>
+      <w:r>
+        <w:rPr>
+          <w:rFonts w:ascii="Calibri" w:cs="Calibri" w:eastAsia="Calibri" w:hAnsi="Calibri"/>
+          <w:sz w:val="24"/>
+          <w:szCs w:val="24"/>
+        </w:rPr>
+        <w:t xml:space="preserve"> (INEI, Compendio Estadístico Lambayeque 2024, en OSEL 2025, pp. 47-49). La única universidad licenciada identificada con Farmacia y Bioquímica es la UTP en Chiclayo, que abrió la carrera recién en 2025 (240 ingresantes en todas sus sedes); la UNPRG no la ofrece. Las universidades que ofrecían la carrera sin licencia (Universidad de Chiclayo) o que operaban en la región sin licencia (Universidad de Lambayeque y Universidad Juan Mejía Baca) se encuentran en cese, lo que deja una demanda regional desatendida y estudiantes que se trasladan a otras ciudades.</w:t>
       </w:r>
     </w:p>
     <w:p>
@@ -16460,7 +17526,7 @@
           <w:sz w:val="24"/>
           <w:szCs w:val="24"/>
         </w:rPr>
-        <w:t xml:space="preserve">El presente informe técnico sustenta la pertinencia de crear el programa de estudios de Farmacia y Bioquímica en la región Lambayeque (Chiclayo). La exigencia legal de un Químico Farmacéutico en cada uno de los 1 530 establecimientos farmacéuticos privados de la región (y en los cerca de 260 que se abren cada año), la expansión hospitalaria de EsSalud, la demanda de diagnóstico analítico y control agroindustrial, la carga de enfermedad regional y el comercio ilegal de medicamentos generan una demanda estructural de estos profesionales, mientras que la oferta licenciada en la región es muy reducida tras el cese de universidades no licenciadas de Chiclayo.</w:t>
+        <w:t xml:space="preserve">El presente informe técnico sustenta la pertinencia de crear el programa de estudios de Farmacia y Bioquímica en la región Lambayeque (Chiclayo). La exigencia legal de un Químico Farmacéutico en cada uno de los 1 580 establecimientos farmacéuticos privados de la región, frente a solo 812 profesionales colegiados (y cerca de 225 establecimientos nuevos por año), la expansión hospitalaria de EsSalud, la demanda de diagnóstico analítico y control agroindustrial, la carga de enfermedad regional y el comercio ilegal de medicamentos generan una demanda estructural de estos profesionales, mientras que la oferta licenciada en la región es muy reducida tras el cese de universidades no licenciadas de Chiclayo.</w:t>
       </w:r>
     </w:p>
     <w:p>
@@ -16713,6 +17779,101 @@
           <w:szCs w:val="24"/>
         </w:rPr>
         <w:t xml:space="preserve">UTP (2025). Postulantes, ingresantes, matriculados y egresados pregrado 2022-2025 (datos al 31.10.2025).</w:t>
+      </w:r>
+    </w:p>
+    <w:p>
+      <w:pPr>
+        <w:pStyle w:val="ListParagraph"/>
+        <w:numPr>
+          <w:ilvl w:val="0"/>
+          <w:numId w:val="2"/>
+        </w:numPr>
+        <w:spacing w:after="80" w:line="360"/>
+        <w:jc w:val="both"/>
+      </w:pPr>
+      <w:r>
+        <w:rPr>
+          <w:rFonts w:ascii="Calibri" w:cs="Calibri" w:eastAsia="Calibri" w:hAnsi="Calibri"/>
+          <w:sz w:val="24"/>
+          <w:szCs w:val="24"/>
+        </w:rPr>
+        <w:t xml:space="preserve">DIGEMID – MINSA (2026). Boletín de Establecimientos Farmacéuticos, Año 6, Edición 11 (junio 2026).</w:t>
+      </w:r>
+    </w:p>
+    <w:p>
+      <w:pPr>
+        <w:pStyle w:val="ListParagraph"/>
+        <w:numPr>
+          <w:ilvl w:val="0"/>
+          <w:numId w:val="2"/>
+        </w:numPr>
+        <w:spacing w:after="80" w:line="360"/>
+        <w:jc w:val="both"/>
+      </w:pPr>
+      <w:r>
+        <w:rPr>
+          <w:rFonts w:ascii="Calibri" w:cs="Calibri" w:eastAsia="Calibri" w:hAnsi="Calibri"/>
+          <w:sz w:val="24"/>
+          <w:szCs w:val="24"/>
+        </w:rPr>
+        <w:t xml:space="preserve">GRTPE Lambayeque – OSEL (2025). Estudio N° 01: Mercado laboral de los jóvenes en la región Lambayeque.</w:t>
+      </w:r>
+    </w:p>
+    <w:p>
+      <w:pPr>
+        <w:pStyle w:val="ListParagraph"/>
+        <w:numPr>
+          <w:ilvl w:val="0"/>
+          <w:numId w:val="2"/>
+        </w:numPr>
+        <w:spacing w:after="80" w:line="360"/>
+        <w:jc w:val="both"/>
+      </w:pPr>
+      <w:r>
+        <w:rPr>
+          <w:rFonts w:ascii="Calibri" w:cs="Calibri" w:eastAsia="Calibri" w:hAnsi="Calibri"/>
+          <w:sz w:val="24"/>
+          <w:szCs w:val="24"/>
+        </w:rPr>
+        <w:t xml:space="preserve">MTPE (2025). Demanda de ocupaciones 2025 (Encuesta de Demanda Ocupacional 2024).</w:t>
+      </w:r>
+    </w:p>
+    <w:p>
+      <w:pPr>
+        <w:pStyle w:val="ListParagraph"/>
+        <w:numPr>
+          <w:ilvl w:val="0"/>
+          <w:numId w:val="2"/>
+        </w:numPr>
+        <w:spacing w:after="80" w:line="360"/>
+        <w:jc w:val="both"/>
+      </w:pPr>
+      <w:r>
+        <w:rPr>
+          <w:rFonts w:ascii="Calibri" w:cs="Calibri" w:eastAsia="Calibri" w:hAnsi="Calibri"/>
+          <w:sz w:val="24"/>
+          <w:szCs w:val="24"/>
+        </w:rPr>
+        <w:t xml:space="preserve">MTPE. Portal Mi Carrera – Carreras más demandadas (Lambayeque, universidad). micarrera.trabajo.gob.pe.</w:t>
+      </w:r>
+    </w:p>
+    <w:p>
+      <w:pPr>
+        <w:pStyle w:val="ListParagraph"/>
+        <w:numPr>
+          <w:ilvl w:val="0"/>
+          <w:numId w:val="2"/>
+        </w:numPr>
+        <w:spacing w:after="80" w:line="360"/>
+        <w:jc w:val="both"/>
+      </w:pPr>
+      <w:r>
+        <w:rPr>
+          <w:rFonts w:ascii="Calibri" w:cs="Calibri" w:eastAsia="Calibri" w:hAnsi="Calibri"/>
+          <w:sz w:val="24"/>
+          <w:szCs w:val="24"/>
+        </w:rPr>
+        <w:t xml:space="preserve">Colegio Químico Farmacéutico Departamental de Lambayeque. Memoria de Gestión, Consejo Directivo 2023-2024.</w:t>
       </w:r>
     </w:p>
     <w:p>

</xml_diff>

<commit_message>
Add vocational survey instrument and local vocational-study references
New contenido_encuesta.js builds a standalone Word questionnaire (17
questions, n=384 stratified by province) based on the dimensions of the
validated Lambayeque instrument (Villalobos Véliz et al., 2026), with
the effective-interest indicator that will replace the Table 4
scenarios. The report gains section 5.1.1(d) summarizing the local
studies the user found, the INEI 2018 reference (2.6% chose pharmacy-
related technical careers) bounding the scenarios, and an annex.
build.js accepts CONTENIDO and an opts block for checkbox options.

Co-Authored-By: Claude Opus 5.5 <noreply@anthropic.com>
Claude-Session: https://claude.ai/code/session_01XsGhnoXHk7nghX2nJBVJwd
</commit_message>
<xml_diff>
--- a/borradores/Informe_Pertinencia_Farmacia_Bioquimica_Lambayeque.docx
+++ b/borradores/Informe_Pertinencia_Farmacia_Bioquimica_Lambayeque.docx
@@ -6264,7 +6264,7 @@
           <w:sz w:val="14"/>
           <w:szCs w:val="14"/>
         </w:rPr>
-        <w:t xml:space="preserve">Fuente: elaboración propia. Porcentajes de interés supuestos: en el estudio DQE Norte 2025 de Arellano, Medicina concentra el 13 % de las preferencias y Farmacia no figura entre las cinco primeras (&lt; 6 %). Reemplazar por el resultado de la encuesta propia </w:t>
+        <w:t xml:space="preserve">Fuente: elaboración propia. Los escenarios se acotan con dos referencias: a nivel nacional, el 2,6 % de la población de 17 años a más que estudió o estudia educación superior no universitaria eligió carreras relacionadas con Farmacia y Bioquímica en 2018 (INEI, Indicadores de Educación por Departamentos 2008-2018, cap. 5, p. 8); y en el estudio DQE Norte 2025 de Arellano, Medicina concentra el 13 % de las preferencias y Farmacia no figura entre las cinco primeras (&lt; 6 %). Reemplazar por la tasa de interés efectivo de la encuesta propia (Anexo) </w:t>
       </w:r>
       <w:r>
         <w:rPr>
@@ -6539,6 +6539,48 @@
           <w:szCs w:val="24"/>
         </w:rPr>
         <w:t xml:space="preserve"> (técnicos de 1 a 2 años), y a Medicina y Enfermería entre las carreras universitarias más requeridas (MTPE, Demanda de ocupaciones en Lambayeque 2024, pp. 14-15). Esto muestra una demanda sostenida de personal especializado en salud, diagnóstico y gestión de medicamentos, impulsada por la expansión de las redes hospitalarias públicas y privadas en Chiclayo.</w:t>
+      </w:r>
+    </w:p>
+    <w:p>
+      <w:pPr>
+        <w:spacing w:after="120" w:line="360"/>
+        <w:jc w:val="both"/>
+      </w:pPr>
+      <w:r>
+        <w:rPr>
+          <w:rFonts w:ascii="Calibri" w:cs="Calibri" w:eastAsia="Calibri" w:hAnsi="Calibri"/>
+          <w:b/>
+          <w:bCs/>
+          <w:sz w:val="24"/>
+          <w:szCs w:val="24"/>
+        </w:rPr>
+        <w:t xml:space="preserve">d) Estudios de orientación vocacional en Lambayeque.</w:t>
+      </w:r>
+      <w:r>
+        <w:rPr>
+          <w:rFonts w:ascii="Calibri" w:cs="Calibri" w:eastAsia="Calibri" w:hAnsi="Calibri"/>
+          <w:sz w:val="24"/>
+          <w:szCs w:val="24"/>
+        </w:rPr>
+        <w:t xml:space="preserve"> Investigaciones recientes con escolares de la región describen el proceso de elección de carrera: un cuestionario de 27 ítems diseñado y validado para estudiantes de secundaria de Lambayeque, con tres dimensiones (factores personales, de agencia o capacidad de decisión y ambientales), V de Aiken = 1,00 y alfa de Cronbach = 0,904 (Villalobos Véliz et al., 2026, Areté 12(23)); una encuesta a estudiantes de quinto de secundaria de 15 a 17 años de colegios urbanos de Lambayeque (universo de 248 estudiantes; Revista EPT, USS); una encuesta en la I.E.P. Santa Lucía de Lambayeque sobre los factores de elección profesional (Repositorio USS); y un estudio con 31 estudiantes de quinto de secundaria de Chiclayo (Repositorio UPC). Además, la Gerencia Regional de Educación implementó la plataforma "Mi Carrera en tu Cole" para estudiantes de cuarto y quinto de secundaria. Estos estudios coinciden en que la elección de carrera depende de factores personales, familiares y económicos, y en que la orientación vocacional en los colegios es limitada; sin embargo, </w:t>
+      </w:r>
+      <w:r>
+        <w:rPr>
+          <w:rFonts w:ascii="Calibri" w:cs="Calibri" w:eastAsia="Calibri" w:hAnsi="Calibri"/>
+          <w:b/>
+          <w:bCs/>
+          <w:sz w:val="24"/>
+          <w:szCs w:val="24"/>
+        </w:rPr>
+        <w:t xml:space="preserve">ninguno reporta el porcentaje de escolares interesados en Farmacia y Bioquímica</w:t>
+      </w:r>
+      <w:r>
+        <w:rPr>
+          <w:rFonts w:ascii="Calibri" w:cs="Calibri" w:eastAsia="Calibri" w:hAnsi="Calibri"/>
+          <w:sz w:val="24"/>
+          <w:szCs w:val="24"/>
+        </w:rPr>
+        <w:t xml:space="preserve">. Por ello, se propone aplicar una encuesta propia de intención vocacional (Anexo), basada en las dimensiones del instrumento validado, cuyo resultado reemplazará los escenarios de la Tabla 4.</w:t>
       </w:r>
     </w:p>
     <w:p>
@@ -17588,6 +17630,425 @@
           <w:sz w:val="28"/>
           <w:szCs w:val="28"/>
         </w:rPr>
+        <w:t xml:space="preserve">ANEXO. ENCUESTA DE INTENCIÓN VOCACIONAL</w:t>
+      </w:r>
+    </w:p>
+    <w:p>
+      <w:pPr>
+        <w:spacing w:after="120" w:line="360"/>
+        <w:jc w:val="both"/>
+      </w:pPr>
+      <w:r>
+        <w:rPr>
+          <w:rFonts w:ascii="Calibri" w:cs="Calibri" w:eastAsia="Calibri" w:hAnsi="Calibri"/>
+          <w:sz w:val="24"/>
+          <w:szCs w:val="24"/>
+        </w:rPr>
+        <w:t xml:space="preserve">Para validar la demanda educativa se propone aplicar una encuesta a estudiantes de 4.° y 5.° de secundaria de la región (documento anexo: Encuesta_Intencion_Vocacional_Farmacia_Lambayeque.docx). Sus características principales son:</w:t>
+      </w:r>
+    </w:p>
+    <w:tbl>
+      <w:tblPr>
+        <w:tblW w:type="dxa" w:w="8400"/>
+        <w:jc w:val="center"/>
+        <w:tblBorders>
+          <w:top w:val="single" w:color="auto" w:sz="4"/>
+          <w:left w:val="single" w:color="auto" w:sz="4"/>
+          <w:bottom w:val="single" w:color="auto" w:sz="4"/>
+          <w:right w:val="single" w:color="auto" w:sz="4"/>
+          <w:insideH w:val="single" w:color="auto" w:sz="4"/>
+          <w:insideV w:val="single" w:color="auto" w:sz="4"/>
+        </w:tblBorders>
+      </w:tblPr>
+      <w:tblGrid>
+        <w:gridCol w:w="2400"/>
+        <w:gridCol w:w="6000"/>
+      </w:tblGrid>
+      <w:tr>
+        <w:trPr>
+          <w:tblHeader/>
+        </w:trPr>
+        <w:tc>
+          <w:tcPr>
+            <w:tcW w:type="dxa" w:w="2400"/>
+            <w:tcBorders>
+              <w:top w:val="single" w:color="000000" w:sz="4"/>
+              <w:left w:val="single" w:color="000000" w:sz="4"/>
+              <w:bottom w:val="single" w:color="000000" w:sz="4"/>
+              <w:right w:val="single" w:color="000000" w:sz="4"/>
+            </w:tcBorders>
+            <w:shd w:fill="1F4E2C" w:color="auto" w:val="clear"/>
+            <w:tcMar>
+              <w:top w:type="dxa" w:w="20"/>
+              <w:left w:type="dxa" w:w="60"/>
+              <w:bottom w:type="dxa" w:w="20"/>
+              <w:right w:type="dxa" w:w="60"/>
+            </w:tcMar>
+            <w:vAlign w:val="center"/>
+          </w:tcPr>
+          <w:p>
+            <w:pPr>
+              <w:jc w:val="center"/>
+            </w:pPr>
+            <w:r>
+              <w:rPr>
+                <w:rFonts w:ascii="Arial" w:cs="Arial" w:eastAsia="Arial" w:hAnsi="Arial"/>
+                <w:b/>
+                <w:bCs/>
+                <w:color w:val="FFFFFF"/>
+                <w:sz w:val="15"/>
+                <w:szCs w:val="15"/>
+              </w:rPr>
+              <w:t xml:space="preserve">Elemento</w:t>
+            </w:r>
+          </w:p>
+        </w:tc>
+        <w:tc>
+          <w:tcPr>
+            <w:tcW w:type="dxa" w:w="6000"/>
+            <w:tcBorders>
+              <w:top w:val="single" w:color="000000" w:sz="4"/>
+              <w:left w:val="single" w:color="000000" w:sz="4"/>
+              <w:bottom w:val="single" w:color="000000" w:sz="4"/>
+              <w:right w:val="single" w:color="000000" w:sz="4"/>
+            </w:tcBorders>
+            <w:shd w:fill="1F4E2C" w:color="auto" w:val="clear"/>
+            <w:tcMar>
+              <w:top w:type="dxa" w:w="20"/>
+              <w:left w:type="dxa" w:w="60"/>
+              <w:bottom w:type="dxa" w:w="20"/>
+              <w:right w:type="dxa" w:w="60"/>
+            </w:tcMar>
+            <w:vAlign w:val="center"/>
+          </w:tcPr>
+          <w:p>
+            <w:pPr>
+              <w:jc w:val="center"/>
+            </w:pPr>
+            <w:r>
+              <w:rPr>
+                <w:rFonts w:ascii="Arial" w:cs="Arial" w:eastAsia="Arial" w:hAnsi="Arial"/>
+                <w:b/>
+                <w:bCs/>
+                <w:color w:val="FFFFFF"/>
+                <w:sz w:val="15"/>
+                <w:szCs w:val="15"/>
+              </w:rPr>
+              <w:t xml:space="preserve">Descripción</w:t>
+            </w:r>
+          </w:p>
+        </w:tc>
+      </w:tr>
+      <w:tr>
+        <w:trPr>
+          <w:cantSplit/>
+        </w:trPr>
+        <w:tc>
+          <w:tcPr>
+            <w:tcW w:type="dxa" w:w="2400"/>
+            <w:tcBorders>
+              <w:top w:val="single" w:color="000000" w:sz="4"/>
+              <w:left w:val="single" w:color="000000" w:sz="4"/>
+              <w:bottom w:val="single" w:color="000000" w:sz="4"/>
+              <w:right w:val="single" w:color="000000" w:sz="4"/>
+            </w:tcBorders>
+            <w:tcMar>
+              <w:top w:type="dxa" w:w="20"/>
+              <w:left w:type="dxa" w:w="60"/>
+              <w:bottom w:type="dxa" w:w="20"/>
+              <w:right w:type="dxa" w:w="60"/>
+            </w:tcMar>
+            <w:vAlign w:val="center"/>
+          </w:tcPr>
+          <w:p>
+            <w:pPr>
+              <w:jc w:val="left"/>
+            </w:pPr>
+            <w:r>
+              <w:rPr>
+                <w:rFonts w:ascii="Arial" w:cs="Arial" w:eastAsia="Arial" w:hAnsi="Arial"/>
+                <w:b/>
+                <w:bCs/>
+                <w:color w:val="000000"/>
+                <w:sz w:val="15"/>
+                <w:szCs w:val="15"/>
+              </w:rPr>
+              <w:t xml:space="preserve">Muestra</w:t>
+            </w:r>
+          </w:p>
+        </w:tc>
+        <w:tc>
+          <w:tcPr>
+            <w:tcW w:type="dxa" w:w="6000"/>
+            <w:tcBorders>
+              <w:top w:val="single" w:color="000000" w:sz="4"/>
+              <w:left w:val="single" w:color="000000" w:sz="4"/>
+              <w:bottom w:val="single" w:color="000000" w:sz="4"/>
+              <w:right w:val="single" w:color="000000" w:sz="4"/>
+            </w:tcBorders>
+            <w:tcMar>
+              <w:top w:type="dxa" w:w="20"/>
+              <w:left w:type="dxa" w:w="60"/>
+              <w:bottom w:type="dxa" w:w="20"/>
+              <w:right w:type="dxa" w:w="60"/>
+            </w:tcMar>
+            <w:vAlign w:val="center"/>
+          </w:tcPr>
+          <w:p>
+            <w:pPr>
+              <w:jc w:val="center"/>
+            </w:pPr>
+            <w:r>
+              <w:rPr>
+                <w:rFonts w:ascii="Arial" w:cs="Arial" w:eastAsia="Arial" w:hAnsi="Arial"/>
+                <w:b/>
+                <w:bCs/>
+                <w:color w:val="000000"/>
+                <w:sz w:val="15"/>
+                <w:szCs w:val="15"/>
+              </w:rPr>
+              <w:t xml:space="preserve">384 estudiantes (95 % de confianza, ±5 % de error), más 10 % por no respuesta: 423 encuestas</w:t>
+            </w:r>
+          </w:p>
+        </w:tc>
+      </w:tr>
+      <w:tr>
+        <w:trPr>
+          <w:cantSplit/>
+        </w:trPr>
+        <w:tc>
+          <w:tcPr>
+            <w:tcW w:type="dxa" w:w="2400"/>
+            <w:tcBorders>
+              <w:top w:val="single" w:color="000000" w:sz="4"/>
+              <w:left w:val="single" w:color="000000" w:sz="4"/>
+              <w:bottom w:val="single" w:color="000000" w:sz="4"/>
+              <w:right w:val="single" w:color="000000" w:sz="4"/>
+            </w:tcBorders>
+            <w:tcMar>
+              <w:top w:type="dxa" w:w="20"/>
+              <w:left w:type="dxa" w:w="60"/>
+              <w:bottom w:type="dxa" w:w="20"/>
+              <w:right w:type="dxa" w:w="60"/>
+            </w:tcMar>
+            <w:vAlign w:val="center"/>
+          </w:tcPr>
+          <w:p>
+            <w:pPr>
+              <w:jc w:val="left"/>
+            </w:pPr>
+            <w:r>
+              <w:rPr>
+                <w:rFonts w:ascii="Arial" w:cs="Arial" w:eastAsia="Arial" w:hAnsi="Arial"/>
+                <w:b/>
+                <w:bCs/>
+                <w:color w:val="000000"/>
+                <w:sz w:val="15"/>
+                <w:szCs w:val="15"/>
+              </w:rPr>
+              <w:t xml:space="preserve">Distribución por provincia</w:t>
+            </w:r>
+          </w:p>
+        </w:tc>
+        <w:tc>
+          <w:tcPr>
+            <w:tcW w:type="dxa" w:w="6000"/>
+            <w:tcBorders>
+              <w:top w:val="single" w:color="000000" w:sz="4"/>
+              <w:left w:val="single" w:color="000000" w:sz="4"/>
+              <w:bottom w:val="single" w:color="000000" w:sz="4"/>
+              <w:right w:val="single" w:color="000000" w:sz="4"/>
+            </w:tcBorders>
+            <w:tcMar>
+              <w:top w:type="dxa" w:w="20"/>
+              <w:left w:type="dxa" w:w="60"/>
+              <w:bottom w:type="dxa" w:w="20"/>
+              <w:right w:type="dxa" w:w="60"/>
+            </w:tcMar>
+            <w:vAlign w:val="center"/>
+          </w:tcPr>
+          <w:p>
+            <w:pPr>
+              <w:jc w:val="center"/>
+            </w:pPr>
+            <w:r>
+              <w:rPr>
+                <w:rFonts w:ascii="Arial" w:cs="Arial" w:eastAsia="Arial" w:hAnsi="Arial"/>
+                <w:b/>
+                <w:bCs/>
+                <w:color w:val="000000"/>
+                <w:sz w:val="15"/>
+                <w:szCs w:val="15"/>
+              </w:rPr>
+              <w:t xml:space="preserve">Chiclayo 259, Lambayeque 97 y Ferreñafe 28 (proporcional a la población joven, Censo 2017)</w:t>
+            </w:r>
+          </w:p>
+        </w:tc>
+      </w:tr>
+      <w:tr>
+        <w:trPr>
+          <w:cantSplit/>
+        </w:trPr>
+        <w:tc>
+          <w:tcPr>
+            <w:tcW w:type="dxa" w:w="2400"/>
+            <w:tcBorders>
+              <w:top w:val="single" w:color="000000" w:sz="4"/>
+              <w:left w:val="single" w:color="000000" w:sz="4"/>
+              <w:bottom w:val="single" w:color="000000" w:sz="4"/>
+              <w:right w:val="single" w:color="000000" w:sz="4"/>
+            </w:tcBorders>
+            <w:tcMar>
+              <w:top w:type="dxa" w:w="20"/>
+              <w:left w:type="dxa" w:w="60"/>
+              <w:bottom w:type="dxa" w:w="20"/>
+              <w:right w:type="dxa" w:w="60"/>
+            </w:tcMar>
+            <w:vAlign w:val="center"/>
+          </w:tcPr>
+          <w:p>
+            <w:pPr>
+              <w:jc w:val="left"/>
+            </w:pPr>
+            <w:r>
+              <w:rPr>
+                <w:rFonts w:ascii="Arial" w:cs="Arial" w:eastAsia="Arial" w:hAnsi="Arial"/>
+                <w:b/>
+                <w:bCs/>
+                <w:color w:val="000000"/>
+                <w:sz w:val="15"/>
+                <w:szCs w:val="15"/>
+              </w:rPr>
+              <w:t xml:space="preserve">Contenido</w:t>
+            </w:r>
+          </w:p>
+        </w:tc>
+        <w:tc>
+          <w:tcPr>
+            <w:tcW w:type="dxa" w:w="6000"/>
+            <w:tcBorders>
+              <w:top w:val="single" w:color="000000" w:sz="4"/>
+              <w:left w:val="single" w:color="000000" w:sz="4"/>
+              <w:bottom w:val="single" w:color="000000" w:sz="4"/>
+              <w:right w:val="single" w:color="000000" w:sz="4"/>
+            </w:tcBorders>
+            <w:tcMar>
+              <w:top w:type="dxa" w:w="20"/>
+              <w:left w:type="dxa" w:w="60"/>
+              <w:bottom w:type="dxa" w:w="20"/>
+              <w:right w:type="dxa" w:w="60"/>
+            </w:tcMar>
+            <w:vAlign w:val="center"/>
+          </w:tcPr>
+          <w:p>
+            <w:pPr>
+              <w:jc w:val="center"/>
+            </w:pPr>
+            <w:r>
+              <w:rPr>
+                <w:rFonts w:ascii="Arial" w:cs="Arial" w:eastAsia="Arial" w:hAnsi="Arial"/>
+                <w:b/>
+                <w:bCs/>
+                <w:color w:val="000000"/>
+                <w:sz w:val="15"/>
+                <w:szCs w:val="15"/>
+              </w:rPr>
+              <w:t xml:space="preserve">17 preguntas: datos generales, planes después del colegio, carrera de interés, interés en Farmacia y Bioquímica, factores personales, de agencia y ambientales, y condiciones económicas</w:t>
+            </w:r>
+          </w:p>
+        </w:tc>
+      </w:tr>
+      <w:tr>
+        <w:trPr>
+          <w:cantSplit/>
+        </w:trPr>
+        <w:tc>
+          <w:tcPr>
+            <w:tcW w:type="dxa" w:w="2400"/>
+            <w:tcBorders>
+              <w:top w:val="single" w:color="000000" w:sz="4"/>
+              <w:left w:val="single" w:color="000000" w:sz="4"/>
+              <w:bottom w:val="single" w:color="000000" w:sz="4"/>
+              <w:right w:val="single" w:color="000000" w:sz="4"/>
+            </w:tcBorders>
+            <w:tcMar>
+              <w:top w:type="dxa" w:w="20"/>
+              <w:left w:type="dxa" w:w="60"/>
+              <w:bottom w:type="dxa" w:w="20"/>
+              <w:right w:type="dxa" w:w="60"/>
+            </w:tcMar>
+            <w:vAlign w:val="center"/>
+          </w:tcPr>
+          <w:p>
+            <w:pPr>
+              <w:jc w:val="left"/>
+            </w:pPr>
+            <w:r>
+              <w:rPr>
+                <w:rFonts w:ascii="Arial" w:cs="Arial" w:eastAsia="Arial" w:hAnsi="Arial"/>
+                <w:b/>
+                <w:bCs/>
+                <w:color w:val="000000"/>
+                <w:sz w:val="15"/>
+                <w:szCs w:val="15"/>
+              </w:rPr>
+              <w:t xml:space="preserve">Indicador clave</w:t>
+            </w:r>
+          </w:p>
+        </w:tc>
+        <w:tc>
+          <w:tcPr>
+            <w:tcW w:type="dxa" w:w="6000"/>
+            <w:tcBorders>
+              <w:top w:val="single" w:color="000000" w:sz="4"/>
+              <w:left w:val="single" w:color="000000" w:sz="4"/>
+              <w:bottom w:val="single" w:color="000000" w:sz="4"/>
+              <w:right w:val="single" w:color="000000" w:sz="4"/>
+            </w:tcBorders>
+            <w:tcMar>
+              <w:top w:type="dxa" w:w="20"/>
+              <w:left w:type="dxa" w:w="60"/>
+              <w:bottom w:type="dxa" w:w="20"/>
+              <w:right w:type="dxa" w:w="60"/>
+            </w:tcMar>
+            <w:vAlign w:val="center"/>
+          </w:tcPr>
+          <w:p>
+            <w:pPr>
+              <w:jc w:val="center"/>
+            </w:pPr>
+            <w:r>
+              <w:rPr>
+                <w:rFonts w:ascii="Arial" w:cs="Arial" w:eastAsia="Arial" w:hAnsi="Arial"/>
+                <w:b/>
+                <w:bCs/>
+                <w:color w:val="000000"/>
+                <w:sz w:val="15"/>
+                <w:szCs w:val="15"/>
+              </w:rPr>
+              <w:t xml:space="preserve">Tasa de interés efectivo = % "Definitivamente sí" + 0,5 × % "Probablemente sí" (pregunta 9), que se aplicará a la población objetivo de la Tabla 3</w:t>
+            </w:r>
+          </w:p>
+        </w:tc>
+      </w:tr>
+    </w:tbl>
+    <w:p>
+      <w:pPr>
+        <w:spacing w:after="120"/>
+      </w:pPr>
+    </w:p>
+    <w:p>
+      <w:pPr>
+        <w:keepNext/>
+        <w:spacing w:after="160" w:before="240"/>
+      </w:pPr>
+      <w:r>
+        <w:rPr>
+          <w:rFonts w:ascii="Calibri" w:cs="Calibri" w:eastAsia="Calibri" w:hAnsi="Calibri"/>
+          <w:color w:val="323E4F"/>
+          <w:sz w:val="28"/>
+          <w:szCs w:val="28"/>
+        </w:rPr>
         <w:t xml:space="preserve">REFERENCIAS</w:t>
       </w:r>
     </w:p>
@@ -17874,6 +18335,63 @@
           <w:szCs w:val="24"/>
         </w:rPr>
         <w:t xml:space="preserve">Colegio Químico Farmacéutico Departamental de Lambayeque. Memoria de Gestión, Consejo Directivo 2023-2024.</w:t>
+      </w:r>
+    </w:p>
+    <w:p>
+      <w:pPr>
+        <w:pStyle w:val="ListParagraph"/>
+        <w:numPr>
+          <w:ilvl w:val="0"/>
+          <w:numId w:val="2"/>
+        </w:numPr>
+        <w:spacing w:after="80" w:line="360"/>
+        <w:jc w:val="both"/>
+      </w:pPr>
+      <w:r>
+        <w:rPr>
+          <w:rFonts w:ascii="Calibri" w:cs="Calibri" w:eastAsia="Calibri" w:hAnsi="Calibri"/>
+          <w:sz w:val="24"/>
+          <w:szCs w:val="24"/>
+        </w:rPr>
+        <w:t xml:space="preserve">INEI (2019). Perú: Indicadores de Educación por Departamentos, 2008-2018. Capítulo 5: Profesiones o carreras universitarias.</w:t>
+      </w:r>
+    </w:p>
+    <w:p>
+      <w:pPr>
+        <w:pStyle w:val="ListParagraph"/>
+        <w:numPr>
+          <w:ilvl w:val="0"/>
+          <w:numId w:val="2"/>
+        </w:numPr>
+        <w:spacing w:after="80" w:line="360"/>
+        <w:jc w:val="both"/>
+      </w:pPr>
+      <w:r>
+        <w:rPr>
+          <w:rFonts w:ascii="Calibri" w:cs="Calibri" w:eastAsia="Calibri" w:hAnsi="Calibri"/>
+          <w:sz w:val="24"/>
+          <w:szCs w:val="24"/>
+        </w:rPr>
+        <w:t xml:space="preserve">Villalobos Véliz, L. del C., Hernández Fernández, B., et al. (2026). Orientación vocacional en escolares: diseño y validación de un instrumento diagnóstico. Areté, Revista Digital del Doctorado en Educación, 12(23).</w:t>
+      </w:r>
+    </w:p>
+    <w:p>
+      <w:pPr>
+        <w:pStyle w:val="ListParagraph"/>
+        <w:numPr>
+          <w:ilvl w:val="0"/>
+          <w:numId w:val="2"/>
+        </w:numPr>
+        <w:spacing w:after="80" w:line="360"/>
+        <w:jc w:val="both"/>
+      </w:pPr>
+      <w:r>
+        <w:rPr>
+          <w:rFonts w:ascii="Calibri" w:cs="Calibri" w:eastAsia="Calibri" w:hAnsi="Calibri"/>
+          <w:sz w:val="24"/>
+          <w:szCs w:val="24"/>
+        </w:rPr>
+        <w:t xml:space="preserve">Gerencia Regional de Educación Lambayeque. Plataforma "Mi Carrera en tu Cole".</w:t>
       </w:r>
     </w:p>
     <w:p>

</xml_diff>

<commit_message>
Use APEIM 2025 NSE, correct Arellano DQE Norte wording, close USAT/UCV/USMP
Replaces the older CPI NSE split with APEIM 2025 (Peru total, ENAHO
2024) so the target keeps the original B-C-D criterion (68.8%), and
recomputes Tables 1-4 and 7. Rewrites 5.1.1(a) per the user's
correction: DQE Universidades Norte scope, UTP 19% / UCV 16% / UPAO 14%
for the north as a whole, methodology, and the caveat that public
sources do not support attributing UTP's lead to specific attributes.
Marks USAT, UCV and USMP as not offering the program (user confirmed).

Co-Authored-By: Claude Opus 5.5 <noreply@anthropic.com>
Claude-Session: https://claude.ai/code/session_01XsGhnoXHk7nghX2nJBVJwd
</commit_message>
<xml_diff>
--- a/borradores/Informe_Pertinencia_Farmacia_Bioquimica_Lambayeque.docx
+++ b/borradores/Informe_Pertinencia_Farmacia_Bioquimica_Lambayeque.docx
@@ -2674,7 +2674,7 @@
           <w:sz w:val="24"/>
           <w:szCs w:val="24"/>
         </w:rPr>
-        <w:t xml:space="preserve">La demanda se calcula con la misma lógica del informe de referencia: (1) población objetivo = población de Lambayeque de los NSE B, C y D, de 16 a 25 años, que cursa 5.° de secundaria o tiene secundaria completa sin estudios superiores; (2) demanda educativa = población objetivo × porcentaje interesado en estudiar Farmacia y Bioquímica (encuesta propia); (3) brecha = demanda educativa − oferta (ingresantes anuales de las universidades licenciadas que ofrecen la carrera en la región).</w:t>
+        <w:t xml:space="preserve">La demanda se calcula con la misma lógica del informe de referencia: (1) población objetivo = jóvenes de 15 a 29 años de Lambayeque de los NSE B, C y D que no se encuentran cursando estudios superiores; (2) demanda educativa = población objetivo × porcentaje interesado en estudiar Farmacia y Bioquímica (encuesta propia); (3) brecha = demanda educativa − oferta (ingresantes anuales de las universidades licenciadas que ofrecen la carrera en la región).</w:t>
       </w:r>
     </w:p>
     <w:p>
@@ -2842,7 +2842,7 @@
           <w:sz w:val="22"/>
           <w:szCs w:val="22"/>
         </w:rPr>
-        <w:t xml:space="preserve">Tabla 1. Población de Lambayeque según nivel socioeconómico</w:t>
+        <w:t xml:space="preserve">Tabla 1. Distribución de la población según nivel socioeconómico (APEIM 2025)</w:t>
       </w:r>
     </w:p>
     <w:tbl>
@@ -2859,12 +2859,13 @@
         </w:tblBorders>
       </w:tblPr>
       <w:tblGrid>
-        <w:gridCol w:w="3000"/>
-        <w:gridCol w:w="1050"/>
-        <w:gridCol w:w="1050"/>
-        <w:gridCol w:w="1050"/>
-        <w:gridCol w:w="1050"/>
-        <w:gridCol w:w="1200"/>
+        <w:gridCol w:w="2800"/>
+        <w:gridCol w:w="900"/>
+        <w:gridCol w:w="900"/>
+        <w:gridCol w:w="900"/>
+        <w:gridCol w:w="900"/>
+        <w:gridCol w:w="900"/>
+        <w:gridCol w:w="1100"/>
       </w:tblGrid>
       <w:tr>
         <w:trPr>
@@ -2872,7 +2873,7 @@
         </w:trPr>
         <w:tc>
           <w:tcPr>
-            <w:tcW w:type="dxa" w:w="3000"/>
+            <w:tcW w:type="dxa" w:w="2800"/>
             <w:tcBorders>
               <w:top w:val="single" w:color="000000" w:sz="4"/>
               <w:left w:val="single" w:color="000000" w:sz="4"/>
@@ -2907,7 +2908,7 @@
         </w:tc>
         <w:tc>
           <w:tcPr>
-            <w:tcW w:type="dxa" w:w="1050"/>
+            <w:tcW w:type="dxa" w:w="900"/>
             <w:tcBorders>
               <w:top w:val="single" w:color="000000" w:sz="4"/>
               <w:left w:val="single" w:color="000000" w:sz="4"/>
@@ -2936,13 +2937,13 @@
                 <w:sz w:val="15"/>
                 <w:szCs w:val="15"/>
               </w:rPr>
-              <w:t xml:space="preserve">NSE AB</w:t>
-            </w:r>
-          </w:p>
-        </w:tc>
-        <w:tc>
-          <w:tcPr>
-            <w:tcW w:type="dxa" w:w="1050"/>
+              <w:t xml:space="preserve">NSE A</w:t>
+            </w:r>
+          </w:p>
+        </w:tc>
+        <w:tc>
+          <w:tcPr>
+            <w:tcW w:type="dxa" w:w="900"/>
             <w:tcBorders>
               <w:top w:val="single" w:color="000000" w:sz="4"/>
               <w:left w:val="single" w:color="000000" w:sz="4"/>
@@ -2971,13 +2972,48 @@
                 <w:sz w:val="15"/>
                 <w:szCs w:val="15"/>
               </w:rPr>
+              <w:t xml:space="preserve">NSE B</w:t>
+            </w:r>
+          </w:p>
+        </w:tc>
+        <w:tc>
+          <w:tcPr>
+            <w:tcW w:type="dxa" w:w="900"/>
+            <w:tcBorders>
+              <w:top w:val="single" w:color="000000" w:sz="4"/>
+              <w:left w:val="single" w:color="000000" w:sz="4"/>
+              <w:bottom w:val="single" w:color="000000" w:sz="4"/>
+              <w:right w:val="single" w:color="000000" w:sz="4"/>
+            </w:tcBorders>
+            <w:shd w:fill="1F4E2C" w:color="auto" w:val="clear"/>
+            <w:tcMar>
+              <w:top w:type="dxa" w:w="20"/>
+              <w:left w:type="dxa" w:w="60"/>
+              <w:bottom w:type="dxa" w:w="20"/>
+              <w:right w:type="dxa" w:w="60"/>
+            </w:tcMar>
+            <w:vAlign w:val="center"/>
+          </w:tcPr>
+          <w:p>
+            <w:pPr>
+              <w:jc w:val="center"/>
+            </w:pPr>
+            <w:r>
+              <w:rPr>
+                <w:rFonts w:ascii="Arial" w:cs="Arial" w:eastAsia="Arial" w:hAnsi="Arial"/>
+                <w:b/>
+                <w:bCs/>
+                <w:color w:val="FFFFFF"/>
+                <w:sz w:val="15"/>
+                <w:szCs w:val="15"/>
+              </w:rPr>
               <w:t xml:space="preserve">NSE C</w:t>
             </w:r>
           </w:p>
         </w:tc>
         <w:tc>
           <w:tcPr>
-            <w:tcW w:type="dxa" w:w="1050"/>
+            <w:tcW w:type="dxa" w:w="900"/>
             <w:tcBorders>
               <w:top w:val="single" w:color="000000" w:sz="4"/>
               <w:left w:val="single" w:color="000000" w:sz="4"/>
@@ -3012,7 +3048,7 @@
         </w:tc>
         <w:tc>
           <w:tcPr>
-            <w:tcW w:type="dxa" w:w="1050"/>
+            <w:tcW w:type="dxa" w:w="900"/>
             <w:tcBorders>
               <w:top w:val="single" w:color="000000" w:sz="4"/>
               <w:left w:val="single" w:color="000000" w:sz="4"/>
@@ -3047,7 +3083,7 @@
         </w:tc>
         <w:tc>
           <w:tcPr>
-            <w:tcW w:type="dxa" w:w="1200"/>
+            <w:tcW w:type="dxa" w:w="1100"/>
             <w:tcBorders>
               <w:top w:val="single" w:color="000000" w:sz="4"/>
               <w:left w:val="single" w:color="000000" w:sz="4"/>
@@ -3087,7 +3123,7 @@
         </w:trPr>
         <w:tc>
           <w:tcPr>
-            <w:tcW w:type="dxa" w:w="3000"/>
+            <w:tcW w:type="dxa" w:w="2800"/>
             <w:tcBorders>
               <w:top w:val="single" w:color="000000" w:sz="4"/>
               <w:left w:val="single" w:color="000000" w:sz="4"/>
@@ -3115,149 +3151,183 @@
                 <w:sz w:val="15"/>
                 <w:szCs w:val="15"/>
               </w:rPr>
-              <w:t xml:space="preserve">Estructura socioeconómica (%)</w:t>
-            </w:r>
-          </w:p>
-        </w:tc>
-        <w:tc>
-          <w:tcPr>
-            <w:tcW w:type="dxa" w:w="1050"/>
-            <w:tcBorders>
-              <w:top w:val="single" w:color="000000" w:sz="4"/>
-              <w:left w:val="single" w:color="000000" w:sz="4"/>
-              <w:bottom w:val="single" w:color="000000" w:sz="4"/>
-              <w:right w:val="single" w:color="000000" w:sz="4"/>
-            </w:tcBorders>
-            <w:tcMar>
-              <w:top w:type="dxa" w:w="20"/>
-              <w:left w:type="dxa" w:w="60"/>
-              <w:bottom w:type="dxa" w:w="20"/>
-              <w:right w:type="dxa" w:w="60"/>
-            </w:tcMar>
-            <w:vAlign w:val="center"/>
-          </w:tcPr>
-          <w:p>
-            <w:pPr>
-              <w:jc w:val="center"/>
-            </w:pPr>
-            <w:r>
-              <w:rPr>
-                <w:rFonts w:ascii="Arial" w:cs="Arial" w:eastAsia="Arial" w:hAnsi="Arial"/>
-                <w:b/>
-                <w:bCs/>
-                <w:color w:val="000000"/>
-                <w:sz w:val="15"/>
-                <w:szCs w:val="15"/>
-              </w:rPr>
-              <w:t xml:space="preserve">10,5</w:t>
-            </w:r>
-          </w:p>
-        </w:tc>
-        <w:tc>
-          <w:tcPr>
-            <w:tcW w:type="dxa" w:w="1050"/>
-            <w:tcBorders>
-              <w:top w:val="single" w:color="000000" w:sz="4"/>
-              <w:left w:val="single" w:color="000000" w:sz="4"/>
-              <w:bottom w:val="single" w:color="000000" w:sz="4"/>
-              <w:right w:val="single" w:color="000000" w:sz="4"/>
-            </w:tcBorders>
-            <w:tcMar>
-              <w:top w:type="dxa" w:w="20"/>
-              <w:left w:type="dxa" w:w="60"/>
-              <w:bottom w:type="dxa" w:w="20"/>
-              <w:right w:type="dxa" w:w="60"/>
-            </w:tcMar>
-            <w:vAlign w:val="center"/>
-          </w:tcPr>
-          <w:p>
-            <w:pPr>
-              <w:jc w:val="center"/>
-            </w:pPr>
-            <w:r>
-              <w:rPr>
-                <w:rFonts w:ascii="Arial" w:cs="Arial" w:eastAsia="Arial" w:hAnsi="Arial"/>
-                <w:b/>
-                <w:bCs/>
-                <w:color w:val="000000"/>
-                <w:sz w:val="15"/>
-                <w:szCs w:val="15"/>
-              </w:rPr>
-              <w:t xml:space="preserve">23,8</w:t>
-            </w:r>
-          </w:p>
-        </w:tc>
-        <w:tc>
-          <w:tcPr>
-            <w:tcW w:type="dxa" w:w="1050"/>
-            <w:tcBorders>
-              <w:top w:val="single" w:color="000000" w:sz="4"/>
-              <w:left w:val="single" w:color="000000" w:sz="4"/>
-              <w:bottom w:val="single" w:color="000000" w:sz="4"/>
-              <w:right w:val="single" w:color="000000" w:sz="4"/>
-            </w:tcBorders>
-            <w:tcMar>
-              <w:top w:type="dxa" w:w="20"/>
-              <w:left w:type="dxa" w:w="60"/>
-              <w:bottom w:type="dxa" w:w="20"/>
-              <w:right w:type="dxa" w:w="60"/>
-            </w:tcMar>
-            <w:vAlign w:val="center"/>
-          </w:tcPr>
-          <w:p>
-            <w:pPr>
-              <w:jc w:val="center"/>
-            </w:pPr>
-            <w:r>
-              <w:rPr>
-                <w:rFonts w:ascii="Arial" w:cs="Arial" w:eastAsia="Arial" w:hAnsi="Arial"/>
-                <w:b/>
-                <w:bCs/>
-                <w:color w:val="000000"/>
-                <w:sz w:val="15"/>
-                <w:szCs w:val="15"/>
-              </w:rPr>
-              <w:t xml:space="preserve">30,7</w:t>
-            </w:r>
-          </w:p>
-        </w:tc>
-        <w:tc>
-          <w:tcPr>
-            <w:tcW w:type="dxa" w:w="1050"/>
-            <w:tcBorders>
-              <w:top w:val="single" w:color="000000" w:sz="4"/>
-              <w:left w:val="single" w:color="000000" w:sz="4"/>
-              <w:bottom w:val="single" w:color="000000" w:sz="4"/>
-              <w:right w:val="single" w:color="000000" w:sz="4"/>
-            </w:tcBorders>
-            <w:tcMar>
-              <w:top w:type="dxa" w:w="20"/>
-              <w:left w:type="dxa" w:w="60"/>
-              <w:bottom w:type="dxa" w:w="20"/>
-              <w:right w:type="dxa" w:w="60"/>
-            </w:tcMar>
-            <w:vAlign w:val="center"/>
-          </w:tcPr>
-          <w:p>
-            <w:pPr>
-              <w:jc w:val="center"/>
-            </w:pPr>
-            <w:r>
-              <w:rPr>
-                <w:rFonts w:ascii="Arial" w:cs="Arial" w:eastAsia="Arial" w:hAnsi="Arial"/>
-                <w:b/>
-                <w:bCs/>
-                <w:color w:val="000000"/>
-                <w:sz w:val="15"/>
-                <w:szCs w:val="15"/>
-              </w:rPr>
-              <w:t xml:space="preserve">35,0</w:t>
-            </w:r>
-          </w:p>
-        </w:tc>
-        <w:tc>
-          <w:tcPr>
-            <w:tcW w:type="dxa" w:w="1200"/>
+              <w:t xml:space="preserve">Distribución de hogares, Perú (%)</w:t>
+            </w:r>
+          </w:p>
+        </w:tc>
+        <w:tc>
+          <w:tcPr>
+            <w:tcW w:type="dxa" w:w="900"/>
+            <w:tcBorders>
+              <w:top w:val="single" w:color="000000" w:sz="4"/>
+              <w:left w:val="single" w:color="000000" w:sz="4"/>
+              <w:bottom w:val="single" w:color="000000" w:sz="4"/>
+              <w:right w:val="single" w:color="000000" w:sz="4"/>
+            </w:tcBorders>
+            <w:tcMar>
+              <w:top w:type="dxa" w:w="20"/>
+              <w:left w:type="dxa" w:w="60"/>
+              <w:bottom w:type="dxa" w:w="20"/>
+              <w:right w:type="dxa" w:w="60"/>
+            </w:tcMar>
+            <w:vAlign w:val="center"/>
+          </w:tcPr>
+          <w:p>
+            <w:pPr>
+              <w:jc w:val="center"/>
+            </w:pPr>
+            <w:r>
+              <w:rPr>
+                <w:rFonts w:ascii="Arial" w:cs="Arial" w:eastAsia="Arial" w:hAnsi="Arial"/>
+                <w:b/>
+                <w:bCs/>
+                <w:color w:val="000000"/>
+                <w:sz w:val="15"/>
+                <w:szCs w:val="15"/>
+              </w:rPr>
+              <w:t xml:space="preserve">1,0</w:t>
+            </w:r>
+          </w:p>
+        </w:tc>
+        <w:tc>
+          <w:tcPr>
+            <w:tcW w:type="dxa" w:w="900"/>
+            <w:tcBorders>
+              <w:top w:val="single" w:color="000000" w:sz="4"/>
+              <w:left w:val="single" w:color="000000" w:sz="4"/>
+              <w:bottom w:val="single" w:color="000000" w:sz="4"/>
+              <w:right w:val="single" w:color="000000" w:sz="4"/>
+            </w:tcBorders>
+            <w:tcMar>
+              <w:top w:type="dxa" w:w="20"/>
+              <w:left w:type="dxa" w:w="60"/>
+              <w:bottom w:type="dxa" w:w="20"/>
+              <w:right w:type="dxa" w:w="60"/>
+            </w:tcMar>
+            <w:vAlign w:val="center"/>
+          </w:tcPr>
+          <w:p>
+            <w:pPr>
+              <w:jc w:val="center"/>
+            </w:pPr>
+            <w:r>
+              <w:rPr>
+                <w:rFonts w:ascii="Arial" w:cs="Arial" w:eastAsia="Arial" w:hAnsi="Arial"/>
+                <w:b/>
+                <w:bCs/>
+                <w:color w:val="000000"/>
+                <w:sz w:val="15"/>
+                <w:szCs w:val="15"/>
+              </w:rPr>
+              <w:t xml:space="preserve">9,4</w:t>
+            </w:r>
+          </w:p>
+        </w:tc>
+        <w:tc>
+          <w:tcPr>
+            <w:tcW w:type="dxa" w:w="900"/>
+            <w:tcBorders>
+              <w:top w:val="single" w:color="000000" w:sz="4"/>
+              <w:left w:val="single" w:color="000000" w:sz="4"/>
+              <w:bottom w:val="single" w:color="000000" w:sz="4"/>
+              <w:right w:val="single" w:color="000000" w:sz="4"/>
+            </w:tcBorders>
+            <w:tcMar>
+              <w:top w:type="dxa" w:w="20"/>
+              <w:left w:type="dxa" w:w="60"/>
+              <w:bottom w:type="dxa" w:w="20"/>
+              <w:right w:type="dxa" w:w="60"/>
+            </w:tcMar>
+            <w:vAlign w:val="center"/>
+          </w:tcPr>
+          <w:p>
+            <w:pPr>
+              <w:jc w:val="center"/>
+            </w:pPr>
+            <w:r>
+              <w:rPr>
+                <w:rFonts w:ascii="Arial" w:cs="Arial" w:eastAsia="Arial" w:hAnsi="Arial"/>
+                <w:b/>
+                <w:bCs/>
+                <w:color w:val="000000"/>
+                <w:sz w:val="15"/>
+                <w:szCs w:val="15"/>
+              </w:rPr>
+              <w:t xml:space="preserve">28,1</w:t>
+            </w:r>
+          </w:p>
+        </w:tc>
+        <w:tc>
+          <w:tcPr>
+            <w:tcW w:type="dxa" w:w="900"/>
+            <w:tcBorders>
+              <w:top w:val="single" w:color="000000" w:sz="4"/>
+              <w:left w:val="single" w:color="000000" w:sz="4"/>
+              <w:bottom w:val="single" w:color="000000" w:sz="4"/>
+              <w:right w:val="single" w:color="000000" w:sz="4"/>
+            </w:tcBorders>
+            <w:tcMar>
+              <w:top w:type="dxa" w:w="20"/>
+              <w:left w:type="dxa" w:w="60"/>
+              <w:bottom w:type="dxa" w:w="20"/>
+              <w:right w:type="dxa" w:w="60"/>
+            </w:tcMar>
+            <w:vAlign w:val="center"/>
+          </w:tcPr>
+          <w:p>
+            <w:pPr>
+              <w:jc w:val="center"/>
+            </w:pPr>
+            <w:r>
+              <w:rPr>
+                <w:rFonts w:ascii="Arial" w:cs="Arial" w:eastAsia="Arial" w:hAnsi="Arial"/>
+                <w:b/>
+                <w:bCs/>
+                <w:color w:val="000000"/>
+                <w:sz w:val="15"/>
+                <w:szCs w:val="15"/>
+              </w:rPr>
+              <w:t xml:space="preserve">31,3</w:t>
+            </w:r>
+          </w:p>
+        </w:tc>
+        <w:tc>
+          <w:tcPr>
+            <w:tcW w:type="dxa" w:w="900"/>
+            <w:tcBorders>
+              <w:top w:val="single" w:color="000000" w:sz="4"/>
+              <w:left w:val="single" w:color="000000" w:sz="4"/>
+              <w:bottom w:val="single" w:color="000000" w:sz="4"/>
+              <w:right w:val="single" w:color="000000" w:sz="4"/>
+            </w:tcBorders>
+            <w:tcMar>
+              <w:top w:type="dxa" w:w="20"/>
+              <w:left w:type="dxa" w:w="60"/>
+              <w:bottom w:type="dxa" w:w="20"/>
+              <w:right w:type="dxa" w:w="60"/>
+            </w:tcMar>
+            <w:vAlign w:val="center"/>
+          </w:tcPr>
+          <w:p>
+            <w:pPr>
+              <w:jc w:val="center"/>
+            </w:pPr>
+            <w:r>
+              <w:rPr>
+                <w:rFonts w:ascii="Arial" w:cs="Arial" w:eastAsia="Arial" w:hAnsi="Arial"/>
+                <w:b/>
+                <w:bCs/>
+                <w:color w:val="000000"/>
+                <w:sz w:val="15"/>
+                <w:szCs w:val="15"/>
+              </w:rPr>
+              <w:t xml:space="preserve">30,2</w:t>
+            </w:r>
+          </w:p>
+        </w:tc>
+        <w:tc>
+          <w:tcPr>
+            <w:tcW w:type="dxa" w:w="1100"/>
             <w:tcBorders>
               <w:top w:val="single" w:color="000000" w:sz="4"/>
               <w:left w:val="single" w:color="000000" w:sz="4"/>
@@ -3296,7 +3366,7 @@
         </w:trPr>
         <w:tc>
           <w:tcPr>
-            <w:tcW w:type="dxa" w:w="3000"/>
+            <w:tcW w:type="dxa" w:w="2800"/>
             <w:tcBorders>
               <w:top w:val="single" w:color="000000" w:sz="4"/>
               <w:left w:val="single" w:color="000000" w:sz="4"/>
@@ -3324,149 +3394,183 @@
                 <w:sz w:val="15"/>
                 <w:szCs w:val="15"/>
               </w:rPr>
-              <w:t xml:space="preserve">Población estimada 2024 (hab.)</w:t>
-            </w:r>
-          </w:p>
-        </w:tc>
-        <w:tc>
-          <w:tcPr>
-            <w:tcW w:type="dxa" w:w="1050"/>
-            <w:tcBorders>
-              <w:top w:val="single" w:color="000000" w:sz="4"/>
-              <w:left w:val="single" w:color="000000" w:sz="4"/>
-              <w:bottom w:val="single" w:color="000000" w:sz="4"/>
-              <w:right w:val="single" w:color="000000" w:sz="4"/>
-            </w:tcBorders>
-            <w:tcMar>
-              <w:top w:type="dxa" w:w="20"/>
-              <w:left w:type="dxa" w:w="60"/>
-              <w:bottom w:type="dxa" w:w="20"/>
-              <w:right w:type="dxa" w:w="60"/>
-            </w:tcMar>
-            <w:vAlign w:val="center"/>
-          </w:tcPr>
-          <w:p>
-            <w:pPr>
-              <w:jc w:val="center"/>
-            </w:pPr>
-            <w:r>
-              <w:rPr>
-                <w:rFonts w:ascii="Arial" w:cs="Arial" w:eastAsia="Arial" w:hAnsi="Arial"/>
-                <w:b/>
-                <w:bCs/>
-                <w:color w:val="000000"/>
-                <w:sz w:val="15"/>
-                <w:szCs w:val="15"/>
-              </w:rPr>
-              <w:t xml:space="preserve">142 401</w:t>
-            </w:r>
-          </w:p>
-        </w:tc>
-        <w:tc>
-          <w:tcPr>
-            <w:tcW w:type="dxa" w:w="1050"/>
-            <w:tcBorders>
-              <w:top w:val="single" w:color="000000" w:sz="4"/>
-              <w:left w:val="single" w:color="000000" w:sz="4"/>
-              <w:bottom w:val="single" w:color="000000" w:sz="4"/>
-              <w:right w:val="single" w:color="000000" w:sz="4"/>
-            </w:tcBorders>
-            <w:tcMar>
-              <w:top w:type="dxa" w:w="20"/>
-              <w:left w:type="dxa" w:w="60"/>
-              <w:bottom w:type="dxa" w:w="20"/>
-              <w:right w:type="dxa" w:w="60"/>
-            </w:tcMar>
-            <w:vAlign w:val="center"/>
-          </w:tcPr>
-          <w:p>
-            <w:pPr>
-              <w:jc w:val="center"/>
-            </w:pPr>
-            <w:r>
-              <w:rPr>
-                <w:rFonts w:ascii="Arial" w:cs="Arial" w:eastAsia="Arial" w:hAnsi="Arial"/>
-                <w:b/>
-                <w:bCs/>
-                <w:color w:val="000000"/>
-                <w:sz w:val="15"/>
-                <w:szCs w:val="15"/>
-              </w:rPr>
-              <w:t xml:space="preserve">322 776</w:t>
-            </w:r>
-          </w:p>
-        </w:tc>
-        <w:tc>
-          <w:tcPr>
-            <w:tcW w:type="dxa" w:w="1050"/>
-            <w:tcBorders>
-              <w:top w:val="single" w:color="000000" w:sz="4"/>
-              <w:left w:val="single" w:color="000000" w:sz="4"/>
-              <w:bottom w:val="single" w:color="000000" w:sz="4"/>
-              <w:right w:val="single" w:color="000000" w:sz="4"/>
-            </w:tcBorders>
-            <w:tcMar>
-              <w:top w:type="dxa" w:w="20"/>
-              <w:left w:type="dxa" w:w="60"/>
-              <w:bottom w:type="dxa" w:w="20"/>
-              <w:right w:type="dxa" w:w="60"/>
-            </w:tcMar>
-            <w:vAlign w:val="center"/>
-          </w:tcPr>
-          <w:p>
-            <w:pPr>
-              <w:jc w:val="center"/>
-            </w:pPr>
-            <w:r>
-              <w:rPr>
-                <w:rFonts w:ascii="Arial" w:cs="Arial" w:eastAsia="Arial" w:hAnsi="Arial"/>
-                <w:b/>
-                <w:bCs/>
-                <w:color w:val="000000"/>
-                <w:sz w:val="15"/>
-                <w:szCs w:val="15"/>
-              </w:rPr>
-              <w:t xml:space="preserve">416 354</w:t>
-            </w:r>
-          </w:p>
-        </w:tc>
-        <w:tc>
-          <w:tcPr>
-            <w:tcW w:type="dxa" w:w="1050"/>
-            <w:tcBorders>
-              <w:top w:val="single" w:color="000000" w:sz="4"/>
-              <w:left w:val="single" w:color="000000" w:sz="4"/>
-              <w:bottom w:val="single" w:color="000000" w:sz="4"/>
-              <w:right w:val="single" w:color="000000" w:sz="4"/>
-            </w:tcBorders>
-            <w:tcMar>
-              <w:top w:type="dxa" w:w="20"/>
-              <w:left w:type="dxa" w:w="60"/>
-              <w:bottom w:type="dxa" w:w="20"/>
-              <w:right w:type="dxa" w:w="60"/>
-            </w:tcMar>
-            <w:vAlign w:val="center"/>
-          </w:tcPr>
-          <w:p>
-            <w:pPr>
-              <w:jc w:val="center"/>
-            </w:pPr>
-            <w:r>
-              <w:rPr>
-                <w:rFonts w:ascii="Arial" w:cs="Arial" w:eastAsia="Arial" w:hAnsi="Arial"/>
-                <w:b/>
-                <w:bCs/>
-                <w:color w:val="000000"/>
-                <w:sz w:val="15"/>
-                <w:szCs w:val="15"/>
-              </w:rPr>
-              <w:t xml:space="preserve">474 671</w:t>
-            </w:r>
-          </w:p>
-        </w:tc>
-        <w:tc>
-          <w:tcPr>
-            <w:tcW w:type="dxa" w:w="1200"/>
+              <w:t xml:space="preserve">Aplicada a Lambayeque, 2024 (hab.)</w:t>
+            </w:r>
+          </w:p>
+        </w:tc>
+        <w:tc>
+          <w:tcPr>
+            <w:tcW w:type="dxa" w:w="900"/>
+            <w:tcBorders>
+              <w:top w:val="single" w:color="000000" w:sz="4"/>
+              <w:left w:val="single" w:color="000000" w:sz="4"/>
+              <w:bottom w:val="single" w:color="000000" w:sz="4"/>
+              <w:right w:val="single" w:color="000000" w:sz="4"/>
+            </w:tcBorders>
+            <w:tcMar>
+              <w:top w:type="dxa" w:w="20"/>
+              <w:left w:type="dxa" w:w="60"/>
+              <w:bottom w:type="dxa" w:w="20"/>
+              <w:right w:type="dxa" w:w="60"/>
+            </w:tcMar>
+            <w:vAlign w:val="center"/>
+          </w:tcPr>
+          <w:p>
+            <w:pPr>
+              <w:jc w:val="center"/>
+            </w:pPr>
+            <w:r>
+              <w:rPr>
+                <w:rFonts w:ascii="Arial" w:cs="Arial" w:eastAsia="Arial" w:hAnsi="Arial"/>
+                <w:b/>
+                <w:bCs/>
+                <w:color w:val="000000"/>
+                <w:sz w:val="15"/>
+                <w:szCs w:val="15"/>
+              </w:rPr>
+              <w:t xml:space="preserve">13 562</w:t>
+            </w:r>
+          </w:p>
+        </w:tc>
+        <w:tc>
+          <w:tcPr>
+            <w:tcW w:type="dxa" w:w="900"/>
+            <w:tcBorders>
+              <w:top w:val="single" w:color="000000" w:sz="4"/>
+              <w:left w:val="single" w:color="000000" w:sz="4"/>
+              <w:bottom w:val="single" w:color="000000" w:sz="4"/>
+              <w:right w:val="single" w:color="000000" w:sz="4"/>
+            </w:tcBorders>
+            <w:tcMar>
+              <w:top w:type="dxa" w:w="20"/>
+              <w:left w:type="dxa" w:w="60"/>
+              <w:bottom w:type="dxa" w:w="20"/>
+              <w:right w:type="dxa" w:w="60"/>
+            </w:tcMar>
+            <w:vAlign w:val="center"/>
+          </w:tcPr>
+          <w:p>
+            <w:pPr>
+              <w:jc w:val="center"/>
+            </w:pPr>
+            <w:r>
+              <w:rPr>
+                <w:rFonts w:ascii="Arial" w:cs="Arial" w:eastAsia="Arial" w:hAnsi="Arial"/>
+                <w:b/>
+                <w:bCs/>
+                <w:color w:val="000000"/>
+                <w:sz w:val="15"/>
+                <w:szCs w:val="15"/>
+              </w:rPr>
+              <w:t xml:space="preserve">127 483</w:t>
+            </w:r>
+          </w:p>
+        </w:tc>
+        <w:tc>
+          <w:tcPr>
+            <w:tcW w:type="dxa" w:w="900"/>
+            <w:tcBorders>
+              <w:top w:val="single" w:color="000000" w:sz="4"/>
+              <w:left w:val="single" w:color="000000" w:sz="4"/>
+              <w:bottom w:val="single" w:color="000000" w:sz="4"/>
+              <w:right w:val="single" w:color="000000" w:sz="4"/>
+            </w:tcBorders>
+            <w:tcMar>
+              <w:top w:type="dxa" w:w="20"/>
+              <w:left w:type="dxa" w:w="60"/>
+              <w:bottom w:type="dxa" w:w="20"/>
+              <w:right w:type="dxa" w:w="60"/>
+            </w:tcMar>
+            <w:vAlign w:val="center"/>
+          </w:tcPr>
+          <w:p>
+            <w:pPr>
+              <w:jc w:val="center"/>
+            </w:pPr>
+            <w:r>
+              <w:rPr>
+                <w:rFonts w:ascii="Arial" w:cs="Arial" w:eastAsia="Arial" w:hAnsi="Arial"/>
+                <w:b/>
+                <w:bCs/>
+                <w:color w:val="000000"/>
+                <w:sz w:val="15"/>
+                <w:szCs w:val="15"/>
+              </w:rPr>
+              <w:t xml:space="preserve">381 093</w:t>
+            </w:r>
+          </w:p>
+        </w:tc>
+        <w:tc>
+          <w:tcPr>
+            <w:tcW w:type="dxa" w:w="900"/>
+            <w:tcBorders>
+              <w:top w:val="single" w:color="000000" w:sz="4"/>
+              <w:left w:val="single" w:color="000000" w:sz="4"/>
+              <w:bottom w:val="single" w:color="000000" w:sz="4"/>
+              <w:right w:val="single" w:color="000000" w:sz="4"/>
+            </w:tcBorders>
+            <w:tcMar>
+              <w:top w:type="dxa" w:w="20"/>
+              <w:left w:type="dxa" w:w="60"/>
+              <w:bottom w:type="dxa" w:w="20"/>
+              <w:right w:type="dxa" w:w="60"/>
+            </w:tcMar>
+            <w:vAlign w:val="center"/>
+          </w:tcPr>
+          <w:p>
+            <w:pPr>
+              <w:jc w:val="center"/>
+            </w:pPr>
+            <w:r>
+              <w:rPr>
+                <w:rFonts w:ascii="Arial" w:cs="Arial" w:eastAsia="Arial" w:hAnsi="Arial"/>
+                <w:b/>
+                <w:bCs/>
+                <w:color w:val="000000"/>
+                <w:sz w:val="15"/>
+                <w:szCs w:val="15"/>
+              </w:rPr>
+              <w:t xml:space="preserve">424 491</w:t>
+            </w:r>
+          </w:p>
+        </w:tc>
+        <w:tc>
+          <w:tcPr>
+            <w:tcW w:type="dxa" w:w="900"/>
+            <w:tcBorders>
+              <w:top w:val="single" w:color="000000" w:sz="4"/>
+              <w:left w:val="single" w:color="000000" w:sz="4"/>
+              <w:bottom w:val="single" w:color="000000" w:sz="4"/>
+              <w:right w:val="single" w:color="000000" w:sz="4"/>
+            </w:tcBorders>
+            <w:tcMar>
+              <w:top w:type="dxa" w:w="20"/>
+              <w:left w:type="dxa" w:w="60"/>
+              <w:bottom w:type="dxa" w:w="20"/>
+              <w:right w:type="dxa" w:w="60"/>
+            </w:tcMar>
+            <w:vAlign w:val="center"/>
+          </w:tcPr>
+          <w:p>
+            <w:pPr>
+              <w:jc w:val="center"/>
+            </w:pPr>
+            <w:r>
+              <w:rPr>
+                <w:rFonts w:ascii="Arial" w:cs="Arial" w:eastAsia="Arial" w:hAnsi="Arial"/>
+                <w:b/>
+                <w:bCs/>
+                <w:color w:val="000000"/>
+                <w:sz w:val="15"/>
+                <w:szCs w:val="15"/>
+              </w:rPr>
+              <w:t xml:space="preserve">409 573</w:t>
+            </w:r>
+          </w:p>
+        </w:tc>
+        <w:tc>
+          <w:tcPr>
+            <w:tcW w:type="dxa" w:w="1100"/>
             <w:tcBorders>
               <w:top w:val="single" w:color="000000" w:sz="4"/>
               <w:left w:val="single" w:color="000000" w:sz="4"/>
@@ -3515,7 +3619,7 @@
           <w:sz w:val="14"/>
           <w:szCs w:val="14"/>
         </w:rPr>
-        <w:t xml:space="preserve">Fuente: población total, PRODUCE (2025) sobre INEI; estructura NSE, CPI (en SINEACE, Caracterización de la región Lambayeque). La estructura NSE corresponde a una medición anterior; actualizar con CPI "Perú: Población 2024" </w:t>
+        <w:t xml:space="preserve">Fuente: APEIM, Niveles Socioeconómicos 2025 (data ENAHO 2024), p. 17; población total, PRODUCE (2025). La síntesis de APEIM solo publica Lima Metropolitana y Perú total; se aplica la distribución nacional a Lambayeque. Actualizar con el informe completo de APEIM, que incluye el desagregado por departamento </w:t>
       </w:r>
       <w:r>
         <w:rPr>
@@ -4362,7 +4466,7 @@
                 <w:sz w:val="15"/>
                 <w:szCs w:val="15"/>
               </w:rPr>
-              <w:t xml:space="preserve">Jóvenes que no estudian, en NSE C y D (54,5 %)</w:t>
+              <w:t xml:space="preserve">Jóvenes que no estudian, en NSE B, C y D (68,8 %)</w:t>
             </w:r>
           </w:p>
         </w:tc>
@@ -4430,7 +4534,7 @@
                 <w:sz w:val="15"/>
                 <w:szCs w:val="15"/>
               </w:rPr>
-              <w:t xml:space="preserve">111 735</w:t>
+              <w:t xml:space="preserve">141 052</w:t>
             </w:r>
           </w:p>
         </w:tc>
@@ -4451,7 +4555,7 @@
           <w:sz w:val="14"/>
           <w:szCs w:val="14"/>
         </w:rPr>
-        <w:t xml:space="preserve">Fuente: INEI – ENAHO 2024, en GRTPE–OSEL Lambayeque, Mercado laboral de los jóvenes en la región Lambayeque (2025), p. 56; NSE, CPI. Elaboración propia para las dos últimas filas.</w:t>
+        <w:t xml:space="preserve">Fuente: INEI – ENAHO 2024, en GRTPE–OSEL Lambayeque, Mercado laboral de los jóvenes en la región Lambayeque (2025), p. 56; NSE, APEIM 2025. Elaboración propia para las dos últimas filas.</w:t>
       </w:r>
     </w:p>
     <w:p>
@@ -4465,7 +4569,7 @@
           <w:sz w:val="24"/>
           <w:szCs w:val="24"/>
         </w:rPr>
-        <w:t xml:space="preserve">La población objetivo se aproxima con los jóvenes de 15 a 29 años que no estudian, es decir, los que solo trabajan o no estudian ni trabajan (NINI), pertenecientes a los NSE C y D. Este grupo corresponde al criterio de no estar cursando estudios superiores. Cabe resaltar que Lambayeque ocupa el </w:t>
+        <w:t xml:space="preserve">La población objetivo se aproxima con los jóvenes de 15 a 29 años que no estudian, es decir, los que solo trabajan o no estudian ni trabajan (NINI), pertenecientes a los NSE B, C y D. Este grupo corresponde al criterio de no estar cursando estudios superiores. Cabe resaltar que Lambayeque ocupa el </w:t>
       </w:r>
       <w:r>
         <w:rPr>
@@ -4866,7 +4970,7 @@
                 <w:sz w:val="15"/>
                 <w:szCs w:val="15"/>
               </w:rPr>
-              <w:t xml:space="preserve">110 938</w:t>
+              <w:t xml:space="preserve">140 047</w:t>
             </w:r>
           </w:p>
         </w:tc>
@@ -4900,7 +5004,7 @@
                 <w:sz w:val="15"/>
                 <w:szCs w:val="15"/>
               </w:rPr>
-              <w:t xml:space="preserve">110 674</w:t>
+              <w:t xml:space="preserve">139 713</w:t>
             </w:r>
           </w:p>
         </w:tc>
@@ -4934,7 +5038,7 @@
                 <w:sz w:val="15"/>
                 <w:szCs w:val="15"/>
               </w:rPr>
-              <w:t xml:space="preserve">110 410</w:t>
+              <w:t xml:space="preserve">139 380</w:t>
             </w:r>
           </w:p>
         </w:tc>
@@ -4968,7 +5072,7 @@
                 <w:sz w:val="15"/>
                 <w:szCs w:val="15"/>
               </w:rPr>
-              <w:t xml:space="preserve">110 147</w:t>
+              <w:t xml:space="preserve">139 048</w:t>
             </w:r>
           </w:p>
         </w:tc>
@@ -5002,7 +5106,7 @@
                 <w:sz w:val="15"/>
                 <w:szCs w:val="15"/>
               </w:rPr>
-              <w:t xml:space="preserve">109 885</w:t>
+              <w:t xml:space="preserve">138 717</w:t>
             </w:r>
           </w:p>
         </w:tc>
@@ -5036,7 +5140,7 @@
                 <w:sz w:val="15"/>
                 <w:szCs w:val="15"/>
               </w:rPr>
-              <w:t xml:space="preserve">109 623</w:t>
+              <w:t xml:space="preserve">138 387</w:t>
             </w:r>
           </w:p>
         </w:tc>
@@ -5070,7 +5174,7 @@
                 <w:sz w:val="15"/>
                 <w:szCs w:val="15"/>
               </w:rPr>
-              <w:t xml:space="preserve">109 362</w:t>
+              <w:t xml:space="preserve">138 057</w:t>
             </w:r>
           </w:p>
         </w:tc>
@@ -5485,7 +5589,7 @@
                 <w:sz w:val="15"/>
                 <w:szCs w:val="15"/>
               </w:rPr>
-              <w:t xml:space="preserve">1 109</w:t>
+              <w:t xml:space="preserve">1 400</w:t>
             </w:r>
           </w:p>
         </w:tc>
@@ -5519,7 +5623,7 @@
                 <w:sz w:val="15"/>
                 <w:szCs w:val="15"/>
               </w:rPr>
-              <w:t xml:space="preserve">1 107</w:t>
+              <w:t xml:space="preserve">1 397</w:t>
             </w:r>
           </w:p>
         </w:tc>
@@ -5553,7 +5657,7 @@
                 <w:sz w:val="15"/>
                 <w:szCs w:val="15"/>
               </w:rPr>
-              <w:t xml:space="preserve">1 104</w:t>
+              <w:t xml:space="preserve">1 394</w:t>
             </w:r>
           </w:p>
         </w:tc>
@@ -5587,7 +5691,7 @@
                 <w:sz w:val="15"/>
                 <w:szCs w:val="15"/>
               </w:rPr>
-              <w:t xml:space="preserve">1 101</w:t>
+              <w:t xml:space="preserve">1 390</w:t>
             </w:r>
           </w:p>
         </w:tc>
@@ -5621,7 +5725,7 @@
                 <w:sz w:val="15"/>
                 <w:szCs w:val="15"/>
               </w:rPr>
-              <w:t xml:space="preserve">1 099</w:t>
+              <w:t xml:space="preserve">1 387</w:t>
             </w:r>
           </w:p>
         </w:tc>
@@ -5655,7 +5759,7 @@
                 <w:sz w:val="15"/>
                 <w:szCs w:val="15"/>
               </w:rPr>
-              <w:t xml:space="preserve">1 096</w:t>
+              <w:t xml:space="preserve">1 384</w:t>
             </w:r>
           </w:p>
         </w:tc>
@@ -5689,7 +5793,7 @@
                 <w:sz w:val="15"/>
                 <w:szCs w:val="15"/>
               </w:rPr>
-              <w:t xml:space="preserve">1 094</w:t>
+              <w:t xml:space="preserve">1 381</w:t>
             </w:r>
           </w:p>
         </w:tc>
@@ -5762,7 +5866,7 @@
                 <w:sz w:val="15"/>
                 <w:szCs w:val="15"/>
               </w:rPr>
-              <w:t xml:space="preserve">2 219</w:t>
+              <w:t xml:space="preserve">2 801</w:t>
             </w:r>
           </w:p>
         </w:tc>
@@ -5796,7 +5900,7 @@
                 <w:sz w:val="15"/>
                 <w:szCs w:val="15"/>
               </w:rPr>
-              <w:t xml:space="preserve">2 213</w:t>
+              <w:t xml:space="preserve">2 794</w:t>
             </w:r>
           </w:p>
         </w:tc>
@@ -5830,7 +5934,7 @@
                 <w:sz w:val="15"/>
                 <w:szCs w:val="15"/>
               </w:rPr>
-              <w:t xml:space="preserve">2 208</w:t>
+              <w:t xml:space="preserve">2 788</w:t>
             </w:r>
           </w:p>
         </w:tc>
@@ -5864,7 +5968,7 @@
                 <w:sz w:val="15"/>
                 <w:szCs w:val="15"/>
               </w:rPr>
-              <w:t xml:space="preserve">2 203</w:t>
+              <w:t xml:space="preserve">2 781</w:t>
             </w:r>
           </w:p>
         </w:tc>
@@ -5898,7 +6002,7 @@
                 <w:sz w:val="15"/>
                 <w:szCs w:val="15"/>
               </w:rPr>
-              <w:t xml:space="preserve">2 198</w:t>
+              <w:t xml:space="preserve">2 774</w:t>
             </w:r>
           </w:p>
         </w:tc>
@@ -5932,7 +6036,7 @@
                 <w:sz w:val="15"/>
                 <w:szCs w:val="15"/>
               </w:rPr>
-              <w:t xml:space="preserve">2 192</w:t>
+              <w:t xml:space="preserve">2 768</w:t>
             </w:r>
           </w:p>
         </w:tc>
@@ -5966,7 +6070,7 @@
                 <w:sz w:val="15"/>
                 <w:szCs w:val="15"/>
               </w:rPr>
-              <w:t xml:space="preserve">2 187</w:t>
+              <w:t xml:space="preserve">2 761</w:t>
             </w:r>
           </w:p>
         </w:tc>
@@ -6039,7 +6143,7 @@
                 <w:sz w:val="15"/>
                 <w:szCs w:val="15"/>
               </w:rPr>
-              <w:t xml:space="preserve">3 328</w:t>
+              <w:t xml:space="preserve">4 201</w:t>
             </w:r>
           </w:p>
         </w:tc>
@@ -6073,7 +6177,7 @@
                 <w:sz w:val="15"/>
                 <w:szCs w:val="15"/>
               </w:rPr>
-              <w:t xml:space="preserve">3 320</w:t>
+              <w:t xml:space="preserve">4 191</w:t>
             </w:r>
           </w:p>
         </w:tc>
@@ -6107,7 +6211,7 @@
                 <w:sz w:val="15"/>
                 <w:szCs w:val="15"/>
               </w:rPr>
-              <w:t xml:space="preserve">3 312</w:t>
+              <w:t xml:space="preserve">4 181</w:t>
             </w:r>
           </w:p>
         </w:tc>
@@ -6141,7 +6245,7 @@
                 <w:sz w:val="15"/>
                 <w:szCs w:val="15"/>
               </w:rPr>
-              <w:t xml:space="preserve">3 304</w:t>
+              <w:t xml:space="preserve">4 171</w:t>
             </w:r>
           </w:p>
         </w:tc>
@@ -6175,7 +6279,7 @@
                 <w:sz w:val="15"/>
                 <w:szCs w:val="15"/>
               </w:rPr>
-              <w:t xml:space="preserve">3 297</w:t>
+              <w:t xml:space="preserve">4 162</w:t>
             </w:r>
           </w:p>
         </w:tc>
@@ -6209,7 +6313,7 @@
                 <w:sz w:val="15"/>
                 <w:szCs w:val="15"/>
               </w:rPr>
-              <w:t xml:space="preserve">3 289</w:t>
+              <w:t xml:space="preserve">4 152</w:t>
             </w:r>
           </w:p>
         </w:tc>
@@ -6243,7 +6347,7 @@
                 <w:sz w:val="15"/>
                 <w:szCs w:val="15"/>
               </w:rPr>
-              <w:t xml:space="preserve">3 281</w:t>
+              <w:t xml:space="preserve">4 142</w:t>
             </w:r>
           </w:p>
         </w:tc>
@@ -6336,15 +6440,15 @@
           <w:sz w:val="24"/>
           <w:szCs w:val="24"/>
         </w:rPr>
-        <w:t xml:space="preserve">a) Arellano Consultoría – estudio "Dónde Quiero Estudiar (DQE) Norte y Sur 2025: Pregrado universidades".</w:t>
-      </w:r>
-      <w:r>
-        <w:rPr>
-          <w:rFonts w:ascii="Calibri" w:cs="Calibri" w:eastAsia="Calibri" w:hAnsi="Calibri"/>
-          <w:sz w:val="24"/>
-          <w:szCs w:val="24"/>
-        </w:rPr>
-        <w:t xml:space="preserve"> Es la primera edición del estudio y recoge la opinión de jóvenes de 15 a 23 años egresados o por egresar del colegio en los principales departamentos del norte (Piura, La Libertad, </w:t>
+        <w:t xml:space="preserve">a) Arellano Consultoría – estudio "Dónde Quiero Estudiar (DQE) – Universidades Norte".</w:t>
+      </w:r>
+      <w:r>
+        <w:rPr>
+          <w:rFonts w:ascii="Calibri" w:cs="Calibri" w:eastAsia="Calibri" w:hAnsi="Calibri"/>
+          <w:sz w:val="24"/>
+          <w:szCs w:val="24"/>
+        </w:rPr>
+        <w:t xml:space="preserve"> Analiza las necesidades, motivaciones, expectativas, barreras y atributos que influyen en la elección de una universidad, así como indicadores de marca (recordación, consideración, preferencia, prestigio y confianza), con cobertura en Trujillo, Piura, Chiclayo y Chimbote. En la edición 2025, la UTP fue la primera opción para el 19 % de los potenciales universitarios encuestados de la zona norte, seguida por la UCV (16 %) y la UPAO (14 %); su preferencia fue especialmente relevante entre jóvenes de Piura, Lambayeque y Áncash. Entre las primeras opciones de carrera en el norte figuran Medicina (13 %), Derecho (13 %), Administración de Empresas (11 %), Ingeniería Civil (9 %) e Ingeniería de Sistemas (6 %). La encuesta consideró jóvenes de 15 a 23 años (estudiantes de cuarto y quinto de secundaria y egresados) de los NSE A, B, C y D con intención de estudiar una carrera universitaria; 1 264 casos en la zona norte (Piura, La Libertad, Lambayeque y Áncash); cuestionarios digitales estructurados aplicados mediante panel; y trabajo de campo del 23 de septiembre al 31 de octubre de 2025 (Gestión, sobre Arellano). </w:t>
       </w:r>
       <w:r>
         <w:rPr>
@@ -6354,34 +6458,15 @@
           <w:sz w:val="24"/>
           <w:szCs w:val="24"/>
         </w:rPr>
-        <w:t xml:space="preserve">Lambayeque</w:t>
-      </w:r>
-      <w:r>
-        <w:rPr>
-          <w:rFonts w:ascii="Calibri" w:cs="Calibri" w:eastAsia="Calibri" w:hAnsi="Calibri"/>
-          <w:sz w:val="24"/>
-          <w:szCs w:val="24"/>
-        </w:rPr>
-        <w:t xml:space="preserve"> y Áncash; 1 264 casos) y del sur. En el norte, las primeras opciones de carrera son Medicina (13 %), Derecho (13 %), Administración de Empresas (11 %), Ingeniería Civil (9 %) e Ingeniería de Sistemas (6 %), lo que confirma que las ciencias de la salud encabezan la preferencia vocacional. Los jóvenes priorizan las oportunidades laborales, una carrera bien remunerada y una amplia variedad de cursos o campos de especialización. En Chiclayo, la UTP figura en el primer lugar de preferencia, asociada a la búsqueda de rápida inserción laboral, infraestructura moderna (laboratorios) y pensiones escalonadas. </w:t>
-      </w:r>
-      <w:r>
-        <w:rPr>
-          <w:rFonts w:ascii="Calibri" w:cs="Calibri" w:eastAsia="Calibri" w:hAnsi="Calibri"/>
-          <w:b/>
-          <w:bCs/>
-          <w:sz w:val="24"/>
-          <w:szCs w:val="24"/>
-          <w:shd w:fill="FFFF00" w:color="auto" w:val="clear"/>
-        </w:rPr>
-        <w:t xml:space="preserve">[VERIFICAR]</w:t>
-      </w:r>
-      <w:r>
-        <w:rPr>
-          <w:rFonts w:ascii="Calibri" w:cs="Calibri" w:eastAsia="Calibri" w:hAnsi="Calibri"/>
-          <w:sz w:val="24"/>
-          <w:szCs w:val="24"/>
-        </w:rPr>
-        <w:t xml:space="preserve"> Cifras tomadas de la difusión del estudio en Gestión y en medios institucionales; adjuntar el informe de Arellano.</w:t>
+        <w:t xml:space="preserve">Precisiones:</w:t>
+      </w:r>
+      <w:r>
+        <w:rPr>
+          <w:rFonts w:ascii="Calibri" w:cs="Calibri" w:eastAsia="Calibri" w:hAnsi="Calibri"/>
+          <w:sz w:val="24"/>
+          <w:szCs w:val="24"/>
+        </w:rPr>
+        <w:t xml:space="preserve"> los porcentajes corresponden a la zona norte en conjunto y no a Chiclayo en particular; y las fuentes públicas no permiten atribuir la preferencia por la UTP a atributos específicos, lo que requeriría el informe completo de Arellano o su ficha técnica oficial. Estos resultados muestran que la demanda universitaria del norte es sensible a la oferta privada con posicionamiento regional, espacio en el que la USS compite como la universidad de mayor matrícula de Lambayeque.</w:t>
       </w:r>
     </w:p>
     <w:p>
@@ -7351,19 +7436,7 @@
                 <w:sz w:val="15"/>
                 <w:szCs w:val="15"/>
               </w:rPr>
-              <w:t xml:space="preserve">No identificada </w:t>
-            </w:r>
-            <w:r>
-              <w:rPr>
-                <w:rFonts w:ascii="Arial" w:cs="Arial" w:eastAsia="Arial" w:hAnsi="Arial"/>
-                <w:b/>
-                <w:bCs/>
-                <w:color w:val="000000"/>
-                <w:sz w:val="15"/>
-                <w:szCs w:val="15"/>
-                <w:shd w:fill="FFFF00" w:color="auto" w:val="clear"/>
-              </w:rPr>
-              <w:t xml:space="preserve">[VERIFICAR]</w:t>
+              <w:t xml:space="preserve">No ofrecen</w:t>
             </w:r>
           </w:p>
         </w:tc>
@@ -8879,7 +8952,7 @@
                 <w:sz w:val="15"/>
                 <w:szCs w:val="15"/>
               </w:rPr>
-              <w:t xml:space="preserve">2 219</w:t>
+              <w:t xml:space="preserve">2 801</w:t>
             </w:r>
           </w:p>
         </w:tc>
@@ -8913,7 +8986,7 @@
                 <w:sz w:val="15"/>
                 <w:szCs w:val="15"/>
               </w:rPr>
-              <w:t xml:space="preserve">2 213</w:t>
+              <w:t xml:space="preserve">2 794</w:t>
             </w:r>
           </w:p>
         </w:tc>
@@ -8947,7 +9020,7 @@
                 <w:sz w:val="15"/>
                 <w:szCs w:val="15"/>
               </w:rPr>
-              <w:t xml:space="preserve">2 208</w:t>
+              <w:t xml:space="preserve">2 788</w:t>
             </w:r>
           </w:p>
         </w:tc>
@@ -8981,7 +9054,7 @@
                 <w:sz w:val="15"/>
                 <w:szCs w:val="15"/>
               </w:rPr>
-              <w:t xml:space="preserve">2 203</w:t>
+              <w:t xml:space="preserve">2 781</w:t>
             </w:r>
           </w:p>
         </w:tc>
@@ -9015,7 +9088,7 @@
                 <w:sz w:val="15"/>
                 <w:szCs w:val="15"/>
               </w:rPr>
-              <w:t xml:space="preserve">2 198</w:t>
+              <w:t xml:space="preserve">2 774</w:t>
             </w:r>
           </w:p>
         </w:tc>
@@ -9049,7 +9122,7 @@
                 <w:sz w:val="15"/>
                 <w:szCs w:val="15"/>
               </w:rPr>
-              <w:t xml:space="preserve">2 192</w:t>
+              <w:t xml:space="preserve">2 768</w:t>
             </w:r>
           </w:p>
         </w:tc>
@@ -9083,7 +9156,7 @@
                 <w:sz w:val="15"/>
                 <w:szCs w:val="15"/>
               </w:rPr>
-              <w:t xml:space="preserve">2 187</w:t>
+              <w:t xml:space="preserve">2 761</w:t>
             </w:r>
           </w:p>
         </w:tc>
@@ -9433,7 +9506,7 @@
                 <w:sz w:val="15"/>
                 <w:szCs w:val="15"/>
               </w:rPr>
-              <w:t xml:space="preserve">1 979</w:t>
+              <w:t xml:space="preserve">2 561</w:t>
             </w:r>
           </w:p>
         </w:tc>
@@ -9467,7 +9540,7 @@
                 <w:sz w:val="15"/>
                 <w:szCs w:val="15"/>
               </w:rPr>
-              <w:t xml:space="preserve">1 973</w:t>
+              <w:t xml:space="preserve">2 554</w:t>
             </w:r>
           </w:p>
         </w:tc>
@@ -9501,7 +9574,7 @@
                 <w:sz w:val="15"/>
                 <w:szCs w:val="15"/>
               </w:rPr>
-              <w:t xml:space="preserve">1 968</w:t>
+              <w:t xml:space="preserve">2 548</w:t>
             </w:r>
           </w:p>
         </w:tc>
@@ -9535,7 +9608,7 @@
                 <w:sz w:val="15"/>
                 <w:szCs w:val="15"/>
               </w:rPr>
-              <w:t xml:space="preserve">1 963</w:t>
+              <w:t xml:space="preserve">2 541</w:t>
             </w:r>
           </w:p>
         </w:tc>
@@ -9569,7 +9642,7 @@
                 <w:sz w:val="15"/>
                 <w:szCs w:val="15"/>
               </w:rPr>
-              <w:t xml:space="preserve">1 958</w:t>
+              <w:t xml:space="preserve">2 534</w:t>
             </w:r>
           </w:p>
         </w:tc>
@@ -9603,7 +9676,7 @@
                 <w:sz w:val="15"/>
                 <w:szCs w:val="15"/>
               </w:rPr>
-              <w:t xml:space="preserve">1 952</w:t>
+              <w:t xml:space="preserve">2 528</w:t>
             </w:r>
           </w:p>
         </w:tc>
@@ -9637,7 +9710,7 @@
                 <w:sz w:val="15"/>
                 <w:szCs w:val="15"/>
               </w:rPr>
-              <w:t xml:space="preserve">1 947</w:t>
+              <w:t xml:space="preserve">2 521</w:t>
             </w:r>
           </w:p>
         </w:tc>
@@ -9672,7 +9745,7 @@
           <w:sz w:val="24"/>
           <w:szCs w:val="24"/>
         </w:rPr>
-        <w:t xml:space="preserve">Aun con el escenario conservador (1 % de interés) y tomando como oferta regional el total nacional de ingresantes de la UTP, para 2027 habría una brecha de alrededor de 870 jóvenes interesados en estudiar Farmacia y Bioquímica que no encontrarían una vacante en una universidad licenciada de la región. En el escenario medio, la brecha se acerca a los 2 000 jóvenes por año.</w:t>
+        <w:t xml:space="preserve">Aun con el escenario conservador (1 % de interés) y tomando como oferta regional el total nacional de ingresantes de la UTP, para 2027 habría una brecha de alrededor de 1 160 jóvenes interesados en estudiar Farmacia y Bioquímica que no encontrarían una vacante en una universidad licenciada de la región. En el escenario medio, la brecha supera los 2 500 jóvenes por año.</w:t>
       </w:r>
     </w:p>
     <w:p>
@@ -17596,7 +17669,7 @@
           <w:sz w:val="24"/>
           <w:szCs w:val="24"/>
         </w:rPr>
-        <w:t xml:space="preserve">La estimación referencial de demanda muestra una brecha de entre 900 y 3 200 jóvenes por año según el escenario (Tablas 4 y 7). La viabilidad final depende de validar esa estimación con una encuesta propia de intención vocacional y de la confirmación de la inversión en laboratorios y de la plana docente </w:t>
+        <w:t xml:space="preserve">La estimación referencial de demanda muestra una brecha de entre 1 100 y 4 000 jóvenes por año según el escenario (Tablas 4 y 7). La viabilidad final depende de validar esa estimación con una encuesta propia de intención vocacional y de la confirmación de la inversión en laboratorios y de la plana docente </w:t>
       </w:r>
       <w:r>
         <w:rPr>
@@ -18410,7 +18483,7 @@
           <w:sz w:val="24"/>
           <w:szCs w:val="24"/>
         </w:rPr>
-        <w:t xml:space="preserve">CPI. Estructura socioeconómica de Lambayeque (citado en SINEACE, Caracterización de la región Lambayeque).</w:t>
+        <w:t xml:space="preserve">INEI (2018). Resultados definitivos de los Censos Nacionales 2017 – Lambayeque.</w:t>
       </w:r>
     </w:p>
     <w:p>
@@ -18429,7 +18502,7 @@
           <w:sz w:val="24"/>
           <w:szCs w:val="24"/>
         </w:rPr>
-        <w:t xml:space="preserve">INEI (2018). Resultados definitivos de los Censos Nacionales 2017 – Lambayeque.</w:t>
+        <w:t xml:space="preserve">GERESA Lambayeque. Notas de prensa sobre operativos contra medicamentos falsificados.</w:t>
       </w:r>
     </w:p>
     <w:p>
@@ -18448,7 +18521,7 @@
           <w:sz w:val="24"/>
           <w:szCs w:val="24"/>
         </w:rPr>
-        <w:t xml:space="preserve">GERESA Lambayeque. Notas de prensa sobre operativos contra medicamentos falsificados.</w:t>
+        <w:t xml:space="preserve">SUNEDU. Resoluciones de licenciamiento institucional (Universidad de Chiclayo, Universidad de Lambayeque, Universidad Juan Mejía Baca, UNPRG).</w:t>
       </w:r>
     </w:p>
     <w:p>
@@ -18467,7 +18540,7 @@
           <w:sz w:val="24"/>
           <w:szCs w:val="24"/>
         </w:rPr>
-        <w:t xml:space="preserve">SUNEDU. Resoluciones de licenciamiento institucional (Universidad de Chiclayo, Universidad de Lambayeque, Universidad Juan Mejía Baca, UNPRG).</w:t>
+        <w:t xml:space="preserve">EsSalud. Anuncios de construcción de hospitales en Lambayeque.</w:t>
       </w:r>
     </w:p>
     <w:p>
@@ -18486,7 +18559,7 @@
           <w:sz w:val="24"/>
           <w:szCs w:val="24"/>
         </w:rPr>
-        <w:t xml:space="preserve">EsSalud. Anuncios de construcción de hospitales en Lambayeque.</w:t>
+        <w:t xml:space="preserve">Arellano Consultoría (2025). Dónde Quiero Estudiar (DQE) – Universidades Norte. arellano.pe/donde-quiero-estudiar.</w:t>
       </w:r>
     </w:p>
     <w:p>
@@ -18505,7 +18578,26 @@
           <w:sz w:val="24"/>
           <w:szCs w:val="24"/>
         </w:rPr>
-        <w:t xml:space="preserve">Arellano Consultoría (2025). Dónde Quiero Estudiar (DQE) Norte y Sur 2025: Pregrado universidades (difusión en Gestión) [informe completo por adjuntar].</w:t>
+        <w:t xml:space="preserve">Gestión (2025). UTP y UCV se pelean alumnado en el norte: así ciudades se reparten las preferencias.</w:t>
+      </w:r>
+    </w:p>
+    <w:p>
+      <w:pPr>
+        <w:pStyle w:val="ListParagraph"/>
+        <w:numPr>
+          <w:ilvl w:val="0"/>
+          <w:numId w:val="2"/>
+        </w:numPr>
+        <w:spacing w:after="80" w:line="360"/>
+        <w:jc w:val="both"/>
+      </w:pPr>
+      <w:r>
+        <w:rPr>
+          <w:rFonts w:ascii="Calibri" w:cs="Calibri" w:eastAsia="Calibri" w:hAnsi="Calibri"/>
+          <w:sz w:val="24"/>
+          <w:szCs w:val="24"/>
+        </w:rPr>
+        <w:t xml:space="preserve">APEIM (2025). Niveles Socioeconómicos 2025 (data ENAHO 2024). Lima, noviembre 2025.</w:t>
       </w:r>
     </w:p>
     <w:p>

</xml_diff>

<commit_message>
Use Lambayeque-specific NSE (APEIM 2025) and CPI 2026 population
APEIM's full 2025 report (p. 45) gives Lambayeque's person distribution
(AB 6.8, C 29.9, D 42.2, E 21.2), matching CPI's 2026 projections;
Table 1 now uses it with CPI's 1,412,900 population, and Tables 2-4 and
7 are recomputed with the AB+C+D share (78.8%). Adds CPI province split
to the scope section, cites the MTPE EDO 2024 table behind the Mi
Carrera ranking, and stores the new sources (the uploaded Lambayeque.pdf
and EDO 2024 were byte-identical to files already in fuentes/).

Co-Authored-By: Claude Opus 5.5 <noreply@anthropic.com>
Claude-Session: https://claude.ai/code/session_01XsGhnoXHk7nghX2nJBVJwd
</commit_message>
<xml_diff>
--- a/borradores/Informe_Pertinencia_Farmacia_Bioquimica_Lambayeque.docx
+++ b/borradores/Informe_Pertinencia_Farmacia_Bioquimica_Lambayeque.docx
@@ -804,7 +804,25 @@
           <w:sz w:val="24"/>
           <w:szCs w:val="24"/>
         </w:rPr>
-        <w:t xml:space="preserve">, de los cuales el 49,4 % son hombres y el 50,6 % mujeres; la población de hasta 14 años representa el 25,8 % del total (PRODUCE, Diagnóstico Productivo Regional Lambayeque 2024, p. 2). En el Censo 2017 la región registró 1 197 mil habitantes, el 81 % en el área urbana (BCRP, p. 2-3). La provincia de Chiclayo concentra la mayor parte de la población regional (882 306 habitantes en 2024, según INEI).</w:t>
+        <w:t xml:space="preserve">, de los cuales el 49,4 % son hombres y el 50,6 % mujeres; la población de hasta 14 años representa el 25,8 % del total (PRODUCE, Diagnóstico Productivo Regional Lambayeque 2024, p. 2). En el Censo 2017 la región registró 1 197 mil habitantes, el 81 % en el área urbana (BCRP, p. 2-3). Para 2026, CPI proyecta </w:t>
+      </w:r>
+      <w:r>
+        <w:rPr>
+          <w:rFonts w:ascii="Calibri" w:cs="Calibri" w:eastAsia="Calibri" w:hAnsi="Calibri"/>
+          <w:b/>
+          <w:bCs/>
+          <w:sz w:val="24"/>
+          <w:szCs w:val="24"/>
+        </w:rPr>
+        <w:t xml:space="preserve">1 412 900 habitantes</w:t>
+      </w:r>
+      <w:r>
+        <w:rPr>
+          <w:rFonts w:ascii="Calibri" w:cs="Calibri" w:eastAsia="Calibri" w:hAnsi="Calibri"/>
+          <w:sz w:val="24"/>
+          <w:szCs w:val="24"/>
+        </w:rPr>
+        <w:t xml:space="preserve"> en la región (4,1 % del país; 82 % urbana), de los cuales 952 700 (67,4 %) residen en la provincia de Chiclayo, 346 900 (24,6 %) en Lambayeque y 113 300 (8,0 %) en Ferreñafe (CPI Research, Market Report N° 003, 2025).</w:t>
       </w:r>
     </w:p>
     <w:p>
@@ -2842,7 +2860,7 @@
           <w:sz w:val="22"/>
           <w:szCs w:val="22"/>
         </w:rPr>
-        <w:t xml:space="preserve">Tabla 1. Distribución de la población según nivel socioeconómico (APEIM 2025)</w:t>
+        <w:t xml:space="preserve">Tabla 1. Población de Lambayeque según nivel socioeconómico, 2026</w:t>
       </w:r>
     </w:p>
     <w:tbl>
@@ -2859,13 +2877,12 @@
         </w:tblBorders>
       </w:tblPr>
       <w:tblGrid>
-        <w:gridCol w:w="2800"/>
-        <w:gridCol w:w="900"/>
-        <w:gridCol w:w="900"/>
-        <w:gridCol w:w="900"/>
-        <w:gridCol w:w="900"/>
-        <w:gridCol w:w="900"/>
-        <w:gridCol w:w="1100"/>
+        <w:gridCol w:w="3200"/>
+        <w:gridCol w:w="1000"/>
+        <w:gridCol w:w="1000"/>
+        <w:gridCol w:w="1000"/>
+        <w:gridCol w:w="1000"/>
+        <w:gridCol w:w="1200"/>
       </w:tblGrid>
       <w:tr>
         <w:trPr>
@@ -2873,7 +2890,7 @@
         </w:trPr>
         <w:tc>
           <w:tcPr>
-            <w:tcW w:type="dxa" w:w="2800"/>
+            <w:tcW w:type="dxa" w:w="3200"/>
             <w:tcBorders>
               <w:top w:val="single" w:color="000000" w:sz="4"/>
               <w:left w:val="single" w:color="000000" w:sz="4"/>
@@ -2908,7 +2925,7 @@
         </w:tc>
         <w:tc>
           <w:tcPr>
-            <w:tcW w:type="dxa" w:w="900"/>
+            <w:tcW w:type="dxa" w:w="1000"/>
             <w:tcBorders>
               <w:top w:val="single" w:color="000000" w:sz="4"/>
               <w:left w:val="single" w:color="000000" w:sz="4"/>
@@ -2937,13 +2954,13 @@
                 <w:sz w:val="15"/>
                 <w:szCs w:val="15"/>
               </w:rPr>
-              <w:t xml:space="preserve">NSE A</w:t>
-            </w:r>
-          </w:p>
-        </w:tc>
-        <w:tc>
-          <w:tcPr>
-            <w:tcW w:type="dxa" w:w="900"/>
+              <w:t xml:space="preserve">NSE AB</w:t>
+            </w:r>
+          </w:p>
+        </w:tc>
+        <w:tc>
+          <w:tcPr>
+            <w:tcW w:type="dxa" w:w="1000"/>
             <w:tcBorders>
               <w:top w:val="single" w:color="000000" w:sz="4"/>
               <w:left w:val="single" w:color="000000" w:sz="4"/>
@@ -2972,13 +2989,13 @@
                 <w:sz w:val="15"/>
                 <w:szCs w:val="15"/>
               </w:rPr>
-              <w:t xml:space="preserve">NSE B</w:t>
-            </w:r>
-          </w:p>
-        </w:tc>
-        <w:tc>
-          <w:tcPr>
-            <w:tcW w:type="dxa" w:w="900"/>
+              <w:t xml:space="preserve">NSE C</w:t>
+            </w:r>
+          </w:p>
+        </w:tc>
+        <w:tc>
+          <w:tcPr>
+            <w:tcW w:type="dxa" w:w="1000"/>
             <w:tcBorders>
               <w:top w:val="single" w:color="000000" w:sz="4"/>
               <w:left w:val="single" w:color="000000" w:sz="4"/>
@@ -3007,13 +3024,13 @@
                 <w:sz w:val="15"/>
                 <w:szCs w:val="15"/>
               </w:rPr>
-              <w:t xml:space="preserve">NSE C</w:t>
-            </w:r>
-          </w:p>
-        </w:tc>
-        <w:tc>
-          <w:tcPr>
-            <w:tcW w:type="dxa" w:w="900"/>
+              <w:t xml:space="preserve">NSE D</w:t>
+            </w:r>
+          </w:p>
+        </w:tc>
+        <w:tc>
+          <w:tcPr>
+            <w:tcW w:type="dxa" w:w="1000"/>
             <w:tcBorders>
               <w:top w:val="single" w:color="000000" w:sz="4"/>
               <w:left w:val="single" w:color="000000" w:sz="4"/>
@@ -3042,48 +3059,13 @@
                 <w:sz w:val="15"/>
                 <w:szCs w:val="15"/>
               </w:rPr>
-              <w:t xml:space="preserve">NSE D</w:t>
-            </w:r>
-          </w:p>
-        </w:tc>
-        <w:tc>
-          <w:tcPr>
-            <w:tcW w:type="dxa" w:w="900"/>
-            <w:tcBorders>
-              <w:top w:val="single" w:color="000000" w:sz="4"/>
-              <w:left w:val="single" w:color="000000" w:sz="4"/>
-              <w:bottom w:val="single" w:color="000000" w:sz="4"/>
-              <w:right w:val="single" w:color="000000" w:sz="4"/>
-            </w:tcBorders>
-            <w:shd w:fill="1F4E2C" w:color="auto" w:val="clear"/>
-            <w:tcMar>
-              <w:top w:type="dxa" w:w="20"/>
-              <w:left w:type="dxa" w:w="60"/>
-              <w:bottom w:type="dxa" w:w="20"/>
-              <w:right w:type="dxa" w:w="60"/>
-            </w:tcMar>
-            <w:vAlign w:val="center"/>
-          </w:tcPr>
-          <w:p>
-            <w:pPr>
-              <w:jc w:val="center"/>
-            </w:pPr>
-            <w:r>
-              <w:rPr>
-                <w:rFonts w:ascii="Arial" w:cs="Arial" w:eastAsia="Arial" w:hAnsi="Arial"/>
-                <w:b/>
-                <w:bCs/>
-                <w:color w:val="FFFFFF"/>
-                <w:sz w:val="15"/>
-                <w:szCs w:val="15"/>
-              </w:rPr>
               <w:t xml:space="preserve">NSE E</w:t>
             </w:r>
           </w:p>
         </w:tc>
         <w:tc>
           <w:tcPr>
-            <w:tcW w:type="dxa" w:w="1100"/>
+            <w:tcW w:type="dxa" w:w="1200"/>
             <w:tcBorders>
               <w:top w:val="single" w:color="000000" w:sz="4"/>
               <w:left w:val="single" w:color="000000" w:sz="4"/>
@@ -3123,7 +3105,7 @@
         </w:trPr>
         <w:tc>
           <w:tcPr>
-            <w:tcW w:type="dxa" w:w="2800"/>
+            <w:tcW w:type="dxa" w:w="3200"/>
             <w:tcBorders>
               <w:top w:val="single" w:color="000000" w:sz="4"/>
               <w:left w:val="single" w:color="000000" w:sz="4"/>
@@ -3151,183 +3133,149 @@
                 <w:sz w:val="15"/>
                 <w:szCs w:val="15"/>
               </w:rPr>
-              <w:t xml:space="preserve">Distribución de hogares, Perú (%)</w:t>
-            </w:r>
-          </w:p>
-        </w:tc>
-        <w:tc>
-          <w:tcPr>
-            <w:tcW w:type="dxa" w:w="900"/>
-            <w:tcBorders>
-              <w:top w:val="single" w:color="000000" w:sz="4"/>
-              <w:left w:val="single" w:color="000000" w:sz="4"/>
-              <w:bottom w:val="single" w:color="000000" w:sz="4"/>
-              <w:right w:val="single" w:color="000000" w:sz="4"/>
-            </w:tcBorders>
-            <w:tcMar>
-              <w:top w:type="dxa" w:w="20"/>
-              <w:left w:type="dxa" w:w="60"/>
-              <w:bottom w:type="dxa" w:w="20"/>
-              <w:right w:type="dxa" w:w="60"/>
-            </w:tcMar>
-            <w:vAlign w:val="center"/>
-          </w:tcPr>
-          <w:p>
-            <w:pPr>
-              <w:jc w:val="center"/>
-            </w:pPr>
-            <w:r>
-              <w:rPr>
-                <w:rFonts w:ascii="Arial" w:cs="Arial" w:eastAsia="Arial" w:hAnsi="Arial"/>
-                <w:b/>
-                <w:bCs/>
-                <w:color w:val="000000"/>
-                <w:sz w:val="15"/>
-                <w:szCs w:val="15"/>
-              </w:rPr>
-              <w:t xml:space="preserve">1,0</w:t>
-            </w:r>
-          </w:p>
-        </w:tc>
-        <w:tc>
-          <w:tcPr>
-            <w:tcW w:type="dxa" w:w="900"/>
-            <w:tcBorders>
-              <w:top w:val="single" w:color="000000" w:sz="4"/>
-              <w:left w:val="single" w:color="000000" w:sz="4"/>
-              <w:bottom w:val="single" w:color="000000" w:sz="4"/>
-              <w:right w:val="single" w:color="000000" w:sz="4"/>
-            </w:tcBorders>
-            <w:tcMar>
-              <w:top w:type="dxa" w:w="20"/>
-              <w:left w:type="dxa" w:w="60"/>
-              <w:bottom w:type="dxa" w:w="20"/>
-              <w:right w:type="dxa" w:w="60"/>
-            </w:tcMar>
-            <w:vAlign w:val="center"/>
-          </w:tcPr>
-          <w:p>
-            <w:pPr>
-              <w:jc w:val="center"/>
-            </w:pPr>
-            <w:r>
-              <w:rPr>
-                <w:rFonts w:ascii="Arial" w:cs="Arial" w:eastAsia="Arial" w:hAnsi="Arial"/>
-                <w:b/>
-                <w:bCs/>
-                <w:color w:val="000000"/>
-                <w:sz w:val="15"/>
-                <w:szCs w:val="15"/>
-              </w:rPr>
-              <w:t xml:space="preserve">9,4</w:t>
-            </w:r>
-          </w:p>
-        </w:tc>
-        <w:tc>
-          <w:tcPr>
-            <w:tcW w:type="dxa" w:w="900"/>
-            <w:tcBorders>
-              <w:top w:val="single" w:color="000000" w:sz="4"/>
-              <w:left w:val="single" w:color="000000" w:sz="4"/>
-              <w:bottom w:val="single" w:color="000000" w:sz="4"/>
-              <w:right w:val="single" w:color="000000" w:sz="4"/>
-            </w:tcBorders>
-            <w:tcMar>
-              <w:top w:type="dxa" w:w="20"/>
-              <w:left w:type="dxa" w:w="60"/>
-              <w:bottom w:type="dxa" w:w="20"/>
-              <w:right w:type="dxa" w:w="60"/>
-            </w:tcMar>
-            <w:vAlign w:val="center"/>
-          </w:tcPr>
-          <w:p>
-            <w:pPr>
-              <w:jc w:val="center"/>
-            </w:pPr>
-            <w:r>
-              <w:rPr>
-                <w:rFonts w:ascii="Arial" w:cs="Arial" w:eastAsia="Arial" w:hAnsi="Arial"/>
-                <w:b/>
-                <w:bCs/>
-                <w:color w:val="000000"/>
-                <w:sz w:val="15"/>
-                <w:szCs w:val="15"/>
-              </w:rPr>
-              <w:t xml:space="preserve">28,1</w:t>
-            </w:r>
-          </w:p>
-        </w:tc>
-        <w:tc>
-          <w:tcPr>
-            <w:tcW w:type="dxa" w:w="900"/>
-            <w:tcBorders>
-              <w:top w:val="single" w:color="000000" w:sz="4"/>
-              <w:left w:val="single" w:color="000000" w:sz="4"/>
-              <w:bottom w:val="single" w:color="000000" w:sz="4"/>
-              <w:right w:val="single" w:color="000000" w:sz="4"/>
-            </w:tcBorders>
-            <w:tcMar>
-              <w:top w:type="dxa" w:w="20"/>
-              <w:left w:type="dxa" w:w="60"/>
-              <w:bottom w:type="dxa" w:w="20"/>
-              <w:right w:type="dxa" w:w="60"/>
-            </w:tcMar>
-            <w:vAlign w:val="center"/>
-          </w:tcPr>
-          <w:p>
-            <w:pPr>
-              <w:jc w:val="center"/>
-            </w:pPr>
-            <w:r>
-              <w:rPr>
-                <w:rFonts w:ascii="Arial" w:cs="Arial" w:eastAsia="Arial" w:hAnsi="Arial"/>
-                <w:b/>
-                <w:bCs/>
-                <w:color w:val="000000"/>
-                <w:sz w:val="15"/>
-                <w:szCs w:val="15"/>
-              </w:rPr>
-              <w:t xml:space="preserve">31,3</w:t>
-            </w:r>
-          </w:p>
-        </w:tc>
-        <w:tc>
-          <w:tcPr>
-            <w:tcW w:type="dxa" w:w="900"/>
-            <w:tcBorders>
-              <w:top w:val="single" w:color="000000" w:sz="4"/>
-              <w:left w:val="single" w:color="000000" w:sz="4"/>
-              <w:bottom w:val="single" w:color="000000" w:sz="4"/>
-              <w:right w:val="single" w:color="000000" w:sz="4"/>
-            </w:tcBorders>
-            <w:tcMar>
-              <w:top w:type="dxa" w:w="20"/>
-              <w:left w:type="dxa" w:w="60"/>
-              <w:bottom w:type="dxa" w:w="20"/>
-              <w:right w:type="dxa" w:w="60"/>
-            </w:tcMar>
-            <w:vAlign w:val="center"/>
-          </w:tcPr>
-          <w:p>
-            <w:pPr>
-              <w:jc w:val="center"/>
-            </w:pPr>
-            <w:r>
-              <w:rPr>
-                <w:rFonts w:ascii="Arial" w:cs="Arial" w:eastAsia="Arial" w:hAnsi="Arial"/>
-                <w:b/>
-                <w:bCs/>
-                <w:color w:val="000000"/>
-                <w:sz w:val="15"/>
-                <w:szCs w:val="15"/>
-              </w:rPr>
-              <w:t xml:space="preserve">30,2</w:t>
-            </w:r>
-          </w:p>
-        </w:tc>
-        <w:tc>
-          <w:tcPr>
-            <w:tcW w:type="dxa" w:w="1100"/>
+              <w:t xml:space="preserve">Estructura socioeconómica de personas (%)</w:t>
+            </w:r>
+          </w:p>
+        </w:tc>
+        <w:tc>
+          <w:tcPr>
+            <w:tcW w:type="dxa" w:w="1000"/>
+            <w:tcBorders>
+              <w:top w:val="single" w:color="000000" w:sz="4"/>
+              <w:left w:val="single" w:color="000000" w:sz="4"/>
+              <w:bottom w:val="single" w:color="000000" w:sz="4"/>
+              <w:right w:val="single" w:color="000000" w:sz="4"/>
+            </w:tcBorders>
+            <w:tcMar>
+              <w:top w:type="dxa" w:w="20"/>
+              <w:left w:type="dxa" w:w="60"/>
+              <w:bottom w:type="dxa" w:w="20"/>
+              <w:right w:type="dxa" w:w="60"/>
+            </w:tcMar>
+            <w:vAlign w:val="center"/>
+          </w:tcPr>
+          <w:p>
+            <w:pPr>
+              <w:jc w:val="center"/>
+            </w:pPr>
+            <w:r>
+              <w:rPr>
+                <w:rFonts w:ascii="Arial" w:cs="Arial" w:eastAsia="Arial" w:hAnsi="Arial"/>
+                <w:b/>
+                <w:bCs/>
+                <w:color w:val="000000"/>
+                <w:sz w:val="15"/>
+                <w:szCs w:val="15"/>
+              </w:rPr>
+              <w:t xml:space="preserve">6,8</w:t>
+            </w:r>
+          </w:p>
+        </w:tc>
+        <w:tc>
+          <w:tcPr>
+            <w:tcW w:type="dxa" w:w="1000"/>
+            <w:tcBorders>
+              <w:top w:val="single" w:color="000000" w:sz="4"/>
+              <w:left w:val="single" w:color="000000" w:sz="4"/>
+              <w:bottom w:val="single" w:color="000000" w:sz="4"/>
+              <w:right w:val="single" w:color="000000" w:sz="4"/>
+            </w:tcBorders>
+            <w:tcMar>
+              <w:top w:type="dxa" w:w="20"/>
+              <w:left w:type="dxa" w:w="60"/>
+              <w:bottom w:type="dxa" w:w="20"/>
+              <w:right w:type="dxa" w:w="60"/>
+            </w:tcMar>
+            <w:vAlign w:val="center"/>
+          </w:tcPr>
+          <w:p>
+            <w:pPr>
+              <w:jc w:val="center"/>
+            </w:pPr>
+            <w:r>
+              <w:rPr>
+                <w:rFonts w:ascii="Arial" w:cs="Arial" w:eastAsia="Arial" w:hAnsi="Arial"/>
+                <w:b/>
+                <w:bCs/>
+                <w:color w:val="000000"/>
+                <w:sz w:val="15"/>
+                <w:szCs w:val="15"/>
+              </w:rPr>
+              <w:t xml:space="preserve">29,9</w:t>
+            </w:r>
+          </w:p>
+        </w:tc>
+        <w:tc>
+          <w:tcPr>
+            <w:tcW w:type="dxa" w:w="1000"/>
+            <w:tcBorders>
+              <w:top w:val="single" w:color="000000" w:sz="4"/>
+              <w:left w:val="single" w:color="000000" w:sz="4"/>
+              <w:bottom w:val="single" w:color="000000" w:sz="4"/>
+              <w:right w:val="single" w:color="000000" w:sz="4"/>
+            </w:tcBorders>
+            <w:tcMar>
+              <w:top w:type="dxa" w:w="20"/>
+              <w:left w:type="dxa" w:w="60"/>
+              <w:bottom w:type="dxa" w:w="20"/>
+              <w:right w:type="dxa" w:w="60"/>
+            </w:tcMar>
+            <w:vAlign w:val="center"/>
+          </w:tcPr>
+          <w:p>
+            <w:pPr>
+              <w:jc w:val="center"/>
+            </w:pPr>
+            <w:r>
+              <w:rPr>
+                <w:rFonts w:ascii="Arial" w:cs="Arial" w:eastAsia="Arial" w:hAnsi="Arial"/>
+                <w:b/>
+                <w:bCs/>
+                <w:color w:val="000000"/>
+                <w:sz w:val="15"/>
+                <w:szCs w:val="15"/>
+              </w:rPr>
+              <w:t xml:space="preserve">42,2</w:t>
+            </w:r>
+          </w:p>
+        </w:tc>
+        <w:tc>
+          <w:tcPr>
+            <w:tcW w:type="dxa" w:w="1000"/>
+            <w:tcBorders>
+              <w:top w:val="single" w:color="000000" w:sz="4"/>
+              <w:left w:val="single" w:color="000000" w:sz="4"/>
+              <w:bottom w:val="single" w:color="000000" w:sz="4"/>
+              <w:right w:val="single" w:color="000000" w:sz="4"/>
+            </w:tcBorders>
+            <w:tcMar>
+              <w:top w:type="dxa" w:w="20"/>
+              <w:left w:type="dxa" w:w="60"/>
+              <w:bottom w:type="dxa" w:w="20"/>
+              <w:right w:type="dxa" w:w="60"/>
+            </w:tcMar>
+            <w:vAlign w:val="center"/>
+          </w:tcPr>
+          <w:p>
+            <w:pPr>
+              <w:jc w:val="center"/>
+            </w:pPr>
+            <w:r>
+              <w:rPr>
+                <w:rFonts w:ascii="Arial" w:cs="Arial" w:eastAsia="Arial" w:hAnsi="Arial"/>
+                <w:b/>
+                <w:bCs/>
+                <w:color w:val="000000"/>
+                <w:sz w:val="15"/>
+                <w:szCs w:val="15"/>
+              </w:rPr>
+              <w:t xml:space="preserve">21,2</w:t>
+            </w:r>
+          </w:p>
+        </w:tc>
+        <w:tc>
+          <w:tcPr>
+            <w:tcW w:type="dxa" w:w="1200"/>
             <w:tcBorders>
               <w:top w:val="single" w:color="000000" w:sz="4"/>
               <w:left w:val="single" w:color="000000" w:sz="4"/>
@@ -3366,7 +3314,7 @@
         </w:trPr>
         <w:tc>
           <w:tcPr>
-            <w:tcW w:type="dxa" w:w="2800"/>
+            <w:tcW w:type="dxa" w:w="3200"/>
             <w:tcBorders>
               <w:top w:val="single" w:color="000000" w:sz="4"/>
               <w:left w:val="single" w:color="000000" w:sz="4"/>
@@ -3394,211 +3342,177 @@
                 <w:sz w:val="15"/>
                 <w:szCs w:val="15"/>
               </w:rPr>
-              <w:t xml:space="preserve">Aplicada a Lambayeque, 2024 (hab.)</w:t>
-            </w:r>
-          </w:p>
-        </w:tc>
-        <w:tc>
-          <w:tcPr>
-            <w:tcW w:type="dxa" w:w="900"/>
-            <w:tcBorders>
-              <w:top w:val="single" w:color="000000" w:sz="4"/>
-              <w:left w:val="single" w:color="000000" w:sz="4"/>
-              <w:bottom w:val="single" w:color="000000" w:sz="4"/>
-              <w:right w:val="single" w:color="000000" w:sz="4"/>
-            </w:tcBorders>
-            <w:tcMar>
-              <w:top w:type="dxa" w:w="20"/>
-              <w:left w:type="dxa" w:w="60"/>
-              <w:bottom w:type="dxa" w:w="20"/>
-              <w:right w:type="dxa" w:w="60"/>
-            </w:tcMar>
-            <w:vAlign w:val="center"/>
-          </w:tcPr>
-          <w:p>
-            <w:pPr>
-              <w:jc w:val="center"/>
-            </w:pPr>
-            <w:r>
-              <w:rPr>
-                <w:rFonts w:ascii="Arial" w:cs="Arial" w:eastAsia="Arial" w:hAnsi="Arial"/>
-                <w:b/>
-                <w:bCs/>
-                <w:color w:val="000000"/>
-                <w:sz w:val="15"/>
-                <w:szCs w:val="15"/>
-              </w:rPr>
-              <w:t xml:space="preserve">13 562</w:t>
-            </w:r>
-          </w:p>
-        </w:tc>
-        <w:tc>
-          <w:tcPr>
-            <w:tcW w:type="dxa" w:w="900"/>
-            <w:tcBorders>
-              <w:top w:val="single" w:color="000000" w:sz="4"/>
-              <w:left w:val="single" w:color="000000" w:sz="4"/>
-              <w:bottom w:val="single" w:color="000000" w:sz="4"/>
-              <w:right w:val="single" w:color="000000" w:sz="4"/>
-            </w:tcBorders>
-            <w:tcMar>
-              <w:top w:type="dxa" w:w="20"/>
-              <w:left w:type="dxa" w:w="60"/>
-              <w:bottom w:type="dxa" w:w="20"/>
-              <w:right w:type="dxa" w:w="60"/>
-            </w:tcMar>
-            <w:vAlign w:val="center"/>
-          </w:tcPr>
-          <w:p>
-            <w:pPr>
-              <w:jc w:val="center"/>
-            </w:pPr>
-            <w:r>
-              <w:rPr>
-                <w:rFonts w:ascii="Arial" w:cs="Arial" w:eastAsia="Arial" w:hAnsi="Arial"/>
-                <w:b/>
-                <w:bCs/>
-                <w:color w:val="000000"/>
-                <w:sz w:val="15"/>
-                <w:szCs w:val="15"/>
-              </w:rPr>
-              <w:t xml:space="preserve">127 483</w:t>
-            </w:r>
-          </w:p>
-        </w:tc>
-        <w:tc>
-          <w:tcPr>
-            <w:tcW w:type="dxa" w:w="900"/>
-            <w:tcBorders>
-              <w:top w:val="single" w:color="000000" w:sz="4"/>
-              <w:left w:val="single" w:color="000000" w:sz="4"/>
-              <w:bottom w:val="single" w:color="000000" w:sz="4"/>
-              <w:right w:val="single" w:color="000000" w:sz="4"/>
-            </w:tcBorders>
-            <w:tcMar>
-              <w:top w:type="dxa" w:w="20"/>
-              <w:left w:type="dxa" w:w="60"/>
-              <w:bottom w:type="dxa" w:w="20"/>
-              <w:right w:type="dxa" w:w="60"/>
-            </w:tcMar>
-            <w:vAlign w:val="center"/>
-          </w:tcPr>
-          <w:p>
-            <w:pPr>
-              <w:jc w:val="center"/>
-            </w:pPr>
-            <w:r>
-              <w:rPr>
-                <w:rFonts w:ascii="Arial" w:cs="Arial" w:eastAsia="Arial" w:hAnsi="Arial"/>
-                <w:b/>
-                <w:bCs/>
-                <w:color w:val="000000"/>
-                <w:sz w:val="15"/>
-                <w:szCs w:val="15"/>
-              </w:rPr>
-              <w:t xml:space="preserve">381 093</w:t>
-            </w:r>
-          </w:p>
-        </w:tc>
-        <w:tc>
-          <w:tcPr>
-            <w:tcW w:type="dxa" w:w="900"/>
-            <w:tcBorders>
-              <w:top w:val="single" w:color="000000" w:sz="4"/>
-              <w:left w:val="single" w:color="000000" w:sz="4"/>
-              <w:bottom w:val="single" w:color="000000" w:sz="4"/>
-              <w:right w:val="single" w:color="000000" w:sz="4"/>
-            </w:tcBorders>
-            <w:tcMar>
-              <w:top w:type="dxa" w:w="20"/>
-              <w:left w:type="dxa" w:w="60"/>
-              <w:bottom w:type="dxa" w:w="20"/>
-              <w:right w:type="dxa" w:w="60"/>
-            </w:tcMar>
-            <w:vAlign w:val="center"/>
-          </w:tcPr>
-          <w:p>
-            <w:pPr>
-              <w:jc w:val="center"/>
-            </w:pPr>
-            <w:r>
-              <w:rPr>
-                <w:rFonts w:ascii="Arial" w:cs="Arial" w:eastAsia="Arial" w:hAnsi="Arial"/>
-                <w:b/>
-                <w:bCs/>
-                <w:color w:val="000000"/>
-                <w:sz w:val="15"/>
-                <w:szCs w:val="15"/>
-              </w:rPr>
-              <w:t xml:space="preserve">424 491</w:t>
-            </w:r>
-          </w:p>
-        </w:tc>
-        <w:tc>
-          <w:tcPr>
-            <w:tcW w:type="dxa" w:w="900"/>
-            <w:tcBorders>
-              <w:top w:val="single" w:color="000000" w:sz="4"/>
-              <w:left w:val="single" w:color="000000" w:sz="4"/>
-              <w:bottom w:val="single" w:color="000000" w:sz="4"/>
-              <w:right w:val="single" w:color="000000" w:sz="4"/>
-            </w:tcBorders>
-            <w:tcMar>
-              <w:top w:type="dxa" w:w="20"/>
-              <w:left w:type="dxa" w:w="60"/>
-              <w:bottom w:type="dxa" w:w="20"/>
-              <w:right w:type="dxa" w:w="60"/>
-            </w:tcMar>
-            <w:vAlign w:val="center"/>
-          </w:tcPr>
-          <w:p>
-            <w:pPr>
-              <w:jc w:val="center"/>
-            </w:pPr>
-            <w:r>
-              <w:rPr>
-                <w:rFonts w:ascii="Arial" w:cs="Arial" w:eastAsia="Arial" w:hAnsi="Arial"/>
-                <w:b/>
-                <w:bCs/>
-                <w:color w:val="000000"/>
-                <w:sz w:val="15"/>
-                <w:szCs w:val="15"/>
-              </w:rPr>
-              <w:t xml:space="preserve">409 573</w:t>
-            </w:r>
-          </w:p>
-        </w:tc>
-        <w:tc>
-          <w:tcPr>
-            <w:tcW w:type="dxa" w:w="1100"/>
-            <w:tcBorders>
-              <w:top w:val="single" w:color="000000" w:sz="4"/>
-              <w:left w:val="single" w:color="000000" w:sz="4"/>
-              <w:bottom w:val="single" w:color="000000" w:sz="4"/>
-              <w:right w:val="single" w:color="000000" w:sz="4"/>
-            </w:tcBorders>
-            <w:tcMar>
-              <w:top w:type="dxa" w:w="20"/>
-              <w:left w:type="dxa" w:w="60"/>
-              <w:bottom w:type="dxa" w:w="20"/>
-              <w:right w:type="dxa" w:w="60"/>
-            </w:tcMar>
-            <w:vAlign w:val="center"/>
-          </w:tcPr>
-          <w:p>
-            <w:pPr>
-              <w:jc w:val="center"/>
-            </w:pPr>
-            <w:r>
-              <w:rPr>
-                <w:rFonts w:ascii="Arial" w:cs="Arial" w:eastAsia="Arial" w:hAnsi="Arial"/>
-                <w:b/>
-                <w:bCs/>
-                <w:color w:val="000000"/>
-                <w:sz w:val="15"/>
-                <w:szCs w:val="15"/>
-              </w:rPr>
-              <w:t xml:space="preserve">1 356 202</w:t>
+              <w:t xml:space="preserve">Población proyectada 2026 (hab.)</w:t>
+            </w:r>
+          </w:p>
+        </w:tc>
+        <w:tc>
+          <w:tcPr>
+            <w:tcW w:type="dxa" w:w="1000"/>
+            <w:tcBorders>
+              <w:top w:val="single" w:color="000000" w:sz="4"/>
+              <w:left w:val="single" w:color="000000" w:sz="4"/>
+              <w:bottom w:val="single" w:color="000000" w:sz="4"/>
+              <w:right w:val="single" w:color="000000" w:sz="4"/>
+            </w:tcBorders>
+            <w:tcMar>
+              <w:top w:type="dxa" w:w="20"/>
+              <w:left w:type="dxa" w:w="60"/>
+              <w:bottom w:type="dxa" w:w="20"/>
+              <w:right w:type="dxa" w:w="60"/>
+            </w:tcMar>
+            <w:vAlign w:val="center"/>
+          </w:tcPr>
+          <w:p>
+            <w:pPr>
+              <w:jc w:val="center"/>
+            </w:pPr>
+            <w:r>
+              <w:rPr>
+                <w:rFonts w:ascii="Arial" w:cs="Arial" w:eastAsia="Arial" w:hAnsi="Arial"/>
+                <w:b/>
+                <w:bCs/>
+                <w:color w:val="000000"/>
+                <w:sz w:val="15"/>
+                <w:szCs w:val="15"/>
+              </w:rPr>
+              <w:t xml:space="preserve">96 077</w:t>
+            </w:r>
+          </w:p>
+        </w:tc>
+        <w:tc>
+          <w:tcPr>
+            <w:tcW w:type="dxa" w:w="1000"/>
+            <w:tcBorders>
+              <w:top w:val="single" w:color="000000" w:sz="4"/>
+              <w:left w:val="single" w:color="000000" w:sz="4"/>
+              <w:bottom w:val="single" w:color="000000" w:sz="4"/>
+              <w:right w:val="single" w:color="000000" w:sz="4"/>
+            </w:tcBorders>
+            <w:tcMar>
+              <w:top w:type="dxa" w:w="20"/>
+              <w:left w:type="dxa" w:w="60"/>
+              <w:bottom w:type="dxa" w:w="20"/>
+              <w:right w:type="dxa" w:w="60"/>
+            </w:tcMar>
+            <w:vAlign w:val="center"/>
+          </w:tcPr>
+          <w:p>
+            <w:pPr>
+              <w:jc w:val="center"/>
+            </w:pPr>
+            <w:r>
+              <w:rPr>
+                <w:rFonts w:ascii="Arial" w:cs="Arial" w:eastAsia="Arial" w:hAnsi="Arial"/>
+                <w:b/>
+                <w:bCs/>
+                <w:color w:val="000000"/>
+                <w:sz w:val="15"/>
+                <w:szCs w:val="15"/>
+              </w:rPr>
+              <w:t xml:space="preserve">422 457</w:t>
+            </w:r>
+          </w:p>
+        </w:tc>
+        <w:tc>
+          <w:tcPr>
+            <w:tcW w:type="dxa" w:w="1000"/>
+            <w:tcBorders>
+              <w:top w:val="single" w:color="000000" w:sz="4"/>
+              <w:left w:val="single" w:color="000000" w:sz="4"/>
+              <w:bottom w:val="single" w:color="000000" w:sz="4"/>
+              <w:right w:val="single" w:color="000000" w:sz="4"/>
+            </w:tcBorders>
+            <w:tcMar>
+              <w:top w:type="dxa" w:w="20"/>
+              <w:left w:type="dxa" w:w="60"/>
+              <w:bottom w:type="dxa" w:w="20"/>
+              <w:right w:type="dxa" w:w="60"/>
+            </w:tcMar>
+            <w:vAlign w:val="center"/>
+          </w:tcPr>
+          <w:p>
+            <w:pPr>
+              <w:jc w:val="center"/>
+            </w:pPr>
+            <w:r>
+              <w:rPr>
+                <w:rFonts w:ascii="Arial" w:cs="Arial" w:eastAsia="Arial" w:hAnsi="Arial"/>
+                <w:b/>
+                <w:bCs/>
+                <w:color w:val="000000"/>
+                <w:sz w:val="15"/>
+                <w:szCs w:val="15"/>
+              </w:rPr>
+              <w:t xml:space="preserve">596 244</w:t>
+            </w:r>
+          </w:p>
+        </w:tc>
+        <w:tc>
+          <w:tcPr>
+            <w:tcW w:type="dxa" w:w="1000"/>
+            <w:tcBorders>
+              <w:top w:val="single" w:color="000000" w:sz="4"/>
+              <w:left w:val="single" w:color="000000" w:sz="4"/>
+              <w:bottom w:val="single" w:color="000000" w:sz="4"/>
+              <w:right w:val="single" w:color="000000" w:sz="4"/>
+            </w:tcBorders>
+            <w:tcMar>
+              <w:top w:type="dxa" w:w="20"/>
+              <w:left w:type="dxa" w:w="60"/>
+              <w:bottom w:type="dxa" w:w="20"/>
+              <w:right w:type="dxa" w:w="60"/>
+            </w:tcMar>
+            <w:vAlign w:val="center"/>
+          </w:tcPr>
+          <w:p>
+            <w:pPr>
+              <w:jc w:val="center"/>
+            </w:pPr>
+            <w:r>
+              <w:rPr>
+                <w:rFonts w:ascii="Arial" w:cs="Arial" w:eastAsia="Arial" w:hAnsi="Arial"/>
+                <w:b/>
+                <w:bCs/>
+                <w:color w:val="000000"/>
+                <w:sz w:val="15"/>
+                <w:szCs w:val="15"/>
+              </w:rPr>
+              <w:t xml:space="preserve">299 535</w:t>
+            </w:r>
+          </w:p>
+        </w:tc>
+        <w:tc>
+          <w:tcPr>
+            <w:tcW w:type="dxa" w:w="1200"/>
+            <w:tcBorders>
+              <w:top w:val="single" w:color="000000" w:sz="4"/>
+              <w:left w:val="single" w:color="000000" w:sz="4"/>
+              <w:bottom w:val="single" w:color="000000" w:sz="4"/>
+              <w:right w:val="single" w:color="000000" w:sz="4"/>
+            </w:tcBorders>
+            <w:tcMar>
+              <w:top w:type="dxa" w:w="20"/>
+              <w:left w:type="dxa" w:w="60"/>
+              <w:bottom w:type="dxa" w:w="20"/>
+              <w:right w:type="dxa" w:w="60"/>
+            </w:tcMar>
+            <w:vAlign w:val="center"/>
+          </w:tcPr>
+          <w:p>
+            <w:pPr>
+              <w:jc w:val="center"/>
+            </w:pPr>
+            <w:r>
+              <w:rPr>
+                <w:rFonts w:ascii="Arial" w:cs="Arial" w:eastAsia="Arial" w:hAnsi="Arial"/>
+                <w:b/>
+                <w:bCs/>
+                <w:color w:val="000000"/>
+                <w:sz w:val="15"/>
+                <w:szCs w:val="15"/>
+              </w:rPr>
+              <w:t xml:space="preserve">1 412 900</w:t>
             </w:r>
           </w:p>
         </w:tc>
@@ -3619,32 +3533,7 @@
           <w:sz w:val="14"/>
           <w:szCs w:val="14"/>
         </w:rPr>
-        <w:t xml:space="preserve">Fuente: APEIM, Niveles Socioeconómicos 2025 (data ENAHO 2024), p. 17; población total, PRODUCE (2025). La síntesis de APEIM solo publica Lima Metropolitana y Perú total; se aplica la distribución nacional a Lambayeque. Actualizar con el informe completo de APEIM, que incluye el desagregado por departamento </w:t>
-      </w:r>
-      <w:r>
-        <w:rPr>
-          <w:rFonts w:ascii="Arial" w:cs="Arial" w:eastAsia="Arial" w:hAnsi="Arial"/>
-          <w:b/>
-          <w:bCs/>
-          <w:i/>
-          <w:iCs/>
-          <w:sz w:val="14"/>
-          <w:szCs w:val="14"/>
-          <w:shd w:fill="FFFF00" w:color="auto" w:val="clear"/>
-        </w:rPr>
-        <w:t xml:space="preserve">[VERIFICAR]</w:t>
-      </w:r>
-      <w:r>
-        <w:rPr>
-          <w:rFonts w:ascii="Arial" w:cs="Arial" w:eastAsia="Arial" w:hAnsi="Arial"/>
-          <w:b/>
-          <w:bCs/>
-          <w:i/>
-          <w:iCs/>
-          <w:sz w:val="14"/>
-          <w:szCs w:val="14"/>
-        </w:rPr>
-        <w:t xml:space="preserve">.</w:t>
+        <w:t xml:space="preserve">Fuente: APEIM, Niveles Socioeconómicos 2025 – Informe completo (data ENAHO 2024), distribución de personas por departamento, p. 45 (muestra de Lambayeque: 4 703 casos; error ±1,4 %); población proyectada 2026, CPI Research, Market Report N° 003 – Proyecciones Poblacionales 2025, cuadros 2 y 5. La suma por NSE puede diferir del total por redondeo.</w:t>
       </w:r>
     </w:p>
     <w:p>
@@ -4466,7 +4355,7 @@
                 <w:sz w:val="15"/>
                 <w:szCs w:val="15"/>
               </w:rPr>
-              <w:t xml:space="preserve">Jóvenes que no estudian, en NSE B, C y D (68,8 %)</w:t>
+              <w:t xml:space="preserve">Jóvenes que no estudian, en NSE AB, C y D (78,8 %)</w:t>
             </w:r>
           </w:p>
         </w:tc>
@@ -4534,7 +4423,7 @@
                 <w:sz w:val="15"/>
                 <w:szCs w:val="15"/>
               </w:rPr>
-              <w:t xml:space="preserve">141 052</w:t>
+              <w:t xml:space="preserve">161 554</w:t>
             </w:r>
           </w:p>
         </w:tc>
@@ -4555,7 +4444,7 @@
           <w:sz w:val="14"/>
           <w:szCs w:val="14"/>
         </w:rPr>
-        <w:t xml:space="preserve">Fuente: INEI – ENAHO 2024, en GRTPE–OSEL Lambayeque, Mercado laboral de los jóvenes en la región Lambayeque (2025), p. 56; NSE, APEIM 2025. Elaboración propia para las dos últimas filas.</w:t>
+        <w:t xml:space="preserve">Fuente: INEI – ENAHO 2024, en GRTPE–OSEL Lambayeque, Mercado laboral de los jóvenes en la región Lambayeque (2025), p. 56; NSE de Lambayeque, APEIM 2025 (p. 45). Elaboración propia para las dos últimas filas. El NSE AB se incluye completo porque APEIM no separa el NSE B a nivel departamental; el NSE A es una fracción menor (1,0 % a nivel nacional).</w:t>
       </w:r>
     </w:p>
     <w:p>
@@ -4569,7 +4458,7 @@
           <w:sz w:val="24"/>
           <w:szCs w:val="24"/>
         </w:rPr>
-        <w:t xml:space="preserve">La población objetivo se aproxima con los jóvenes de 15 a 29 años que no estudian, es decir, los que solo trabajan o no estudian ni trabajan (NINI), pertenecientes a los NSE B, C y D. Este grupo corresponde al criterio de no estar cursando estudios superiores. Cabe resaltar que Lambayeque ocupa el </w:t>
+        <w:t xml:space="preserve">La población objetivo se aproxima con los jóvenes de 15 a 29 años que no estudian, es decir, los que solo trabajan o no estudian ni trabajan (NINI), pertenecientes a los NSE B, C y D (se usa el agregado AB, C y D, que representa el 78,8 % de la población de Lambayeque). Este grupo corresponde al criterio de no estar cursando estudios superiores. Cabe resaltar que Lambayeque ocupa el </w:t>
       </w:r>
       <w:r>
         <w:rPr>
@@ -4970,7 +4859,7 @@
                 <w:sz w:val="15"/>
                 <w:szCs w:val="15"/>
               </w:rPr>
-              <w:t xml:space="preserve">140 047</w:t>
+              <w:t xml:space="preserve">160 402</w:t>
             </w:r>
           </w:p>
         </w:tc>
@@ -5004,7 +4893,7 @@
                 <w:sz w:val="15"/>
                 <w:szCs w:val="15"/>
               </w:rPr>
-              <w:t xml:space="preserve">139 713</w:t>
+              <w:t xml:space="preserve">160 020</w:t>
             </w:r>
           </w:p>
         </w:tc>
@@ -5038,7 +4927,7 @@
                 <w:sz w:val="15"/>
                 <w:szCs w:val="15"/>
               </w:rPr>
-              <w:t xml:space="preserve">139 380</w:t>
+              <w:t xml:space="preserve">159 639</w:t>
             </w:r>
           </w:p>
         </w:tc>
@@ -5072,7 +4961,7 @@
                 <w:sz w:val="15"/>
                 <w:szCs w:val="15"/>
               </w:rPr>
-              <w:t xml:space="preserve">139 048</w:t>
+              <w:t xml:space="preserve">159 259</w:t>
             </w:r>
           </w:p>
         </w:tc>
@@ -5106,7 +4995,7 @@
                 <w:sz w:val="15"/>
                 <w:szCs w:val="15"/>
               </w:rPr>
-              <w:t xml:space="preserve">138 717</w:t>
+              <w:t xml:space="preserve">158 879</w:t>
             </w:r>
           </w:p>
         </w:tc>
@@ -5140,7 +5029,7 @@
                 <w:sz w:val="15"/>
                 <w:szCs w:val="15"/>
               </w:rPr>
-              <w:t xml:space="preserve">138 387</w:t>
+              <w:t xml:space="preserve">158 501</w:t>
             </w:r>
           </w:p>
         </w:tc>
@@ -5174,7 +5063,7 @@
                 <w:sz w:val="15"/>
                 <w:szCs w:val="15"/>
               </w:rPr>
-              <w:t xml:space="preserve">138 057</w:t>
+              <w:t xml:space="preserve">158 123</w:t>
             </w:r>
           </w:p>
         </w:tc>
@@ -5589,7 +5478,7 @@
                 <w:sz w:val="15"/>
                 <w:szCs w:val="15"/>
               </w:rPr>
-              <w:t xml:space="preserve">1 400</w:t>
+              <w:t xml:space="preserve">1 604</w:t>
             </w:r>
           </w:p>
         </w:tc>
@@ -5623,7 +5512,7 @@
                 <w:sz w:val="15"/>
                 <w:szCs w:val="15"/>
               </w:rPr>
-              <w:t xml:space="preserve">1 397</w:t>
+              <w:t xml:space="preserve">1 600</w:t>
             </w:r>
           </w:p>
         </w:tc>
@@ -5657,7 +5546,7 @@
                 <w:sz w:val="15"/>
                 <w:szCs w:val="15"/>
               </w:rPr>
-              <w:t xml:space="preserve">1 394</w:t>
+              <w:t xml:space="preserve">1 596</w:t>
             </w:r>
           </w:p>
         </w:tc>
@@ -5691,7 +5580,7 @@
                 <w:sz w:val="15"/>
                 <w:szCs w:val="15"/>
               </w:rPr>
-              <w:t xml:space="preserve">1 390</w:t>
+              <w:t xml:space="preserve">1 593</w:t>
             </w:r>
           </w:p>
         </w:tc>
@@ -5725,7 +5614,7 @@
                 <w:sz w:val="15"/>
                 <w:szCs w:val="15"/>
               </w:rPr>
-              <w:t xml:space="preserve">1 387</w:t>
+              <w:t xml:space="preserve">1 589</w:t>
             </w:r>
           </w:p>
         </w:tc>
@@ -5759,7 +5648,7 @@
                 <w:sz w:val="15"/>
                 <w:szCs w:val="15"/>
               </w:rPr>
-              <w:t xml:space="preserve">1 384</w:t>
+              <w:t xml:space="preserve">1 585</w:t>
             </w:r>
           </w:p>
         </w:tc>
@@ -5793,7 +5682,7 @@
                 <w:sz w:val="15"/>
                 <w:szCs w:val="15"/>
               </w:rPr>
-              <w:t xml:space="preserve">1 381</w:t>
+              <w:t xml:space="preserve">1 581</w:t>
             </w:r>
           </w:p>
         </w:tc>
@@ -5866,7 +5755,7 @@
                 <w:sz w:val="15"/>
                 <w:szCs w:val="15"/>
               </w:rPr>
-              <w:t xml:space="preserve">2 801</w:t>
+              <w:t xml:space="preserve">3 208</w:t>
             </w:r>
           </w:p>
         </w:tc>
@@ -5900,7 +5789,7 @@
                 <w:sz w:val="15"/>
                 <w:szCs w:val="15"/>
               </w:rPr>
-              <w:t xml:space="preserve">2 794</w:t>
+              <w:t xml:space="preserve">3 200</w:t>
             </w:r>
           </w:p>
         </w:tc>
@@ -5934,7 +5823,7 @@
                 <w:sz w:val="15"/>
                 <w:szCs w:val="15"/>
               </w:rPr>
-              <w:t xml:space="preserve">2 788</w:t>
+              <w:t xml:space="preserve">3 193</w:t>
             </w:r>
           </w:p>
         </w:tc>
@@ -5968,7 +5857,7 @@
                 <w:sz w:val="15"/>
                 <w:szCs w:val="15"/>
               </w:rPr>
-              <w:t xml:space="preserve">2 781</w:t>
+              <w:t xml:space="preserve">3 185</w:t>
             </w:r>
           </w:p>
         </w:tc>
@@ -6002,7 +5891,7 @@
                 <w:sz w:val="15"/>
                 <w:szCs w:val="15"/>
               </w:rPr>
-              <w:t xml:space="preserve">2 774</w:t>
+              <w:t xml:space="preserve">3 178</w:t>
             </w:r>
           </w:p>
         </w:tc>
@@ -6036,7 +5925,7 @@
                 <w:sz w:val="15"/>
                 <w:szCs w:val="15"/>
               </w:rPr>
-              <w:t xml:space="preserve">2 768</w:t>
+              <w:t xml:space="preserve">3 170</w:t>
             </w:r>
           </w:p>
         </w:tc>
@@ -6070,7 +5959,7 @@
                 <w:sz w:val="15"/>
                 <w:szCs w:val="15"/>
               </w:rPr>
-              <w:t xml:space="preserve">2 761</w:t>
+              <w:t xml:space="preserve">3 162</w:t>
             </w:r>
           </w:p>
         </w:tc>
@@ -6143,7 +6032,7 @@
                 <w:sz w:val="15"/>
                 <w:szCs w:val="15"/>
               </w:rPr>
-              <w:t xml:space="preserve">4 201</w:t>
+              <w:t xml:space="preserve">4 812</w:t>
             </w:r>
           </w:p>
         </w:tc>
@@ -6177,7 +6066,7 @@
                 <w:sz w:val="15"/>
                 <w:szCs w:val="15"/>
               </w:rPr>
-              <w:t xml:space="preserve">4 191</w:t>
+              <w:t xml:space="preserve">4 801</w:t>
             </w:r>
           </w:p>
         </w:tc>
@@ -6211,7 +6100,7 @@
                 <w:sz w:val="15"/>
                 <w:szCs w:val="15"/>
               </w:rPr>
-              <w:t xml:space="preserve">4 181</w:t>
+              <w:t xml:space="preserve">4 789</w:t>
             </w:r>
           </w:p>
         </w:tc>
@@ -6245,7 +6134,7 @@
                 <w:sz w:val="15"/>
                 <w:szCs w:val="15"/>
               </w:rPr>
-              <w:t xml:space="preserve">4 171</w:t>
+              <w:t xml:space="preserve">4 778</w:t>
             </w:r>
           </w:p>
         </w:tc>
@@ -6279,7 +6168,7 @@
                 <w:sz w:val="15"/>
                 <w:szCs w:val="15"/>
               </w:rPr>
-              <w:t xml:space="preserve">4 162</w:t>
+              <w:t xml:space="preserve">4 766</w:t>
             </w:r>
           </w:p>
         </w:tc>
@@ -6313,7 +6202,7 @@
                 <w:sz w:val="15"/>
                 <w:szCs w:val="15"/>
               </w:rPr>
-              <w:t xml:space="preserve">4 152</w:t>
+              <w:t xml:space="preserve">4 755</w:t>
             </w:r>
           </w:p>
         </w:tc>
@@ -6347,7 +6236,7 @@
                 <w:sz w:val="15"/>
                 <w:szCs w:val="15"/>
               </w:rPr>
-              <w:t xml:space="preserve">4 142</w:t>
+              <w:t xml:space="preserve">4 744</w:t>
             </w:r>
           </w:p>
         </w:tc>
@@ -6562,26 +6451,7 @@
           <w:sz w:val="24"/>
           <w:szCs w:val="24"/>
         </w:rPr>
-        <w:t xml:space="preserve">, después de Sistemas y Cómputo, Contabilidad e Impuestos, Enfermería, Educación Primaria y Educación Inicial </w:t>
-      </w:r>
-      <w:r>
-        <w:rPr>
-          <w:rFonts w:ascii="Calibri" w:cs="Calibri" w:eastAsia="Calibri" w:hAnsi="Calibri"/>
-          <w:b/>
-          <w:bCs/>
-          <w:sz w:val="24"/>
-          <w:szCs w:val="24"/>
-          <w:shd w:fill="FFFF00" w:color="auto" w:val="clear"/>
-        </w:rPr>
-        <w:t xml:space="preserve">[VERIFICAR]</w:t>
-      </w:r>
-      <w:r>
-        <w:rPr>
-          <w:rFonts w:ascii="Calibri" w:cs="Calibri" w:eastAsia="Calibri" w:hAnsi="Calibri"/>
-          <w:sz w:val="24"/>
-          <w:szCs w:val="24"/>
-        </w:rPr>
-        <w:t xml:space="preserve"> (registrar fecha de consulta). Las ciencias de la salud (Enfermería y Farmacia) aparecen así entre las seis familias con mayor demanda en la región.</w:t>
+        <w:t xml:space="preserve">, después de Sistemas y Cómputo, Contabilidad e Impuestos, Enfermería, Educación Primaria y Educación Inicial (consulta del 26/09/2026). El ranking se construye con la Encuesta de Demanda Ocupacional 2024 del MTPE (cuadro "Perú: puestos de trabajo a contratar para profesionales universitarios, según carreras, 2025"), con familias de carreras agrupadas a 3 dígitos según el Clasificador Nacional de Programas e Instituciones de Educación Superior del INEI (2018); cada puesto puede solicitar más de una carrera y se consideran puestos de naturaleza continua y temporal. Las ciencias de la salud (Enfermería y Farmacia) aparecen así entre las seis familias con mayor demanda en la región.</w:t>
       </w:r>
     </w:p>
     <w:p>
@@ -8952,7 +8822,7 @@
                 <w:sz w:val="15"/>
                 <w:szCs w:val="15"/>
               </w:rPr>
-              <w:t xml:space="preserve">2 801</w:t>
+              <w:t xml:space="preserve">3 208</w:t>
             </w:r>
           </w:p>
         </w:tc>
@@ -8986,7 +8856,7 @@
                 <w:sz w:val="15"/>
                 <w:szCs w:val="15"/>
               </w:rPr>
-              <w:t xml:space="preserve">2 794</w:t>
+              <w:t xml:space="preserve">3 200</w:t>
             </w:r>
           </w:p>
         </w:tc>
@@ -9020,7 +8890,7 @@
                 <w:sz w:val="15"/>
                 <w:szCs w:val="15"/>
               </w:rPr>
-              <w:t xml:space="preserve">2 788</w:t>
+              <w:t xml:space="preserve">3 193</w:t>
             </w:r>
           </w:p>
         </w:tc>
@@ -9054,7 +8924,7 @@
                 <w:sz w:val="15"/>
                 <w:szCs w:val="15"/>
               </w:rPr>
-              <w:t xml:space="preserve">2 781</w:t>
+              <w:t xml:space="preserve">3 185</w:t>
             </w:r>
           </w:p>
         </w:tc>
@@ -9088,7 +8958,7 @@
                 <w:sz w:val="15"/>
                 <w:szCs w:val="15"/>
               </w:rPr>
-              <w:t xml:space="preserve">2 774</w:t>
+              <w:t xml:space="preserve">3 178</w:t>
             </w:r>
           </w:p>
         </w:tc>
@@ -9122,7 +8992,7 @@
                 <w:sz w:val="15"/>
                 <w:szCs w:val="15"/>
               </w:rPr>
-              <w:t xml:space="preserve">2 768</w:t>
+              <w:t xml:space="preserve">3 170</w:t>
             </w:r>
           </w:p>
         </w:tc>
@@ -9156,7 +9026,7 @@
                 <w:sz w:val="15"/>
                 <w:szCs w:val="15"/>
               </w:rPr>
-              <w:t xml:space="preserve">2 761</w:t>
+              <w:t xml:space="preserve">3 162</w:t>
             </w:r>
           </w:p>
         </w:tc>
@@ -9506,7 +9376,7 @@
                 <w:sz w:val="15"/>
                 <w:szCs w:val="15"/>
               </w:rPr>
-              <w:t xml:space="preserve">2 561</w:t>
+              <w:t xml:space="preserve">2 968</w:t>
             </w:r>
           </w:p>
         </w:tc>
@@ -9540,7 +9410,7 @@
                 <w:sz w:val="15"/>
                 <w:szCs w:val="15"/>
               </w:rPr>
-              <w:t xml:space="preserve">2 554</w:t>
+              <w:t xml:space="preserve">2 960</w:t>
             </w:r>
           </w:p>
         </w:tc>
@@ -9574,7 +9444,7 @@
                 <w:sz w:val="15"/>
                 <w:szCs w:val="15"/>
               </w:rPr>
-              <w:t xml:space="preserve">2 548</w:t>
+              <w:t xml:space="preserve">2 953</w:t>
             </w:r>
           </w:p>
         </w:tc>
@@ -9608,7 +9478,7 @@
                 <w:sz w:val="15"/>
                 <w:szCs w:val="15"/>
               </w:rPr>
-              <w:t xml:space="preserve">2 541</w:t>
+              <w:t xml:space="preserve">2 945</w:t>
             </w:r>
           </w:p>
         </w:tc>
@@ -9642,7 +9512,7 @@
                 <w:sz w:val="15"/>
                 <w:szCs w:val="15"/>
               </w:rPr>
-              <w:t xml:space="preserve">2 534</w:t>
+              <w:t xml:space="preserve">2 938</w:t>
             </w:r>
           </w:p>
         </w:tc>
@@ -9676,7 +9546,7 @@
                 <w:sz w:val="15"/>
                 <w:szCs w:val="15"/>
               </w:rPr>
-              <w:t xml:space="preserve">2 528</w:t>
+              <w:t xml:space="preserve">2 930</w:t>
             </w:r>
           </w:p>
         </w:tc>
@@ -9710,7 +9580,7 @@
                 <w:sz w:val="15"/>
                 <w:szCs w:val="15"/>
               </w:rPr>
-              <w:t xml:space="preserve">2 521</w:t>
+              <w:t xml:space="preserve">2 922</w:t>
             </w:r>
           </w:p>
         </w:tc>
@@ -9745,7 +9615,7 @@
           <w:sz w:val="24"/>
           <w:szCs w:val="24"/>
         </w:rPr>
-        <w:t xml:space="preserve">Aun con el escenario conservador (1 % de interés) y tomando como oferta regional el total nacional de ingresantes de la UTP, para 2027 habría una brecha de alrededor de 1 160 jóvenes interesados en estudiar Farmacia y Bioquímica que no encontrarían una vacante en una universidad licenciada de la región. En el escenario medio, la brecha supera los 2 500 jóvenes por año.</w:t>
+        <w:t xml:space="preserve">Aun con el escenario conservador (1 % de interés) y tomando como oferta regional el total nacional de ingresantes de la UTP, para 2027 habría una brecha de alrededor de 1 360 jóvenes interesados en estudiar Farmacia y Bioquímica que no encontrarían una vacante en una universidad licenciada de la región. En el escenario medio, la brecha se acerca a los 3 000 jóvenes por año.</w:t>
       </w:r>
     </w:p>
     <w:p>
@@ -17669,7 +17539,7 @@
           <w:sz w:val="24"/>
           <w:szCs w:val="24"/>
         </w:rPr>
-        <w:t xml:space="preserve">La estimación referencial de demanda muestra una brecha de entre 1 100 y 4 000 jóvenes por año según el escenario (Tablas 4 y 7). La viabilidad final depende de validar esa estimación con una encuesta propia de intención vocacional y de la confirmación de la inversión en laboratorios y de la plana docente </w:t>
+        <w:t xml:space="preserve">La estimación referencial de demanda muestra una brecha de entre 1 300 y 4 600 jóvenes por año según el escenario (Tablas 4 y 7). La viabilidad final depende de validar esa estimación con una encuesta propia de intención vocacional y de la confirmación de la inversión en laboratorios y de la plana docente </w:t>
       </w:r>
       <w:r>
         <w:rPr>
@@ -18597,7 +18467,45 @@
           <w:sz w:val="24"/>
           <w:szCs w:val="24"/>
         </w:rPr>
-        <w:t xml:space="preserve">APEIM (2025). Niveles Socioeconómicos 2025 (data ENAHO 2024). Lima, noviembre 2025.</w:t>
+        <w:t xml:space="preserve">APEIM (2025). Niveles Socioeconómicos 2025 – Síntesis e Informe completo (data ENAHO 2024). Lima, noviembre 2025.</w:t>
+      </w:r>
+    </w:p>
+    <w:p>
+      <w:pPr>
+        <w:pStyle w:val="ListParagraph"/>
+        <w:numPr>
+          <w:ilvl w:val="0"/>
+          <w:numId w:val="2"/>
+        </w:numPr>
+        <w:spacing w:after="80" w:line="360"/>
+        <w:jc w:val="both"/>
+      </w:pPr>
+      <w:r>
+        <w:rPr>
+          <w:rFonts w:ascii="Calibri" w:cs="Calibri" w:eastAsia="Calibri" w:hAnsi="Calibri"/>
+          <w:sz w:val="24"/>
+          <w:szCs w:val="24"/>
+        </w:rPr>
+        <w:t xml:space="preserve">CPI Research (2025). Market Report N° 003: Proyecciones Poblacionales 2025 (Perú 2026).</w:t>
+      </w:r>
+    </w:p>
+    <w:p>
+      <w:pPr>
+        <w:pStyle w:val="ListParagraph"/>
+        <w:numPr>
+          <w:ilvl w:val="0"/>
+          <w:numId w:val="2"/>
+        </w:numPr>
+        <w:spacing w:after="80" w:line="360"/>
+        <w:jc w:val="both"/>
+      </w:pPr>
+      <w:r>
+        <w:rPr>
+          <w:rFonts w:ascii="Calibri" w:cs="Calibri" w:eastAsia="Calibri" w:hAnsi="Calibri"/>
+          <w:sz w:val="24"/>
+          <w:szCs w:val="24"/>
+        </w:rPr>
+        <w:t xml:space="preserve">MTPE – DGPE (2024). Encuesta de Demanda Ocupacional 2024: Perú, puestos de trabajo a contratar para profesionales universitarios, según carreras, 2025.</w:t>
       </w:r>
     </w:p>
     <w:p>

</xml_diff>

<commit_message>
Add strategic actors' expectations (7.7.1-7.7.5) from the original report
Adapts pages 22-24 of the Piura report to Farmacia y Bioquímica:
human-capital demanders, MINSA-DIGEMID/GERESA, business associations
and guilds, universities, and OPS/OMS (replacing OIT), plus the closing
alignment statement. Adds MINSA's Política Nacional de Medicamentos and
the OPS/OMS position paper on pharmaceutical services to references.

Co-Authored-By: Claude Opus 5.5 <noreply@anthropic.com>
Claude-Session: https://claude.ai/code/session_01XsGhnoXHk7nghX2nJBVJwd
</commit_message>
<xml_diff>
--- a/borradores/Informe_Pertinencia_Farmacia_Bioquimica_Lambayeque.docx
+++ b/borradores/Informe_Pertinencia_Farmacia_Bioquimica_Lambayeque.docx
@@ -16727,6 +16727,864 @@
     </w:p>
     <w:p>
       <w:pPr>
+        <w:spacing w:after="120" w:line="360"/>
+        <w:jc w:val="both"/>
+      </w:pPr>
+      <w:r>
+        <w:rPr>
+          <w:rFonts w:ascii="Calibri" w:cs="Calibri" w:eastAsia="Calibri" w:hAnsi="Calibri"/>
+          <w:sz w:val="24"/>
+          <w:szCs w:val="24"/>
+        </w:rPr>
+        <w:t xml:space="preserve">A continuación se presentan las expectativas de los actores estratégicos respecto del perfil del Químico Farmacéutico que requiere la región.</w:t>
+      </w:r>
+    </w:p>
+    <w:p>
+      <w:pPr>
+        <w:keepNext/>
+        <w:spacing w:after="100" w:before="160" w:line="360"/>
+        <w:jc w:val="both"/>
+      </w:pPr>
+      <w:r>
+        <w:rPr>
+          <w:rFonts w:ascii="Calibri" w:cs="Calibri" w:eastAsia="Calibri" w:hAnsi="Calibri"/>
+          <w:b/>
+          <w:bCs/>
+          <w:sz w:val="24"/>
+          <w:szCs w:val="24"/>
+        </w:rPr>
+        <w:t xml:space="preserve">7.7.1.- Demandantes de capital humano</w:t>
+      </w:r>
+    </w:p>
+    <w:p>
+      <w:pPr>
+        <w:spacing w:after="120" w:line="360"/>
+        <w:jc w:val="both"/>
+      </w:pPr>
+      <w:r>
+        <w:rPr>
+          <w:rFonts w:ascii="Calibri" w:cs="Calibri" w:eastAsia="Calibri" w:hAnsi="Calibri"/>
+          <w:sz w:val="24"/>
+          <w:szCs w:val="24"/>
+        </w:rPr>
+        <w:t xml:space="preserve">Las farmacias, boticas, cadenas, droguerías, clínicas, laboratorios clínicos y empresas agroindustriales de la región esperan que el profesional cuente con los siguientes conocimientos mínimos:</w:t>
+      </w:r>
+    </w:p>
+    <w:p>
+      <w:pPr>
+        <w:pStyle w:val="ListParagraph"/>
+        <w:numPr>
+          <w:ilvl w:val="0"/>
+          <w:numId w:val="2"/>
+        </w:numPr>
+        <w:spacing w:after="80" w:line="360"/>
+        <w:jc w:val="both"/>
+      </w:pPr>
+      <w:r>
+        <w:rPr>
+          <w:rFonts w:ascii="Calibri" w:cs="Calibri" w:eastAsia="Calibri" w:hAnsi="Calibri"/>
+          <w:sz w:val="24"/>
+          <w:szCs w:val="24"/>
+        </w:rPr>
+        <w:t xml:space="preserve">Legislación farmacéutica y normativa sanitaria (Ley N.° 29459 y Reglamento de Establecimientos Farmacéuticos).</w:t>
+      </w:r>
+    </w:p>
+    <w:p>
+      <w:pPr>
+        <w:pStyle w:val="ListParagraph"/>
+        <w:numPr>
+          <w:ilvl w:val="0"/>
+          <w:numId w:val="2"/>
+        </w:numPr>
+        <w:spacing w:after="80" w:line="360"/>
+        <w:jc w:val="both"/>
+      </w:pPr>
+      <w:r>
+        <w:rPr>
+          <w:rFonts w:ascii="Calibri" w:cs="Calibri" w:eastAsia="Calibri" w:hAnsi="Calibri"/>
+          <w:sz w:val="24"/>
+          <w:szCs w:val="24"/>
+        </w:rPr>
+        <w:t xml:space="preserve">Buenas Prácticas de Almacenamiento, Dispensación, Distribución y Farmacovigilancia.</w:t>
+      </w:r>
+    </w:p>
+    <w:p>
+      <w:pPr>
+        <w:pStyle w:val="ListParagraph"/>
+        <w:numPr>
+          <w:ilvl w:val="0"/>
+          <w:numId w:val="2"/>
+        </w:numPr>
+        <w:spacing w:after="80" w:line="360"/>
+        <w:jc w:val="both"/>
+      </w:pPr>
+      <w:r>
+        <w:rPr>
+          <w:rFonts w:ascii="Calibri" w:cs="Calibri" w:eastAsia="Calibri" w:hAnsi="Calibri"/>
+          <w:sz w:val="24"/>
+          <w:szCs w:val="24"/>
+        </w:rPr>
+        <w:t xml:space="preserve">Gestión de inventarios, cadena de frío y control de productos vencidos o falsificados.</w:t>
+      </w:r>
+    </w:p>
+    <w:p>
+      <w:pPr>
+        <w:pStyle w:val="ListParagraph"/>
+        <w:numPr>
+          <w:ilvl w:val="0"/>
+          <w:numId w:val="2"/>
+        </w:numPr>
+        <w:spacing w:after="80" w:line="360"/>
+        <w:jc w:val="both"/>
+      </w:pPr>
+      <w:r>
+        <w:rPr>
+          <w:rFonts w:ascii="Calibri" w:cs="Calibri" w:eastAsia="Calibri" w:hAnsi="Calibri"/>
+          <w:sz w:val="24"/>
+          <w:szCs w:val="24"/>
+        </w:rPr>
+        <w:t xml:space="preserve">Atención farmacéutica y seguimiento farmacoterapéutico.</w:t>
+      </w:r>
+    </w:p>
+    <w:p>
+      <w:pPr>
+        <w:pStyle w:val="ListParagraph"/>
+        <w:numPr>
+          <w:ilvl w:val="0"/>
+          <w:numId w:val="2"/>
+        </w:numPr>
+        <w:spacing w:after="80" w:line="360"/>
+        <w:jc w:val="both"/>
+      </w:pPr>
+      <w:r>
+        <w:rPr>
+          <w:rFonts w:ascii="Calibri" w:cs="Calibri" w:eastAsia="Calibri" w:hAnsi="Calibri"/>
+          <w:sz w:val="24"/>
+          <w:szCs w:val="24"/>
+        </w:rPr>
+        <w:t xml:space="preserve">Análisis clínicos, bioquímicos y de control de calidad.</w:t>
+      </w:r>
+    </w:p>
+    <w:p>
+      <w:pPr>
+        <w:pStyle w:val="ListParagraph"/>
+        <w:numPr>
+          <w:ilvl w:val="0"/>
+          <w:numId w:val="2"/>
+        </w:numPr>
+        <w:spacing w:after="80" w:line="360"/>
+        <w:jc w:val="both"/>
+      </w:pPr>
+      <w:r>
+        <w:rPr>
+          <w:rFonts w:ascii="Calibri" w:cs="Calibri" w:eastAsia="Calibri" w:hAnsi="Calibri"/>
+          <w:sz w:val="24"/>
+          <w:szCs w:val="24"/>
+        </w:rPr>
+        <w:t xml:space="preserve">Manejo de sistemas de información y tecnologías aplicadas a la gestión farmacéutica.</w:t>
+      </w:r>
+    </w:p>
+    <w:p>
+      <w:pPr>
+        <w:spacing w:after="120" w:line="360"/>
+        <w:jc w:val="both"/>
+      </w:pPr>
+      <w:r>
+        <w:rPr>
+          <w:rFonts w:ascii="Calibri" w:cs="Calibri" w:eastAsia="Calibri" w:hAnsi="Calibri"/>
+          <w:sz w:val="24"/>
+          <w:szCs w:val="24"/>
+        </w:rPr>
+        <w:t xml:space="preserve">Las habilidades blandas mínimas requeridas son:</w:t>
+      </w:r>
+    </w:p>
+    <w:p>
+      <w:pPr>
+        <w:pStyle w:val="ListParagraph"/>
+        <w:numPr>
+          <w:ilvl w:val="0"/>
+          <w:numId w:val="2"/>
+        </w:numPr>
+        <w:spacing w:after="80" w:line="360"/>
+        <w:jc w:val="both"/>
+      </w:pPr>
+      <w:r>
+        <w:rPr>
+          <w:rFonts w:ascii="Calibri" w:cs="Calibri" w:eastAsia="Calibri" w:hAnsi="Calibri"/>
+          <w:sz w:val="24"/>
+          <w:szCs w:val="24"/>
+        </w:rPr>
+        <w:t xml:space="preserve">Ética y responsabilidad profesional</w:t>
+      </w:r>
+    </w:p>
+    <w:p>
+      <w:pPr>
+        <w:pStyle w:val="ListParagraph"/>
+        <w:numPr>
+          <w:ilvl w:val="0"/>
+          <w:numId w:val="2"/>
+        </w:numPr>
+        <w:spacing w:after="80" w:line="360"/>
+        <w:jc w:val="both"/>
+      </w:pPr>
+      <w:r>
+        <w:rPr>
+          <w:rFonts w:ascii="Calibri" w:cs="Calibri" w:eastAsia="Calibri" w:hAnsi="Calibri"/>
+          <w:sz w:val="24"/>
+          <w:szCs w:val="24"/>
+        </w:rPr>
+        <w:t xml:space="preserve">Comunicación asertiva con pacientes y equipos de salud</w:t>
+      </w:r>
+    </w:p>
+    <w:p>
+      <w:pPr>
+        <w:pStyle w:val="ListParagraph"/>
+        <w:numPr>
+          <w:ilvl w:val="0"/>
+          <w:numId w:val="2"/>
+        </w:numPr>
+        <w:spacing w:after="80" w:line="360"/>
+        <w:jc w:val="both"/>
+      </w:pPr>
+      <w:r>
+        <w:rPr>
+          <w:rFonts w:ascii="Calibri" w:cs="Calibri" w:eastAsia="Calibri" w:hAnsi="Calibri"/>
+          <w:sz w:val="24"/>
+          <w:szCs w:val="24"/>
+        </w:rPr>
+        <w:t xml:space="preserve">Toma de decisiones</w:t>
+      </w:r>
+    </w:p>
+    <w:p>
+      <w:pPr>
+        <w:pStyle w:val="ListParagraph"/>
+        <w:numPr>
+          <w:ilvl w:val="0"/>
+          <w:numId w:val="2"/>
+        </w:numPr>
+        <w:spacing w:after="80" w:line="360"/>
+        <w:jc w:val="both"/>
+      </w:pPr>
+      <w:r>
+        <w:rPr>
+          <w:rFonts w:ascii="Calibri" w:cs="Calibri" w:eastAsia="Calibri" w:hAnsi="Calibri"/>
+          <w:sz w:val="24"/>
+          <w:szCs w:val="24"/>
+        </w:rPr>
+        <w:t xml:space="preserve">Pensamiento crítico</w:t>
+      </w:r>
+    </w:p>
+    <w:p>
+      <w:pPr>
+        <w:pStyle w:val="ListParagraph"/>
+        <w:numPr>
+          <w:ilvl w:val="0"/>
+          <w:numId w:val="2"/>
+        </w:numPr>
+        <w:spacing w:after="80" w:line="360"/>
+        <w:jc w:val="both"/>
+      </w:pPr>
+      <w:r>
+        <w:rPr>
+          <w:rFonts w:ascii="Calibri" w:cs="Calibri" w:eastAsia="Calibri" w:hAnsi="Calibri"/>
+          <w:sz w:val="24"/>
+          <w:szCs w:val="24"/>
+        </w:rPr>
+        <w:t xml:space="preserve">Trabajo en equipo</w:t>
+      </w:r>
+    </w:p>
+    <w:p>
+      <w:pPr>
+        <w:pStyle w:val="ListParagraph"/>
+        <w:numPr>
+          <w:ilvl w:val="0"/>
+          <w:numId w:val="2"/>
+        </w:numPr>
+        <w:spacing w:after="80" w:line="360"/>
+        <w:jc w:val="both"/>
+      </w:pPr>
+      <w:r>
+        <w:rPr>
+          <w:rFonts w:ascii="Calibri" w:cs="Calibri" w:eastAsia="Calibri" w:hAnsi="Calibri"/>
+          <w:sz w:val="24"/>
+          <w:szCs w:val="24"/>
+        </w:rPr>
+        <w:t xml:space="preserve">Orientación al servicio</w:t>
+      </w:r>
+    </w:p>
+    <w:p>
+      <w:pPr>
+        <w:keepNext/>
+        <w:spacing w:after="100" w:before="160" w:line="360"/>
+        <w:jc w:val="both"/>
+      </w:pPr>
+      <w:r>
+        <w:rPr>
+          <w:rFonts w:ascii="Calibri" w:cs="Calibri" w:eastAsia="Calibri" w:hAnsi="Calibri"/>
+          <w:b/>
+          <w:bCs/>
+          <w:sz w:val="24"/>
+          <w:szCs w:val="24"/>
+        </w:rPr>
+        <w:t xml:space="preserve">7.7.2.- Ministerio de Salud (MINSA – DIGEMID) y GERESA Lambayeque</w:t>
+      </w:r>
+    </w:p>
+    <w:p>
+      <w:pPr>
+        <w:pStyle w:val="ListParagraph"/>
+        <w:numPr>
+          <w:ilvl w:val="0"/>
+          <w:numId w:val="2"/>
+        </w:numPr>
+        <w:spacing w:after="80" w:line="360"/>
+        <w:jc w:val="both"/>
+      </w:pPr>
+      <w:r>
+        <w:rPr>
+          <w:rFonts w:ascii="Calibri" w:cs="Calibri" w:eastAsia="Calibri" w:hAnsi="Calibri"/>
+          <w:sz w:val="24"/>
+          <w:szCs w:val="24"/>
+        </w:rPr>
+        <w:t xml:space="preserve">Que garantice el acceso, la calidad, la seguridad y el uso racional de los medicamentos, en concordancia con la Política Nacional de Medicamentos.</w:t>
+      </w:r>
+    </w:p>
+    <w:p>
+      <w:pPr>
+        <w:pStyle w:val="ListParagraph"/>
+        <w:numPr>
+          <w:ilvl w:val="0"/>
+          <w:numId w:val="2"/>
+        </w:numPr>
+        <w:spacing w:after="80" w:line="360"/>
+        <w:jc w:val="both"/>
+      </w:pPr>
+      <w:r>
+        <w:rPr>
+          <w:rFonts w:ascii="Calibri" w:cs="Calibri" w:eastAsia="Calibri" w:hAnsi="Calibri"/>
+          <w:sz w:val="24"/>
+          <w:szCs w:val="24"/>
+        </w:rPr>
+        <w:t xml:space="preserve">Que cumpla y haga cumplir la normativa sanitaria como director técnico de establecimientos farmacéuticos.</w:t>
+      </w:r>
+    </w:p>
+    <w:p>
+      <w:pPr>
+        <w:pStyle w:val="ListParagraph"/>
+        <w:numPr>
+          <w:ilvl w:val="0"/>
+          <w:numId w:val="2"/>
+        </w:numPr>
+        <w:spacing w:after="80" w:line="360"/>
+        <w:jc w:val="both"/>
+      </w:pPr>
+      <w:r>
+        <w:rPr>
+          <w:rFonts w:ascii="Calibri" w:cs="Calibri" w:eastAsia="Calibri" w:hAnsi="Calibri"/>
+          <w:sz w:val="24"/>
+          <w:szCs w:val="24"/>
+        </w:rPr>
+        <w:t xml:space="preserve">Que contribuya a la vigilancia sanitaria y al combate del comercio ilegal de medicamentos (productos falsificados, de contrabando o sin registro sanitario).</w:t>
+      </w:r>
+    </w:p>
+    <w:p>
+      <w:pPr>
+        <w:pStyle w:val="ListParagraph"/>
+        <w:numPr>
+          <w:ilvl w:val="0"/>
+          <w:numId w:val="2"/>
+        </w:numPr>
+        <w:spacing w:after="80" w:line="360"/>
+        <w:jc w:val="both"/>
+      </w:pPr>
+      <w:r>
+        <w:rPr>
+          <w:rFonts w:ascii="Calibri" w:cs="Calibri" w:eastAsia="Calibri" w:hAnsi="Calibri"/>
+          <w:sz w:val="24"/>
+          <w:szCs w:val="24"/>
+        </w:rPr>
+        <w:t xml:space="preserve">Que participe en la farmacovigilancia y tecnovigilancia, notificando reacciones adversas y alertas sanitarias.</w:t>
+      </w:r>
+    </w:p>
+    <w:p>
+      <w:pPr>
+        <w:pStyle w:val="ListParagraph"/>
+        <w:numPr>
+          <w:ilvl w:val="0"/>
+          <w:numId w:val="2"/>
+        </w:numPr>
+        <w:spacing w:after="80" w:line="360"/>
+        <w:jc w:val="both"/>
+      </w:pPr>
+      <w:r>
+        <w:rPr>
+          <w:rFonts w:ascii="Calibri" w:cs="Calibri" w:eastAsia="Calibri" w:hAnsi="Calibri"/>
+          <w:sz w:val="24"/>
+          <w:szCs w:val="24"/>
+        </w:rPr>
+        <w:t xml:space="preserve">Que fortalezca la gestión del suministro de medicamentos en los establecimientos públicos (SISMED) y evite el desabastecimiento.</w:t>
+      </w:r>
+    </w:p>
+    <w:p>
+      <w:pPr>
+        <w:pStyle w:val="ListParagraph"/>
+        <w:numPr>
+          <w:ilvl w:val="0"/>
+          <w:numId w:val="2"/>
+        </w:numPr>
+        <w:spacing w:after="80" w:line="360"/>
+        <w:jc w:val="both"/>
+      </w:pPr>
+      <w:r>
+        <w:rPr>
+          <w:rFonts w:ascii="Calibri" w:cs="Calibri" w:eastAsia="Calibri" w:hAnsi="Calibri"/>
+          <w:sz w:val="24"/>
+          <w:szCs w:val="24"/>
+        </w:rPr>
+        <w:t xml:space="preserve">Que realice su SERUMS y se integre a la atención primaria de salud, especialmente en las zonas con menor cobertura.</w:t>
+      </w:r>
+    </w:p>
+    <w:p>
+      <w:pPr>
+        <w:keepNext/>
+        <w:spacing w:after="100" w:before="160" w:line="360"/>
+        <w:jc w:val="both"/>
+      </w:pPr>
+      <w:r>
+        <w:rPr>
+          <w:rFonts w:ascii="Calibri" w:cs="Calibri" w:eastAsia="Calibri" w:hAnsi="Calibri"/>
+          <w:b/>
+          <w:bCs/>
+          <w:sz w:val="24"/>
+          <w:szCs w:val="24"/>
+        </w:rPr>
+        <w:t xml:space="preserve">7.7.3.- Asociaciones empresariales y gremios</w:t>
+      </w:r>
+    </w:p>
+    <w:p>
+      <w:pPr>
+        <w:spacing w:after="120" w:line="360"/>
+        <w:jc w:val="both"/>
+      </w:pPr>
+      <w:r>
+        <w:rPr>
+          <w:rFonts w:ascii="Calibri" w:cs="Calibri" w:eastAsia="Calibri" w:hAnsi="Calibri"/>
+          <w:sz w:val="24"/>
+          <w:szCs w:val="24"/>
+        </w:rPr>
+        <w:t xml:space="preserve">Incluye a las asociaciones de boticas y cadenas farmacéuticas, droguerías, laboratorios y empresas agroindustriales, así como al Colegio Químico Farmacéutico Departamental de Lambayeque.</w:t>
+      </w:r>
+    </w:p>
+    <w:p>
+      <w:pPr>
+        <w:pStyle w:val="ListParagraph"/>
+        <w:numPr>
+          <w:ilvl w:val="0"/>
+          <w:numId w:val="2"/>
+        </w:numPr>
+        <w:spacing w:after="80" w:line="360"/>
+        <w:jc w:val="both"/>
+      </w:pPr>
+      <w:r>
+        <w:rPr>
+          <w:rFonts w:ascii="Calibri" w:cs="Calibri" w:eastAsia="Calibri" w:hAnsi="Calibri"/>
+          <w:sz w:val="24"/>
+          <w:szCs w:val="24"/>
+        </w:rPr>
+        <w:t xml:space="preserve">Conocimiento sólido de la normativa sanitaria y empresarial aplicable al sector farmacéutico.</w:t>
+      </w:r>
+    </w:p>
+    <w:p>
+      <w:pPr>
+        <w:pStyle w:val="ListParagraph"/>
+        <w:numPr>
+          <w:ilvl w:val="0"/>
+          <w:numId w:val="2"/>
+        </w:numPr>
+        <w:spacing w:after="80" w:line="360"/>
+        <w:jc w:val="both"/>
+      </w:pPr>
+      <w:r>
+        <w:rPr>
+          <w:rFonts w:ascii="Calibri" w:cs="Calibri" w:eastAsia="Calibri" w:hAnsi="Calibri"/>
+          <w:sz w:val="24"/>
+          <w:szCs w:val="24"/>
+        </w:rPr>
+        <w:t xml:space="preserve">Capacidad para gestionar establecimientos farmacéuticos de forma formal, rentable y sostenible.</w:t>
+      </w:r>
+    </w:p>
+    <w:p>
+      <w:pPr>
+        <w:pStyle w:val="ListParagraph"/>
+        <w:numPr>
+          <w:ilvl w:val="0"/>
+          <w:numId w:val="2"/>
+        </w:numPr>
+        <w:spacing w:after="80" w:line="360"/>
+        <w:jc w:val="both"/>
+      </w:pPr>
+      <w:r>
+        <w:rPr>
+          <w:rFonts w:ascii="Calibri" w:cs="Calibri" w:eastAsia="Calibri" w:hAnsi="Calibri"/>
+          <w:sz w:val="24"/>
+          <w:szCs w:val="24"/>
+        </w:rPr>
+        <w:t xml:space="preserve">Habilidad para identificar oportunidades de emprendimiento (boticas, droguerías, laboratorios de productos naturales).</w:t>
+      </w:r>
+    </w:p>
+    <w:p>
+      <w:pPr>
+        <w:pStyle w:val="ListParagraph"/>
+        <w:numPr>
+          <w:ilvl w:val="0"/>
+          <w:numId w:val="2"/>
+        </w:numPr>
+        <w:spacing w:after="80" w:line="360"/>
+        <w:jc w:val="both"/>
+      </w:pPr>
+      <w:r>
+        <w:rPr>
+          <w:rFonts w:ascii="Calibri" w:cs="Calibri" w:eastAsia="Calibri" w:hAnsi="Calibri"/>
+          <w:sz w:val="24"/>
+          <w:szCs w:val="24"/>
+        </w:rPr>
+        <w:t xml:space="preserve">Reconocimiento de la importancia de la formalización del comercio farmacéutico.</w:t>
+      </w:r>
+    </w:p>
+    <w:p>
+      <w:pPr>
+        <w:pStyle w:val="ListParagraph"/>
+        <w:numPr>
+          <w:ilvl w:val="0"/>
+          <w:numId w:val="2"/>
+        </w:numPr>
+        <w:spacing w:after="80" w:line="360"/>
+        <w:jc w:val="both"/>
+      </w:pPr>
+      <w:r>
+        <w:rPr>
+          <w:rFonts w:ascii="Calibri" w:cs="Calibri" w:eastAsia="Calibri" w:hAnsi="Calibri"/>
+          <w:sz w:val="24"/>
+          <w:szCs w:val="24"/>
+        </w:rPr>
+        <w:t xml:space="preserve">Competencia en control de calidad e inocuidad para la industria alimentaria y agroexportadora.</w:t>
+      </w:r>
+    </w:p>
+    <w:p>
+      <w:pPr>
+        <w:pStyle w:val="ListParagraph"/>
+        <w:numPr>
+          <w:ilvl w:val="0"/>
+          <w:numId w:val="2"/>
+        </w:numPr>
+        <w:spacing w:after="80" w:line="360"/>
+        <w:jc w:val="both"/>
+      </w:pPr>
+      <w:r>
+        <w:rPr>
+          <w:rFonts w:ascii="Calibri" w:cs="Calibri" w:eastAsia="Calibri" w:hAnsi="Calibri"/>
+          <w:sz w:val="24"/>
+          <w:szCs w:val="24"/>
+        </w:rPr>
+        <w:t xml:space="preserve">Adhesión a estándares éticos, responsabilidad ambiental y buenas prácticas en toda la cadena del medicamento.</w:t>
+      </w:r>
+    </w:p>
+    <w:p>
+      <w:pPr>
+        <w:pStyle w:val="ListParagraph"/>
+        <w:numPr>
+          <w:ilvl w:val="0"/>
+          <w:numId w:val="2"/>
+        </w:numPr>
+        <w:spacing w:after="80" w:line="360"/>
+        <w:jc w:val="both"/>
+      </w:pPr>
+      <w:r>
+        <w:rPr>
+          <w:rFonts w:ascii="Calibri" w:cs="Calibri" w:eastAsia="Calibri" w:hAnsi="Calibri"/>
+          <w:sz w:val="24"/>
+          <w:szCs w:val="24"/>
+        </w:rPr>
+        <w:t xml:space="preserve">Actualización profesional continua y colegiatura habilitada para el ejercicio.</w:t>
+      </w:r>
+    </w:p>
+    <w:p>
+      <w:pPr>
+        <w:keepNext/>
+        <w:spacing w:after="100" w:before="160" w:line="360"/>
+        <w:jc w:val="both"/>
+      </w:pPr>
+      <w:r>
+        <w:rPr>
+          <w:rFonts w:ascii="Calibri" w:cs="Calibri" w:eastAsia="Calibri" w:hAnsi="Calibri"/>
+          <w:b/>
+          <w:bCs/>
+          <w:sz w:val="24"/>
+          <w:szCs w:val="24"/>
+        </w:rPr>
+        <w:t xml:space="preserve">7.7.4.- Universidades</w:t>
+      </w:r>
+    </w:p>
+    <w:p>
+      <w:pPr>
+        <w:pStyle w:val="ListParagraph"/>
+        <w:numPr>
+          <w:ilvl w:val="0"/>
+          <w:numId w:val="2"/>
+        </w:numPr>
+        <w:spacing w:after="80" w:line="360"/>
+        <w:jc w:val="both"/>
+      </w:pPr>
+      <w:r>
+        <w:rPr>
+          <w:rFonts w:ascii="Calibri" w:cs="Calibri" w:eastAsia="Calibri" w:hAnsi="Calibri"/>
+          <w:sz w:val="24"/>
+          <w:szCs w:val="24"/>
+        </w:rPr>
+        <w:t xml:space="preserve">Formación científica sólida en química, biología, bioquímica y farmacología, con énfasis en el trabajo de laboratorio.</w:t>
+      </w:r>
+    </w:p>
+    <w:p>
+      <w:pPr>
+        <w:pStyle w:val="ListParagraph"/>
+        <w:numPr>
+          <w:ilvl w:val="0"/>
+          <w:numId w:val="2"/>
+        </w:numPr>
+        <w:spacing w:after="80" w:line="360"/>
+        <w:jc w:val="both"/>
+      </w:pPr>
+      <w:r>
+        <w:rPr>
+          <w:rFonts w:ascii="Calibri" w:cs="Calibri" w:eastAsia="Calibri" w:hAnsi="Calibri"/>
+          <w:sz w:val="24"/>
+          <w:szCs w:val="24"/>
+        </w:rPr>
+        <w:t xml:space="preserve">Capacidad para investigar y generar conocimiento en productos naturales, farmacología, bioquímica clínica y salud pública.</w:t>
+      </w:r>
+    </w:p>
+    <w:p>
+      <w:pPr>
+        <w:pStyle w:val="ListParagraph"/>
+        <w:numPr>
+          <w:ilvl w:val="0"/>
+          <w:numId w:val="2"/>
+        </w:numPr>
+        <w:spacing w:after="80" w:line="360"/>
+        <w:jc w:val="both"/>
+      </w:pPr>
+      <w:r>
+        <w:rPr>
+          <w:rFonts w:ascii="Calibri" w:cs="Calibri" w:eastAsia="Calibri" w:hAnsi="Calibri"/>
+          <w:sz w:val="24"/>
+          <w:szCs w:val="24"/>
+        </w:rPr>
+        <w:t xml:space="preserve">Preparación para aprobar el Examen Nacional de Farmacia y Bioquímica (ENAFB) y desempeñar el SERUMS.</w:t>
+      </w:r>
+    </w:p>
+    <w:p>
+      <w:pPr>
+        <w:pStyle w:val="ListParagraph"/>
+        <w:numPr>
+          <w:ilvl w:val="0"/>
+          <w:numId w:val="2"/>
+        </w:numPr>
+        <w:spacing w:after="80" w:line="360"/>
+        <w:jc w:val="both"/>
+      </w:pPr>
+      <w:r>
+        <w:rPr>
+          <w:rFonts w:ascii="Calibri" w:cs="Calibri" w:eastAsia="Calibri" w:hAnsi="Calibri"/>
+          <w:sz w:val="24"/>
+          <w:szCs w:val="24"/>
+        </w:rPr>
+        <w:t xml:space="preserve">Trabajo interdisciplinario con los programas de ciencias de la salud (Medicina, Enfermería, Tecnología Médica).</w:t>
+      </w:r>
+    </w:p>
+    <w:p>
+      <w:pPr>
+        <w:pStyle w:val="ListParagraph"/>
+        <w:numPr>
+          <w:ilvl w:val="0"/>
+          <w:numId w:val="2"/>
+        </w:numPr>
+        <w:spacing w:after="80" w:line="360"/>
+        <w:jc w:val="both"/>
+      </w:pPr>
+      <w:r>
+        <w:rPr>
+          <w:rFonts w:ascii="Calibri" w:cs="Calibri" w:eastAsia="Calibri" w:hAnsi="Calibri"/>
+          <w:sz w:val="24"/>
+          <w:szCs w:val="24"/>
+        </w:rPr>
+        <w:t xml:space="preserve">Dominio de las tecnologías de la información y la comunicación en su desempeño profesional.</w:t>
+      </w:r>
+    </w:p>
+    <w:p>
+      <w:pPr>
+        <w:pStyle w:val="ListParagraph"/>
+        <w:numPr>
+          <w:ilvl w:val="0"/>
+          <w:numId w:val="2"/>
+        </w:numPr>
+        <w:spacing w:after="80" w:line="360"/>
+        <w:jc w:val="both"/>
+      </w:pPr>
+      <w:r>
+        <w:rPr>
+          <w:rFonts w:ascii="Calibri" w:cs="Calibri" w:eastAsia="Calibri" w:hAnsi="Calibri"/>
+          <w:sz w:val="24"/>
+          <w:szCs w:val="24"/>
+        </w:rPr>
+        <w:t xml:space="preserve">Compromiso con la responsabilidad social universitaria y la educación sanitaria de la población.</w:t>
+      </w:r>
+    </w:p>
+    <w:p>
+      <w:pPr>
+        <w:pStyle w:val="ListParagraph"/>
+        <w:numPr>
+          <w:ilvl w:val="0"/>
+          <w:numId w:val="2"/>
+        </w:numPr>
+        <w:spacing w:after="80" w:line="360"/>
+        <w:jc w:val="both"/>
+      </w:pPr>
+      <w:r>
+        <w:rPr>
+          <w:rFonts w:ascii="Calibri" w:cs="Calibri" w:eastAsia="Calibri" w:hAnsi="Calibri"/>
+          <w:sz w:val="24"/>
+          <w:szCs w:val="24"/>
+        </w:rPr>
+        <w:t xml:space="preserve">Disposición para la formación continua a nivel de especialización y posgrado.</w:t>
+      </w:r>
+    </w:p>
+    <w:p>
+      <w:pPr>
+        <w:keepNext/>
+        <w:spacing w:after="100" w:before="160" w:line="360"/>
+        <w:jc w:val="both"/>
+      </w:pPr>
+      <w:r>
+        <w:rPr>
+          <w:rFonts w:ascii="Calibri" w:cs="Calibri" w:eastAsia="Calibri" w:hAnsi="Calibri"/>
+          <w:b/>
+          <w:bCs/>
+          <w:sz w:val="24"/>
+          <w:szCs w:val="24"/>
+        </w:rPr>
+        <w:t xml:space="preserve">7.7.5.- Organización Panamericana de la Salud / Organización Mundial de la Salud (OPS/OMS)</w:t>
+      </w:r>
+    </w:p>
+    <w:p>
+      <w:pPr>
+        <w:pStyle w:val="ListParagraph"/>
+        <w:numPr>
+          <w:ilvl w:val="0"/>
+          <w:numId w:val="2"/>
+        </w:numPr>
+        <w:spacing w:after="80" w:line="360"/>
+        <w:jc w:val="both"/>
+      </w:pPr>
+      <w:r>
+        <w:rPr>
+          <w:rFonts w:ascii="Calibri" w:cs="Calibri" w:eastAsia="Calibri" w:hAnsi="Calibri"/>
+          <w:sz w:val="24"/>
+          <w:szCs w:val="24"/>
+        </w:rPr>
+        <w:t xml:space="preserve">Que promueva el uso racional de medicamentos y contribuya a contener la resistencia a los antimicrobianos.</w:t>
+      </w:r>
+    </w:p>
+    <w:p>
+      <w:pPr>
+        <w:pStyle w:val="ListParagraph"/>
+        <w:numPr>
+          <w:ilvl w:val="0"/>
+          <w:numId w:val="2"/>
+        </w:numPr>
+        <w:spacing w:after="80" w:line="360"/>
+        <w:jc w:val="both"/>
+      </w:pPr>
+      <w:r>
+        <w:rPr>
+          <w:rFonts w:ascii="Calibri" w:cs="Calibri" w:eastAsia="Calibri" w:hAnsi="Calibri"/>
+          <w:sz w:val="24"/>
+          <w:szCs w:val="24"/>
+        </w:rPr>
+        <w:t xml:space="preserve">Que desarrolle servicios farmacéuticos basados en la atención primaria de salud, centrados en la persona, la familia y la comunidad.</w:t>
+      </w:r>
+    </w:p>
+    <w:p>
+      <w:pPr>
+        <w:pStyle w:val="ListParagraph"/>
+        <w:numPr>
+          <w:ilvl w:val="0"/>
+          <w:numId w:val="2"/>
+        </w:numPr>
+        <w:spacing w:after="80" w:line="360"/>
+        <w:jc w:val="both"/>
+      </w:pPr>
+      <w:r>
+        <w:rPr>
+          <w:rFonts w:ascii="Calibri" w:cs="Calibri" w:eastAsia="Calibri" w:hAnsi="Calibri"/>
+          <w:sz w:val="24"/>
+          <w:szCs w:val="24"/>
+        </w:rPr>
+        <w:t xml:space="preserve">Que contribuya a garantizar el acceso a medicamentos esenciales seguros, eficaces y de calidad.</w:t>
+      </w:r>
+    </w:p>
+    <w:p>
+      <w:pPr>
+        <w:pStyle w:val="ListParagraph"/>
+        <w:numPr>
+          <w:ilvl w:val="0"/>
+          <w:numId w:val="2"/>
+        </w:numPr>
+        <w:spacing w:after="80" w:line="360"/>
+        <w:jc w:val="both"/>
+      </w:pPr>
+      <w:r>
+        <w:rPr>
+          <w:rFonts w:ascii="Calibri" w:cs="Calibri" w:eastAsia="Calibri" w:hAnsi="Calibri"/>
+          <w:sz w:val="24"/>
+          <w:szCs w:val="24"/>
+        </w:rPr>
+        <w:t xml:space="preserve">Que participe en la farmacovigilancia y en la prevención de productos médicos de calidad subestándar y falsificados.</w:t>
+      </w:r>
+    </w:p>
+    <w:p>
+      <w:pPr>
+        <w:pStyle w:val="ListParagraph"/>
+        <w:numPr>
+          <w:ilvl w:val="0"/>
+          <w:numId w:val="2"/>
+        </w:numPr>
+        <w:spacing w:after="80" w:line="360"/>
+        <w:jc w:val="both"/>
+      </w:pPr>
+      <w:r>
+        <w:rPr>
+          <w:rFonts w:ascii="Calibri" w:cs="Calibri" w:eastAsia="Calibri" w:hAnsi="Calibri"/>
+          <w:sz w:val="24"/>
+          <w:szCs w:val="24"/>
+        </w:rPr>
+        <w:t xml:space="preserve">Que se integre a los equipos multidisciplinarios de salud para el control de enfermedades crónicas y transmisibles.</w:t>
+      </w:r>
+    </w:p>
+    <w:p>
+      <w:pPr>
+        <w:spacing w:after="120" w:line="360"/>
+        <w:jc w:val="both"/>
+      </w:pPr>
+      <w:r>
+        <w:rPr>
+          <w:rFonts w:ascii="Calibri" w:cs="Calibri" w:eastAsia="Calibri" w:hAnsi="Calibri"/>
+          <w:sz w:val="24"/>
+          <w:szCs w:val="24"/>
+        </w:rPr>
+        <w:t xml:space="preserve">Como se puede observar, las expectativas de los actores estratégicos se alinean con la formación profesional que ofrecerá el programa de Farmacia y Bioquímica de la USS.</w:t>
+      </w:r>
+    </w:p>
+    <w:p>
+      <w:pPr>
         <w:keepNext/>
         <w:spacing w:after="120" w:before="200"/>
         <w:ind w:left="284"/>
@@ -18525,6 +19383,44 @@
           <w:szCs w:val="24"/>
         </w:rPr>
         <w:t xml:space="preserve">MTPE/MINEDU. Portal "Ponte en Carrera".</w:t>
+      </w:r>
+    </w:p>
+    <w:p>
+      <w:pPr>
+        <w:pStyle w:val="ListParagraph"/>
+        <w:numPr>
+          <w:ilvl w:val="0"/>
+          <w:numId w:val="2"/>
+        </w:numPr>
+        <w:spacing w:after="80" w:line="360"/>
+        <w:jc w:val="both"/>
+      </w:pPr>
+      <w:r>
+        <w:rPr>
+          <w:rFonts w:ascii="Calibri" w:cs="Calibri" w:eastAsia="Calibri" w:hAnsi="Calibri"/>
+          <w:sz w:val="24"/>
+          <w:szCs w:val="24"/>
+        </w:rPr>
+        <w:t xml:space="preserve">MINSA (2004). Política Nacional de Medicamentos (R.M. N.° 1240-2004/MINSA).</w:t>
+      </w:r>
+    </w:p>
+    <w:p>
+      <w:pPr>
+        <w:pStyle w:val="ListParagraph"/>
+        <w:numPr>
+          <w:ilvl w:val="0"/>
+          <w:numId w:val="2"/>
+        </w:numPr>
+        <w:spacing w:after="80" w:line="360"/>
+        <w:jc w:val="both"/>
+      </w:pPr>
+      <w:r>
+        <w:rPr>
+          <w:rFonts w:ascii="Calibri" w:cs="Calibri" w:eastAsia="Calibri" w:hAnsi="Calibri"/>
+          <w:sz w:val="24"/>
+          <w:szCs w:val="24"/>
+        </w:rPr>
+        <w:t xml:space="preserve">OPS/OMS (2013). Servicios farmacéuticos basados en la atención primaria de salud. Documento de posición de la OPS/OMS.</w:t>
       </w:r>
     </w:p>
     <w:p>

</xml_diff>

<commit_message>
Add UAP Chiclayo historical pharmacy offer and close UTP campus item
Adds UAP (filial Chiclayo) to Table 5 and a Table 6A historical
reference (≈120 students per cycle, 8 cycles, ≈960 students in Dec
2019, per the academic program) showing prior local demand that was
left unserved after the 2019 closure. Table 6 note now states UTP only
publishes consolidated figures, so its total is the offer upper bound.
Stores the user's UTP screenshot in fuentes/capturas.

Co-Authored-By: Claude Opus 5.5 <noreply@anthropic.com>
Claude-Session: https://claude.ai/code/session_01XsGhnoXHk7nghX2nJBVJwd
</commit_message>
<xml_diff>
--- a/borradores/Informe_Pertinencia_Farmacia_Bioquimica_Lambayeque.docx
+++ b/borradores/Informe_Pertinencia_Farmacia_Bioquimica_Lambayeque.docx
@@ -7734,6 +7734,147 @@
           </w:p>
         </w:tc>
       </w:tr>
+      <w:tr>
+        <w:trPr>
+          <w:cantSplit/>
+        </w:trPr>
+        <w:tc>
+          <w:tcPr>
+            <w:tcW w:type="dxa" w:w="900"/>
+            <w:tcBorders>
+              <w:top w:val="single" w:color="000000" w:sz="4"/>
+              <w:left w:val="single" w:color="000000" w:sz="4"/>
+              <w:bottom w:val="single" w:color="000000" w:sz="4"/>
+              <w:right w:val="single" w:color="000000" w:sz="4"/>
+            </w:tcBorders>
+            <w:tcMar>
+              <w:top w:type="dxa" w:w="20"/>
+              <w:left w:type="dxa" w:w="60"/>
+              <w:bottom w:type="dxa" w:w="20"/>
+              <w:right w:type="dxa" w:w="60"/>
+            </w:tcMar>
+            <w:vAlign w:val="center"/>
+          </w:tcPr>
+          <w:p>
+            <w:pPr>
+              <w:jc w:val="center"/>
+            </w:pPr>
+            <w:r>
+              <w:rPr>
+                <w:rFonts w:ascii="Arial" w:cs="Arial" w:eastAsia="Arial" w:hAnsi="Arial"/>
+                <w:b/>
+                <w:bCs/>
+                <w:color w:val="000000"/>
+                <w:sz w:val="15"/>
+                <w:szCs w:val="15"/>
+              </w:rPr>
+              <w:t xml:space="preserve">Privada</w:t>
+            </w:r>
+          </w:p>
+        </w:tc>
+        <w:tc>
+          <w:tcPr>
+            <w:tcW w:type="dxa" w:w="3700"/>
+            <w:tcBorders>
+              <w:top w:val="single" w:color="000000" w:sz="4"/>
+              <w:left w:val="single" w:color="000000" w:sz="4"/>
+              <w:bottom w:val="single" w:color="000000" w:sz="4"/>
+              <w:right w:val="single" w:color="000000" w:sz="4"/>
+            </w:tcBorders>
+            <w:tcMar>
+              <w:top w:type="dxa" w:w="20"/>
+              <w:left w:type="dxa" w:w="60"/>
+              <w:bottom w:type="dxa" w:w="20"/>
+              <w:right w:type="dxa" w:w="60"/>
+            </w:tcMar>
+            <w:vAlign w:val="center"/>
+          </w:tcPr>
+          <w:p>
+            <w:pPr>
+              <w:jc w:val="center"/>
+            </w:pPr>
+            <w:r>
+              <w:rPr>
+                <w:rFonts w:ascii="Arial" w:cs="Arial" w:eastAsia="Arial" w:hAnsi="Arial"/>
+                <w:b/>
+                <w:bCs/>
+                <w:color w:val="000000"/>
+                <w:sz w:val="15"/>
+                <w:szCs w:val="15"/>
+              </w:rPr>
+              <w:t xml:space="preserve">Universidad Alas Peruanas (UAP) – filial Chiclayo</w:t>
+            </w:r>
+          </w:p>
+        </w:tc>
+        <w:tc>
+          <w:tcPr>
+            <w:tcW w:type="dxa" w:w="1700"/>
+            <w:tcBorders>
+              <w:top w:val="single" w:color="000000" w:sz="4"/>
+              <w:left w:val="single" w:color="000000" w:sz="4"/>
+              <w:bottom w:val="single" w:color="000000" w:sz="4"/>
+              <w:right w:val="single" w:color="000000" w:sz="4"/>
+            </w:tcBorders>
+            <w:tcMar>
+              <w:top w:type="dxa" w:w="20"/>
+              <w:left w:type="dxa" w:w="60"/>
+              <w:bottom w:type="dxa" w:w="20"/>
+              <w:right w:type="dxa" w:w="60"/>
+            </w:tcMar>
+            <w:vAlign w:val="center"/>
+          </w:tcPr>
+          <w:p>
+            <w:pPr>
+              <w:jc w:val="center"/>
+            </w:pPr>
+            <w:r>
+              <w:rPr>
+                <w:rFonts w:ascii="Arial" w:cs="Arial" w:eastAsia="Arial" w:hAnsi="Arial"/>
+                <w:b/>
+                <w:bCs/>
+                <w:color w:val="000000"/>
+                <w:sz w:val="15"/>
+                <w:szCs w:val="15"/>
+              </w:rPr>
+              <w:t xml:space="preserve">Denegada</w:t>
+            </w:r>
+          </w:p>
+        </w:tc>
+        <w:tc>
+          <w:tcPr>
+            <w:tcW w:type="dxa" w:w="2000"/>
+            <w:tcBorders>
+              <w:top w:val="single" w:color="000000" w:sz="4"/>
+              <w:left w:val="single" w:color="000000" w:sz="4"/>
+              <w:bottom w:val="single" w:color="000000" w:sz="4"/>
+              <w:right w:val="single" w:color="000000" w:sz="4"/>
+            </w:tcBorders>
+            <w:tcMar>
+              <w:top w:type="dxa" w:w="20"/>
+              <w:left w:type="dxa" w:w="60"/>
+              <w:bottom w:type="dxa" w:w="20"/>
+              <w:right w:type="dxa" w:w="60"/>
+            </w:tcMar>
+            <w:vAlign w:val="center"/>
+          </w:tcPr>
+          <w:p>
+            <w:pPr>
+              <w:jc w:val="center"/>
+            </w:pPr>
+            <w:r>
+              <w:rPr>
+                <w:rFonts w:ascii="Arial" w:cs="Arial" w:eastAsia="Arial" w:hAnsi="Arial"/>
+                <w:b/>
+                <w:bCs/>
+                <w:color w:val="000000"/>
+                <w:sz w:val="15"/>
+                <w:szCs w:val="15"/>
+              </w:rPr>
+              <w:t xml:space="preserve">Ofreció la carrera hasta 2019 – cerrada</w:t>
+            </w:r>
+          </w:p>
+        </w:tc>
+      </w:tr>
     </w:tbl>
     <w:p>
       <w:pPr>
@@ -8403,32 +8544,7 @@
           <w:sz w:val="14"/>
           <w:szCs w:val="14"/>
         </w:rPr>
-        <w:t xml:space="preserve">Fuente: UTP, Postulantes, ingresantes, matriculados y egresados pregrado 2022-2025 (datos al 31.10.2025), pp. 1 y 3. Falta el desagregado de la sede Chiclayo </w:t>
-      </w:r>
-      <w:r>
-        <w:rPr>
-          <w:rFonts w:ascii="Arial" w:cs="Arial" w:eastAsia="Arial" w:hAnsi="Arial"/>
-          <w:b/>
-          <w:bCs/>
-          <w:i/>
-          <w:iCs/>
-          <w:sz w:val="14"/>
-          <w:szCs w:val="14"/>
-          <w:shd w:fill="FFFF00" w:color="auto" w:val="clear"/>
-        </w:rPr>
-        <w:t xml:space="preserve">[DATO PENDIENTE]</w:t>
-      </w:r>
-      <w:r>
-        <w:rPr>
-          <w:rFonts w:ascii="Arial" w:cs="Arial" w:eastAsia="Arial" w:hAnsi="Arial"/>
-          <w:b/>
-          <w:bCs/>
-          <w:i/>
-          <w:iCs/>
-          <w:sz w:val="14"/>
-          <w:szCs w:val="14"/>
-        </w:rPr>
-        <w:t xml:space="preserve">.</w:t>
+        <w:t xml:space="preserve">Fuente: UTP, Postulantes, ingresantes, matriculados y egresados pregrado 2022-2025 (datos al 31.10.2025), pp. 1 y 3. La UTP publica sus cifras consolidadas para todas sus sedes, sin desagregado por sede; por ello, el total se toma como tope superior de la oferta en Chiclayo.</w:t>
       </w:r>
     </w:p>
     <w:p>
@@ -9615,6 +9731,565 @@
           <w:sz w:val="24"/>
           <w:szCs w:val="24"/>
         </w:rPr>
+        <w:t xml:space="preserve">Como referencia histórica de la demanda regional, la </w:t>
+      </w:r>
+      <w:r>
+        <w:rPr>
+          <w:rFonts w:ascii="Calibri" w:cs="Calibri" w:eastAsia="Calibri" w:hAnsi="Calibri"/>
+          <w:b/>
+          <w:bCs/>
+          <w:sz w:val="24"/>
+          <w:szCs w:val="24"/>
+        </w:rPr>
+        <w:t xml:space="preserve">Universidad Alas Peruanas (UAP) ofreció la carrera de Farmacia y Bioquímica en su filial Chiclayo hasta diciembre de 2019</w:t>
+      </w:r>
+      <w:r>
+        <w:rPr>
+          <w:rFonts w:ascii="Calibri" w:cs="Calibri" w:eastAsia="Calibri" w:hAnsi="Calibri"/>
+          <w:sz w:val="24"/>
+          <w:szCs w:val="24"/>
+        </w:rPr>
+        <w:t xml:space="preserve">, cuando cerró al no obtener el licenciamiento de la SUNEDU. En ese año, el programa funcionaba con aproximadamente </w:t>
+      </w:r>
+      <w:r>
+        <w:rPr>
+          <w:rFonts w:ascii="Calibri" w:cs="Calibri" w:eastAsia="Calibri" w:hAnsi="Calibri"/>
+          <w:b/>
+          <w:bCs/>
+          <w:sz w:val="24"/>
+          <w:szCs w:val="24"/>
+        </w:rPr>
+        <w:t xml:space="preserve">4 aulas de 30 estudiantes por ciclo (unos 120 estudiantes por ciclo)</w:t>
+      </w:r>
+      <w:r>
+        <w:rPr>
+          <w:rFonts w:ascii="Calibri" w:cs="Calibri" w:eastAsia="Calibri" w:hAnsi="Calibri"/>
+          <w:sz w:val="24"/>
+          <w:szCs w:val="24"/>
+        </w:rPr>
+        <w:t xml:space="preserve"> y había llegado hasta el octavo ciclo, con un total aproximado de </w:t>
+      </w:r>
+      <w:r>
+        <w:rPr>
+          <w:rFonts w:ascii="Calibri" w:cs="Calibri" w:eastAsia="Calibri" w:hAnsi="Calibri"/>
+          <w:b/>
+          <w:bCs/>
+          <w:sz w:val="24"/>
+          <w:szCs w:val="24"/>
+        </w:rPr>
+        <w:t xml:space="preserve">960 estudiantes</w:t>
+      </w:r>
+      <w:r>
+        <w:rPr>
+          <w:rFonts w:ascii="Calibri" w:cs="Calibri" w:eastAsia="Calibri" w:hAnsi="Calibri"/>
+          <w:sz w:val="24"/>
+          <w:szCs w:val="24"/>
+        </w:rPr>
+        <w:t xml:space="preserve"> de Farmacia en Chiclayo (Tabla 6A). Es decir, una sola universidad no licenciada captaba alrededor de 120 estudiantes por ciclo en Chiclayo, cifra comparable a la de la UTP en todo el país en su primer año (240 ingresantes en 2025). Con su cierre, esa demanda quedó sin oferta local durante cinco años, hasta la apertura de la carrera en la UTP.</w:t>
+      </w:r>
+    </w:p>
+    <w:p>
+      <w:pPr>
+        <w:keepNext/>
+        <w:spacing w:after="60" w:before="160"/>
+        <w:jc w:val="center"/>
+      </w:pPr>
+      <w:r>
+        <w:rPr>
+          <w:rFonts w:ascii="Calibri" w:cs="Calibri" w:eastAsia="Calibri" w:hAnsi="Calibri"/>
+          <w:sz w:val="22"/>
+          <w:szCs w:val="22"/>
+        </w:rPr>
+        <w:t xml:space="preserve">Tabla 6A. Referencia histórica: Farmacia y Bioquímica en la UAP – filial Chiclayo, 2019</w:t>
+      </w:r>
+    </w:p>
+    <w:tbl>
+      <w:tblPr>
+        <w:tblW w:type="dxa" w:w="8200"/>
+        <w:jc w:val="center"/>
+        <w:tblBorders>
+          <w:top w:val="single" w:color="auto" w:sz="4"/>
+          <w:left w:val="single" w:color="auto" w:sz="4"/>
+          <w:bottom w:val="single" w:color="auto" w:sz="4"/>
+          <w:right w:val="single" w:color="auto" w:sz="4"/>
+          <w:insideH w:val="single" w:color="auto" w:sz="4"/>
+          <w:insideV w:val="single" w:color="auto" w:sz="4"/>
+        </w:tblBorders>
+      </w:tblPr>
+      <w:tblGrid>
+        <w:gridCol w:w="5200"/>
+        <w:gridCol w:w="3000"/>
+      </w:tblGrid>
+      <w:tr>
+        <w:trPr>
+          <w:tblHeader/>
+        </w:trPr>
+        <w:tc>
+          <w:tcPr>
+            <w:tcW w:type="dxa" w:w="5200"/>
+            <w:tcBorders>
+              <w:top w:val="single" w:color="000000" w:sz="4"/>
+              <w:left w:val="single" w:color="000000" w:sz="4"/>
+              <w:bottom w:val="single" w:color="000000" w:sz="4"/>
+              <w:right w:val="single" w:color="000000" w:sz="4"/>
+            </w:tcBorders>
+            <w:shd w:fill="1F4E2C" w:color="auto" w:val="clear"/>
+            <w:tcMar>
+              <w:top w:type="dxa" w:w="20"/>
+              <w:left w:type="dxa" w:w="60"/>
+              <w:bottom w:type="dxa" w:w="20"/>
+              <w:right w:type="dxa" w:w="60"/>
+            </w:tcMar>
+            <w:vAlign w:val="center"/>
+          </w:tcPr>
+          <w:p>
+            <w:pPr>
+              <w:jc w:val="center"/>
+            </w:pPr>
+            <w:r>
+              <w:rPr>
+                <w:rFonts w:ascii="Arial" w:cs="Arial" w:eastAsia="Arial" w:hAnsi="Arial"/>
+                <w:b/>
+                <w:bCs/>
+                <w:color w:val="FFFFFF"/>
+                <w:sz w:val="15"/>
+                <w:szCs w:val="15"/>
+              </w:rPr>
+              <w:t xml:space="preserve">Concepto</w:t>
+            </w:r>
+          </w:p>
+        </w:tc>
+        <w:tc>
+          <w:tcPr>
+            <w:tcW w:type="dxa" w:w="3000"/>
+            <w:tcBorders>
+              <w:top w:val="single" w:color="000000" w:sz="4"/>
+              <w:left w:val="single" w:color="000000" w:sz="4"/>
+              <w:bottom w:val="single" w:color="000000" w:sz="4"/>
+              <w:right w:val="single" w:color="000000" w:sz="4"/>
+            </w:tcBorders>
+            <w:shd w:fill="1F4E2C" w:color="auto" w:val="clear"/>
+            <w:tcMar>
+              <w:top w:type="dxa" w:w="20"/>
+              <w:left w:type="dxa" w:w="60"/>
+              <w:bottom w:type="dxa" w:w="20"/>
+              <w:right w:type="dxa" w:w="60"/>
+            </w:tcMar>
+            <w:vAlign w:val="center"/>
+          </w:tcPr>
+          <w:p>
+            <w:pPr>
+              <w:jc w:val="center"/>
+            </w:pPr>
+            <w:r>
+              <w:rPr>
+                <w:rFonts w:ascii="Arial" w:cs="Arial" w:eastAsia="Arial" w:hAnsi="Arial"/>
+                <w:b/>
+                <w:bCs/>
+                <w:color w:val="FFFFFF"/>
+                <w:sz w:val="15"/>
+                <w:szCs w:val="15"/>
+              </w:rPr>
+              <w:t xml:space="preserve">Valor aproximado</w:t>
+            </w:r>
+          </w:p>
+        </w:tc>
+      </w:tr>
+      <w:tr>
+        <w:trPr>
+          <w:cantSplit/>
+        </w:trPr>
+        <w:tc>
+          <w:tcPr>
+            <w:tcW w:type="dxa" w:w="5200"/>
+            <w:tcBorders>
+              <w:top w:val="single" w:color="000000" w:sz="4"/>
+              <w:left w:val="single" w:color="000000" w:sz="4"/>
+              <w:bottom w:val="single" w:color="000000" w:sz="4"/>
+              <w:right w:val="single" w:color="000000" w:sz="4"/>
+            </w:tcBorders>
+            <w:tcMar>
+              <w:top w:type="dxa" w:w="20"/>
+              <w:left w:type="dxa" w:w="60"/>
+              <w:bottom w:type="dxa" w:w="20"/>
+              <w:right w:type="dxa" w:w="60"/>
+            </w:tcMar>
+            <w:vAlign w:val="center"/>
+          </w:tcPr>
+          <w:p>
+            <w:pPr>
+              <w:jc w:val="left"/>
+            </w:pPr>
+            <w:r>
+              <w:rPr>
+                <w:rFonts w:ascii="Arial" w:cs="Arial" w:eastAsia="Arial" w:hAnsi="Arial"/>
+                <w:b/>
+                <w:bCs/>
+                <w:color w:val="000000"/>
+                <w:sz w:val="15"/>
+                <w:szCs w:val="15"/>
+              </w:rPr>
+              <w:t xml:space="preserve">Aulas por ciclo</w:t>
+            </w:r>
+          </w:p>
+        </w:tc>
+        <w:tc>
+          <w:tcPr>
+            <w:tcW w:type="dxa" w:w="3000"/>
+            <w:tcBorders>
+              <w:top w:val="single" w:color="000000" w:sz="4"/>
+              <w:left w:val="single" w:color="000000" w:sz="4"/>
+              <w:bottom w:val="single" w:color="000000" w:sz="4"/>
+              <w:right w:val="single" w:color="000000" w:sz="4"/>
+            </w:tcBorders>
+            <w:tcMar>
+              <w:top w:type="dxa" w:w="20"/>
+              <w:left w:type="dxa" w:w="60"/>
+              <w:bottom w:type="dxa" w:w="20"/>
+              <w:right w:type="dxa" w:w="60"/>
+            </w:tcMar>
+            <w:vAlign w:val="center"/>
+          </w:tcPr>
+          <w:p>
+            <w:pPr>
+              <w:jc w:val="center"/>
+            </w:pPr>
+            <w:r>
+              <w:rPr>
+                <w:rFonts w:ascii="Arial" w:cs="Arial" w:eastAsia="Arial" w:hAnsi="Arial"/>
+                <w:b/>
+                <w:bCs/>
+                <w:color w:val="000000"/>
+                <w:sz w:val="15"/>
+                <w:szCs w:val="15"/>
+              </w:rPr>
+              <w:t xml:space="preserve">4</w:t>
+            </w:r>
+          </w:p>
+        </w:tc>
+      </w:tr>
+      <w:tr>
+        <w:trPr>
+          <w:cantSplit/>
+        </w:trPr>
+        <w:tc>
+          <w:tcPr>
+            <w:tcW w:type="dxa" w:w="5200"/>
+            <w:tcBorders>
+              <w:top w:val="single" w:color="000000" w:sz="4"/>
+              <w:left w:val="single" w:color="000000" w:sz="4"/>
+              <w:bottom w:val="single" w:color="000000" w:sz="4"/>
+              <w:right w:val="single" w:color="000000" w:sz="4"/>
+            </w:tcBorders>
+            <w:tcMar>
+              <w:top w:type="dxa" w:w="20"/>
+              <w:left w:type="dxa" w:w="60"/>
+              <w:bottom w:type="dxa" w:w="20"/>
+              <w:right w:type="dxa" w:w="60"/>
+            </w:tcMar>
+            <w:vAlign w:val="center"/>
+          </w:tcPr>
+          <w:p>
+            <w:pPr>
+              <w:jc w:val="left"/>
+            </w:pPr>
+            <w:r>
+              <w:rPr>
+                <w:rFonts w:ascii="Arial" w:cs="Arial" w:eastAsia="Arial" w:hAnsi="Arial"/>
+                <w:b/>
+                <w:bCs/>
+                <w:color w:val="000000"/>
+                <w:sz w:val="15"/>
+                <w:szCs w:val="15"/>
+              </w:rPr>
+              <w:t xml:space="preserve">Estudiantes por aula</w:t>
+            </w:r>
+          </w:p>
+        </w:tc>
+        <w:tc>
+          <w:tcPr>
+            <w:tcW w:type="dxa" w:w="3000"/>
+            <w:tcBorders>
+              <w:top w:val="single" w:color="000000" w:sz="4"/>
+              <w:left w:val="single" w:color="000000" w:sz="4"/>
+              <w:bottom w:val="single" w:color="000000" w:sz="4"/>
+              <w:right w:val="single" w:color="000000" w:sz="4"/>
+            </w:tcBorders>
+            <w:tcMar>
+              <w:top w:type="dxa" w:w="20"/>
+              <w:left w:type="dxa" w:w="60"/>
+              <w:bottom w:type="dxa" w:w="20"/>
+              <w:right w:type="dxa" w:w="60"/>
+            </w:tcMar>
+            <w:vAlign w:val="center"/>
+          </w:tcPr>
+          <w:p>
+            <w:pPr>
+              <w:jc w:val="center"/>
+            </w:pPr>
+            <w:r>
+              <w:rPr>
+                <w:rFonts w:ascii="Arial" w:cs="Arial" w:eastAsia="Arial" w:hAnsi="Arial"/>
+                <w:b/>
+                <w:bCs/>
+                <w:color w:val="000000"/>
+                <w:sz w:val="15"/>
+                <w:szCs w:val="15"/>
+              </w:rPr>
+              <w:t xml:space="preserve">30</w:t>
+            </w:r>
+          </w:p>
+        </w:tc>
+      </w:tr>
+      <w:tr>
+        <w:trPr>
+          <w:cantSplit/>
+        </w:trPr>
+        <w:tc>
+          <w:tcPr>
+            <w:tcW w:type="dxa" w:w="5200"/>
+            <w:tcBorders>
+              <w:top w:val="single" w:color="000000" w:sz="4"/>
+              <w:left w:val="single" w:color="000000" w:sz="4"/>
+              <w:bottom w:val="single" w:color="000000" w:sz="4"/>
+              <w:right w:val="single" w:color="000000" w:sz="4"/>
+            </w:tcBorders>
+            <w:tcMar>
+              <w:top w:type="dxa" w:w="20"/>
+              <w:left w:type="dxa" w:w="60"/>
+              <w:bottom w:type="dxa" w:w="20"/>
+              <w:right w:type="dxa" w:w="60"/>
+            </w:tcMar>
+            <w:vAlign w:val="center"/>
+          </w:tcPr>
+          <w:p>
+            <w:pPr>
+              <w:jc w:val="left"/>
+            </w:pPr>
+            <w:r>
+              <w:rPr>
+                <w:rFonts w:ascii="Arial" w:cs="Arial" w:eastAsia="Arial" w:hAnsi="Arial"/>
+                <w:b/>
+                <w:bCs/>
+                <w:color w:val="000000"/>
+                <w:sz w:val="15"/>
+                <w:szCs w:val="15"/>
+              </w:rPr>
+              <w:t xml:space="preserve">Estudiantes por ciclo</w:t>
+            </w:r>
+          </w:p>
+        </w:tc>
+        <w:tc>
+          <w:tcPr>
+            <w:tcW w:type="dxa" w:w="3000"/>
+            <w:tcBorders>
+              <w:top w:val="single" w:color="000000" w:sz="4"/>
+              <w:left w:val="single" w:color="000000" w:sz="4"/>
+              <w:bottom w:val="single" w:color="000000" w:sz="4"/>
+              <w:right w:val="single" w:color="000000" w:sz="4"/>
+            </w:tcBorders>
+            <w:tcMar>
+              <w:top w:type="dxa" w:w="20"/>
+              <w:left w:type="dxa" w:w="60"/>
+              <w:bottom w:type="dxa" w:w="20"/>
+              <w:right w:type="dxa" w:w="60"/>
+            </w:tcMar>
+            <w:vAlign w:val="center"/>
+          </w:tcPr>
+          <w:p>
+            <w:pPr>
+              <w:jc w:val="center"/>
+            </w:pPr>
+            <w:r>
+              <w:rPr>
+                <w:rFonts w:ascii="Arial" w:cs="Arial" w:eastAsia="Arial" w:hAnsi="Arial"/>
+                <w:b/>
+                <w:bCs/>
+                <w:color w:val="000000"/>
+                <w:sz w:val="15"/>
+                <w:szCs w:val="15"/>
+              </w:rPr>
+              <w:t xml:space="preserve">120</w:t>
+            </w:r>
+          </w:p>
+        </w:tc>
+      </w:tr>
+      <w:tr>
+        <w:trPr>
+          <w:cantSplit/>
+        </w:trPr>
+        <w:tc>
+          <w:tcPr>
+            <w:tcW w:type="dxa" w:w="5200"/>
+            <w:tcBorders>
+              <w:top w:val="single" w:color="000000" w:sz="4"/>
+              <w:left w:val="single" w:color="000000" w:sz="4"/>
+              <w:bottom w:val="single" w:color="000000" w:sz="4"/>
+              <w:right w:val="single" w:color="000000" w:sz="4"/>
+            </w:tcBorders>
+            <w:tcMar>
+              <w:top w:type="dxa" w:w="20"/>
+              <w:left w:type="dxa" w:w="60"/>
+              <w:bottom w:type="dxa" w:w="20"/>
+              <w:right w:type="dxa" w:w="60"/>
+            </w:tcMar>
+            <w:vAlign w:val="center"/>
+          </w:tcPr>
+          <w:p>
+            <w:pPr>
+              <w:jc w:val="left"/>
+            </w:pPr>
+            <w:r>
+              <w:rPr>
+                <w:rFonts w:ascii="Arial" w:cs="Arial" w:eastAsia="Arial" w:hAnsi="Arial"/>
+                <w:b/>
+                <w:bCs/>
+                <w:color w:val="000000"/>
+                <w:sz w:val="15"/>
+                <w:szCs w:val="15"/>
+              </w:rPr>
+              <w:t xml:space="preserve">Ciclos en funcionamiento (del 1.° al 8.°)</w:t>
+            </w:r>
+          </w:p>
+        </w:tc>
+        <w:tc>
+          <w:tcPr>
+            <w:tcW w:type="dxa" w:w="3000"/>
+            <w:tcBorders>
+              <w:top w:val="single" w:color="000000" w:sz="4"/>
+              <w:left w:val="single" w:color="000000" w:sz="4"/>
+              <w:bottom w:val="single" w:color="000000" w:sz="4"/>
+              <w:right w:val="single" w:color="000000" w:sz="4"/>
+            </w:tcBorders>
+            <w:tcMar>
+              <w:top w:type="dxa" w:w="20"/>
+              <w:left w:type="dxa" w:w="60"/>
+              <w:bottom w:type="dxa" w:w="20"/>
+              <w:right w:type="dxa" w:w="60"/>
+            </w:tcMar>
+            <w:vAlign w:val="center"/>
+          </w:tcPr>
+          <w:p>
+            <w:pPr>
+              <w:jc w:val="center"/>
+            </w:pPr>
+            <w:r>
+              <w:rPr>
+                <w:rFonts w:ascii="Arial" w:cs="Arial" w:eastAsia="Arial" w:hAnsi="Arial"/>
+                <w:b/>
+                <w:bCs/>
+                <w:color w:val="000000"/>
+                <w:sz w:val="15"/>
+                <w:szCs w:val="15"/>
+              </w:rPr>
+              <w:t xml:space="preserve">8</w:t>
+            </w:r>
+          </w:p>
+        </w:tc>
+      </w:tr>
+      <w:tr>
+        <w:trPr>
+          <w:cantSplit/>
+        </w:trPr>
+        <w:tc>
+          <w:tcPr>
+            <w:tcW w:type="dxa" w:w="5200"/>
+            <w:tcBorders>
+              <w:top w:val="single" w:color="000000" w:sz="4"/>
+              <w:left w:val="single" w:color="000000" w:sz="4"/>
+              <w:bottom w:val="single" w:color="000000" w:sz="4"/>
+              <w:right w:val="single" w:color="000000" w:sz="4"/>
+            </w:tcBorders>
+            <w:tcMar>
+              <w:top w:type="dxa" w:w="20"/>
+              <w:left w:type="dxa" w:w="60"/>
+              <w:bottom w:type="dxa" w:w="20"/>
+              <w:right w:type="dxa" w:w="60"/>
+            </w:tcMar>
+            <w:vAlign w:val="center"/>
+          </w:tcPr>
+          <w:p>
+            <w:pPr>
+              <w:jc w:val="left"/>
+            </w:pPr>
+            <w:r>
+              <w:rPr>
+                <w:rFonts w:ascii="Arial" w:cs="Arial" w:eastAsia="Arial" w:hAnsi="Arial"/>
+                <w:b/>
+                <w:bCs/>
+                <w:color w:val="000000"/>
+                <w:sz w:val="15"/>
+                <w:szCs w:val="15"/>
+              </w:rPr>
+              <w:t xml:space="preserve">Total de estudiantes de Farmacia (diciembre 2019)</w:t>
+            </w:r>
+          </w:p>
+        </w:tc>
+        <w:tc>
+          <w:tcPr>
+            <w:tcW w:type="dxa" w:w="3000"/>
+            <w:tcBorders>
+              <w:top w:val="single" w:color="000000" w:sz="4"/>
+              <w:left w:val="single" w:color="000000" w:sz="4"/>
+              <w:bottom w:val="single" w:color="000000" w:sz="4"/>
+              <w:right w:val="single" w:color="000000" w:sz="4"/>
+            </w:tcBorders>
+            <w:tcMar>
+              <w:top w:type="dxa" w:w="20"/>
+              <w:left w:type="dxa" w:w="60"/>
+              <w:bottom w:type="dxa" w:w="20"/>
+              <w:right w:type="dxa" w:w="60"/>
+            </w:tcMar>
+            <w:vAlign w:val="center"/>
+          </w:tcPr>
+          <w:p>
+            <w:pPr>
+              <w:jc w:val="center"/>
+            </w:pPr>
+            <w:r>
+              <w:rPr>
+                <w:rFonts w:ascii="Arial" w:cs="Arial" w:eastAsia="Arial" w:hAnsi="Arial"/>
+                <w:b/>
+                <w:bCs/>
+                <w:color w:val="000000"/>
+                <w:sz w:val="15"/>
+                <w:szCs w:val="15"/>
+              </w:rPr>
+              <w:t xml:space="preserve">960</w:t>
+            </w:r>
+          </w:p>
+        </w:tc>
+      </w:tr>
+    </w:tbl>
+    <w:p>
+      <w:pPr>
+        <w:spacing w:after="160"/>
+        <w:ind w:left="300"/>
+      </w:pPr>
+      <w:r>
+        <w:rPr>
+          <w:rFonts w:ascii="Arial" w:cs="Arial" w:eastAsia="Arial" w:hAnsi="Arial"/>
+          <w:b/>
+          <w:bCs/>
+          <w:i/>
+          <w:iCs/>
+          <w:sz w:val="14"/>
+          <w:szCs w:val="14"/>
+        </w:rPr>
+        <w:t xml:space="preserve">Fuente: información proporcionada por el Programa Académico sobre la filial Chiclayo de la UAP (estimación aproximada, sin registro oficial publicado). La UAP cesó sus actividades en diciembre de 2019 por denegatoria de la licencia institucional de la SUNEDU.</w:t>
+      </w:r>
+    </w:p>
+    <w:p>
+      <w:pPr>
+        <w:spacing w:after="120" w:line="360"/>
+        <w:jc w:val="both"/>
+      </w:pPr>
+      <w:r>
+        <w:rPr>
+          <w:rFonts w:ascii="Calibri" w:cs="Calibri" w:eastAsia="Calibri" w:hAnsi="Calibri"/>
+          <w:sz w:val="24"/>
+          <w:szCs w:val="24"/>
+        </w:rPr>
         <w:t xml:space="preserve">Aun con el escenario conservador (1 % de interés) y tomando como oferta regional el total nacional de ingresantes de la UTP, para 2027 habría una brecha de alrededor de 1 360 jóvenes interesados en estudiar Farmacia y Bioquímica que no encontrarían una vacante en una universidad licenciada de la región. En el escenario medio, la brecha se acerca a los 3 000 jóvenes por año.</w:t>
       </w:r>
     </w:p>
@@ -12891,7 +13566,7 @@
           <w:sz w:val="24"/>
           <w:szCs w:val="24"/>
         </w:rPr>
-        <w:t xml:space="preserve"> (INEI, Compendio Estadístico Lambayeque 2024, en OSEL 2025, pp. 47-49). La única universidad licenciada identificada con Farmacia y Bioquímica es la UTP en Chiclayo, que abrió la carrera recién en 2025 (240 ingresantes en todas sus sedes); la UNPRG no la ofrece. Las universidades que ofrecían la carrera sin licencia (Universidad de Chiclayo) o que operaban en la región sin licencia (Universidad de Lambayeque y Universidad Juan Mejía Baca) se encuentran en cese, lo que deja una demanda regional desatendida y estudiantes que se trasladan a otras ciudades.</w:t>
+        <w:t xml:space="preserve"> (INEI, Compendio Estadístico Lambayeque 2024, en OSEL 2025, pp. 47-49). La única universidad licenciada identificada con Farmacia y Bioquímica es la UTP en Chiclayo, que abrió la carrera recién en 2025 (240 ingresantes en todas sus sedes); la UNPRG no la ofrece. Las universidades que ofrecían la carrera sin licencia (Universidad Alas Peruanas – filial Chiclayo, cerrada en 2019, y Universidad de Chiclayo) o que operaban en la región sin licencia (Universidad de Lambayeque y Universidad Juan Mejía Baca) se encuentran en cese, lo que deja una demanda regional desatendida y estudiantes que se trasladan a otras ciudades.</w:t>
       </w:r>
     </w:p>
     <w:p>
@@ -18369,7 +19044,7 @@
           <w:sz w:val="24"/>
           <w:szCs w:val="24"/>
         </w:rPr>
-        <w:t xml:space="preserve">El presente informe técnico sustenta la pertinencia de crear el programa de estudios de Farmacia y Bioquímica en la región Lambayeque (Chiclayo). La exigencia legal de un Químico Farmacéutico en cada uno de los 1 580 establecimientos farmacéuticos privados de la región, frente a solo 812 profesionales colegiados (y cerca de 225 establecimientos nuevos por año), la expansión hospitalaria de EsSalud, la demanda de diagnóstico analítico y control agroindustrial, la carga de enfermedad regional y el comercio ilegal de medicamentos generan una demanda estructural de estos profesionales, mientras que la oferta licenciada en la región es muy reducida tras el cese de universidades no licenciadas de Chiclayo.</w:t>
+        <w:t xml:space="preserve">El presente informe técnico sustenta la pertinencia de crear el programa de estudios de Farmacia y Bioquímica en la región Lambayeque (Chiclayo). La exigencia legal de un Químico Farmacéutico en cada uno de los 1 580 establecimientos farmacéuticos privados de la región, frente a solo 812 profesionales colegiados (y cerca de 225 establecimientos nuevos por año), la expansión hospitalaria de EsSalud, la demanda de diagnóstico analítico y control agroindustrial, la carga de enfermedad regional y el comercio ilegal de medicamentos generan una demanda estructural de estos profesionales, mientras que la oferta licenciada en la región es muy reducida tras el cese de universidades no licenciadas de Chiclayo; solo la UAP llegó a tener unos 960 estudiantes de Farmacia en Chiclayo antes de cerrar en 2019.</w:t>
       </w:r>
     </w:p>
     <w:p>
@@ -19249,7 +19924,7 @@
           <w:sz w:val="24"/>
           <w:szCs w:val="24"/>
         </w:rPr>
-        <w:t xml:space="preserve">SUNEDU. Resoluciones de licenciamiento institucional (Universidad de Chiclayo, Universidad de Lambayeque, Universidad Juan Mejía Baca, UNPRG).</w:t>
+        <w:t xml:space="preserve">SUNEDU. Resoluciones de licenciamiento institucional (Universidad Alas Peruanas, Universidad de Chiclayo, Universidad de Lambayeque, Universidad Juan Mejía Baca, UNPRG).</w:t>
       </w:r>
     </w:p>
     <w:p>

</xml_diff>